<commit_message>
Proofread Italian edition: 245 fixes applied, 13 decisions logged; run complete
Co-Authored-By: Claude Opus 5.5 <noreply@anthropic.com>
Claude-Session: https://claude.ai/code/session_015bGU9R5VguxHZDVriTWnnq
</commit_message>
<xml_diff>
--- a/corrected/Inn Trouble - ASSEMBLED - FORMATTED_Italian.docx
+++ b/corrected/Inn Trouble - ASSEMBLED - FORMATTED_Italian.docx
@@ -34,7 +34,7 @@
     <w:p/>
     <w:p>
       <w:r>
-        <w:t>Seconda Edizione</w:t>
+        <w:t xml:space="preserve">Seconda edizione</w:t>
       </w:r>
     </w:p>
     <w:p/>
@@ -57,7 +57,7 @@
     </w:p>
     <w:p>
       <w:r>
-        <w:t>Libri di Questa Serie</w:t>
+        <w:t xml:space="preserve">Libri di questa serie</w:t>
       </w:r>
     </w:p>
     <w:p>
@@ -127,25 +127,25 @@
     <w:p/>
     <w:p>
       <w:r>
-        <w:t>Il Winter Wonderland Inn aveva riscaldato metà di Frost Falls chi prima chi dopo. Fiona Okafor lo gestiva nel modo in cui la sua famiglia lo gestiva da cento anni, e quella mattina si bottonò male il cardigan e non riusciva a smettere di guardare la porta.</w:t>
-      </w:r>
-    </w:p>
-    <w:p/>
-    <w:p>
-      <w:r>
-        <w:t>Il biglietto chiedeva mezzo milione di dollari. Sapeva ciò che la sua bisnonna aveva preso dai Blackburn nel 1924, e il negozio a due paesi di distanza in cui lo aveva venduto, e nominava la pietra al cuore della spilla — dettagli che esistevano esattamente in un baule chiuso a chiave nella soffitta di Fiona, e in un altro posto in città.</w:t>
-      </w:r>
-    </w:p>
-    <w:p/>
-    <w:p>
-      <w:r>
-        <w:t>Jessica Claus partì da dove la soffiata poteva essere arrivata anziché da dove il paese avrebbe voluto che portasse. Un maniscalco doveva venti dollari e si rifiutava di dare una risposta chiara. Uno sconosciuto che distribuiva bigliettini da visita su una spilla scomparsa a chiunque volesse prenderne uno. Uno storico che dormiva su una brandina accanto a una caldaia che non poteva permettersi di riparare.</w:t>
-      </w:r>
-    </w:p>
-    <w:p/>
-    <w:p>
-      <w:r>
-        <w:t>Qualcuno aveva letto un segreto vecchio di un secolo alla luce di una lampada e aveva deciso di venderlo. Dimostrarlo sarebbe costato a Jessica la settimana più calda che il paese avesse avuto in anni — e il perdono, stava imparando lì, non era la stessa cosa che dimenticare.</w:t>
+        <w:t xml:space="preserve">Il Winter Wonderland Inn aveva riscaldato metà di Frost Falls chi prima chi dopo. Fiona Okafor lo gestiva nel modo in cui la sua famiglia lo gestiva da cento anni, e quella mattina si era abbottonata male il cardigan e non riusciva a smettere di guardare la porta.</w:t>
+      </w:r>
+    </w:p>
+    <w:p/>
+    <w:p>
+      <w:r>
+        <w:t xml:space="preserve">Il biglietto chiedeva mezzo milione di dollari. Sapeva ciò che la sua bisnonna aveva preso dai Blackburn nel 1924, e il negozio a due paesi di distanza in cui lo aveva venduto, e nominava la pietra al cuore della spilla — dettagli che esistevano soltanto in un baule chiuso a chiave nella soffitta di Fiona, e in un altro posto in città.</w:t>
+      </w:r>
+    </w:p>
+    <w:p/>
+    <w:p>
+      <w:r>
+        <w:t xml:space="preserve">Jessica Claus partì da dove la soffiata poteva essere arrivata anziché da dove il paese avrebbe voluto che portasse. Un fabbro in credito di venti dollari che non riusciva a ottenere una risposta chiara. Uno sconosciuto che distribuiva bigliettini da visita su una spilla scomparsa a chiunque volesse prenderne uno. Uno storico che dormiva su una brandina accanto a una caldaia che non poteva permettersi di riparare.</w:t>
+      </w:r>
+    </w:p>
+    <w:p/>
+    <w:p>
+      <w:r>
+        <w:t xml:space="preserve">Qualcuno aveva letto un segreto vecchio di un secolo alla luce di una lampada e aveva deciso di venderlo. Dimostrarlo sarebbe costato a Jessica la settimana più calda che il paese avesse avuto da anni — e il perdono, stava imparando lì, non era la stessa cosa che dimenticare.</w:t>
       </w:r>
     </w:p>
     <w:p>
@@ -198,7 +198,7 @@
     <w:p/>
     <w:p>
       <w:r>
-        <w:t>Il Winter Wonderland Inn sorgeva dove Evergreen Avenue si allargava verso il parco, un'alta casa con i timpani dipinta del morbido grigio-verde di un cielo invernale, con un portico che abbracciava due lati come un braccio posato sulle spalle di un'amica. Sembrava cresciuta lì piuttosto che costruita. Fiona aveva appeso una ghirlanda alla porta d'ingresso e mi fermai in fondo ai gradini ad ammirarla, come facevo ogni volta che passavo. Era un cerchio grasso di sempreverde, denso e scuro, intrecciato con un largo nastro d'oro e borchiato di pigne che aveva dorato lei stessa, con un singolo rametto di celastro per il tono arancione della stagione.</w:t>
+        <w:t xml:space="preserve">Il Winter Wonderland Inn sorgeva dove Evergreen Avenue si allargava verso il prato, un'alta casa con i timpani dipinta del morbido grigio-verde di un cielo invernale, con un portico che abbracciava due lati come un braccio posato sulle spalle di un'amica. Sembrava cresciuta lì piuttosto che costruita. Fiona aveva appeso una ghirlanda alla porta d'ingresso e mi fermai in fondo ai gradini ad ammirarla, come facevo ogni volta che passavo. Era un cerchio grasso di sempreverde, denso e scuro, intrecciato con un largo nastro d'oro e borchiato di pigne che aveva dorato lei stessa, con un singolo rametto di celastro per il tono arancione della stagione.</w:t>
       </w:r>
     </w:p>
     <w:p/>
@@ -228,7 +228,7 @@
     <w:p/>
     <w:p>
       <w:r>
-        <w:t>Mi ci volle un momento per trovare Fiona, e quando ci riuscì, il mio sorriso svanì prima che potessi trattenerlo.</w:t>
+        <w:t xml:space="preserve">Mi ci volle un momento per trovare Fiona, e quando ci riuscii, il mio sorriso svanì prima che potessi trattenerlo.</w:t>
       </w:r>
     </w:p>
     <w:p/>
@@ -258,7 +258,7 @@
     <w:p/>
     <w:p>
       <w:r>
-        <w:t>«Fiona» attaccoi, a bassa voce, «che cosa...»</w:t>
+        <w:t xml:space="preserve">«Fiona» attaccai, a bassa voce, «che cosa...»</w:t>
       </w:r>
     </w:p>
     <w:p/>
@@ -288,7 +288,7 @@
     <w:p/>
     <w:p>
       <w:r>
-        <w:t>«Sarò felicissima di avervi qui ancora» replicai. Fiona lo disse con calore, e vidi il sollievo muoversi sotto quel calore come una corrente sotto il ghiaccio. «La suite è vostra per tutto il tempo che desiderate. E le coperte sono locali, vi scriverò il nome, ha una bancarella alla festa.»</w:t>
+        <w:t xml:space="preserve">«Sarò felicissima di avervi qui ancora.» Fiona lo disse con calore, e vidi il sollievo muoversi sotto quel calore come una corrente sotto il ghiaccio. «La suite è vostra per tutto il tempo che desiderate. E le coperte sono locali, vi scriverò il nome, ha una bancarella alla festa.»</w:t>
       </w:r>
     </w:p>
     <w:p/>
@@ -360,7 +360,7 @@
     <w:p/>
     <w:p>
       <w:r>
-        <w:t>«Un gran bel lavoro, questo ferro battuto.» Lo straniero era snello, dagli occhi vispi, sulla cinquantina, ben vestito alla maniera un po' sgualcita di chi viaggia. Teneva in mano un taccuino che non faceva alcuno sforzo per nascondere. Annuì guardando nella direzione di Sam. «Fabbro locale? Si riconosce sempre il lavoro locale. Ha una certa sicurezza. E questa casa.» Si girò, senza fretta, per abbracciare con lo sguardo la hall, la scala curva, il vecchio medaglione di gesso al centro del soffitto. «Ecco, questa sì che è una casa con una storia. Affare di famiglia, suppongo. Da generazioni.»</w:t>
+        <w:t xml:space="preserve">«Un gran bel lavoro, questo ferro battuto.» Lo sconosciuto era snello, dagli occhi vispi, sui cinquantacinque anni, ben vestito alla maniera un po' sgualcita di chi viaggia. Teneva in mano un taccuino che non faceva alcuno sforzo per nascondere. Annuì guardando nella direzione di Sam. «Fabbro locale? Si riconosce sempre il lavoro locale. Ha una certa sicurezza. E questa casa.» Si girò, senza fretta, per abbracciare con lo sguardo la hall, la scala curva, il vecchio medaglione di gesso al centro del soffitto. «Ecco, questa sì che è una casa con una storia. Affare di famiglia, suppongo. Da generazioni.»</w:t>
       </w:r>
     </w:p>
     <w:p/>
@@ -384,7 +384,7 @@
     <w:p/>
     <w:p>
       <w:r>
-        <w:t>«Claus.» Sorrise, e fu un buon sorriso, spontaneo e rodato, ma mi fidai di esso circa quanto avrei potuto scagliare lontano il parafuoco. «Allora lei è la famosa signorina Claus. Che cosa assolutamente meravigliosa. Ne avevo sentito parlare, naturalmente, si sente sempre dire, ma non ci avevo quasi creduto fino a ora.» Si sporse leggermente in avanti, in un tono confidenziale. «Mi dica. Le vecchie famiglie qui, i Blackburn e gli altri, hanno ancora le loro cose in giro per il paese? Cimeli, mobili, gioielli, roba del genere? A dire il vero, sto rintracciando un pezzo. Una spilla.»</w:t>
+        <w:t xml:space="preserve">«Claus.» Sorrise, e fu un buon sorriso, spontaneo e rodato, ma non mi fidavo di lui più di quanto avrei potuto scagliare lontano il parafuoco. «Allora lei è la famosa signora Claus. Che cosa assolutamente meravigliosa. Ne avevo sentito parlare, naturalmente, si sente sempre dire, ma non ci avevo quasi creduto fino a ora.» Si sporse leggermente in avanti, in un tono confidenziale. «Mi dica. Le vecchie famiglie qui, i Blackburn e gli altri, hanno ancora le loro cose in giro per il paese? Cimeli, mobili, gioielli, roba del genere? A dire il vero, sto rintracciando un pezzo. Una spilla.»</w:t>
       </w:r>
     </w:p>
     <w:p/>
@@ -402,7 +402,7 @@
     <w:p/>
     <w:p>
       <w:r>
-        <w:t>«Devo assolutamente occuparmi della sala da pranzo» disse, di fretta, e sparì attraverso la porta a vetri prima che uno di noi potesse proferire parola, lasciando il paniere della torta sulla scrivania e la domanda sospesa nell'aria dietro di sé.</w:t>
+        <w:t xml:space="preserve">«Devo assolutamente occuparmi della sala da pranzo» disse, di fretta, e sparì attraverso la porta a battente prima che uno di noi potesse proferire parola, lasciando il paniere della torta sulla scrivania e la domanda sospesa nell'aria dietro di sé.</w:t>
       </w:r>
     </w:p>
     <w:p/>
@@ -414,7 +414,7 @@
     <w:p/>
     <w:p>
       <w:r>
-        <w:t>«Schizzinosa, la sua amica.»</w:t>
+        <w:t xml:space="preserve">«Nervosa, la sua amica.»</w:t>
       </w:r>
     </w:p>
     <w:p/>
@@ -426,13 +426,13 @@
     <w:p/>
     <w:p>
       <w:r>
-        <w:t>«Certo. Certo che lo è.» Fece clic con la penna, la infilò nel taschino della giacca e mi rivolse un piccolo cenno d'assenso. «Bene. Un vero piacere, signora Claus. Immagino che ci rivedremo in giro. È quel genere di paese, non è vero? Tutti vedono tutto.» E se ne andò a zonzo verso le scale con le mani in tasca, guardando in alto verso il medaglione di gesso mentre camminava.</w:t>
-      </w:r>
-    </w:p>
-    <w:p/>
-    <w:p>
-      <w:r>
-        <w:t>Recuperai Pip, la quale nel frattempo si era fatta strada attraverso la hall fino a un tavolino basso vicino alle scale e al grande e scintillante centrotavola sopra di esso, una ciotola di cristallo molato piena di frutta di vetro che rifrangeva arcobaleni quando il fuoco la illuminava. Se ne stava con il becco a circa un pollice da una pera di vetro, vibrando leggermente dal desiderio.</w:t>
+        <w:t xml:space="preserve">«Certo. Certo che lo è.» Fece clic con la penna, la infilò nel taschino della giacca e mi rivolse un piccolo cenno d'assenso. «Bene. Un vero piacere, signora Claus. Immagino che ci rivedremo in giro. È quel genere di paese, non è vero? Tutti vedono tutti.» E se ne andò a zonzo verso le scale con le mani in tasca, guardando in alto verso il medaglione di gesso mentre camminava.</w:t>
+      </w:r>
+    </w:p>
+    <w:p/>
+    <w:p>
+      <w:r>
+        <w:t xml:space="preserve">Recuperai Pip, la quale nel frattempo si era fatta strada attraverso la hall fino a un tavolino basso vicino alle scale e al grande e scintillante centrotavola sopra di esso, una ciotola di cristallo molato piena di frutta di vetro che rifrangeva arcobaleni quando il fuoco la illuminava. Se ne stava con il becco a due o tre centimetri da una pera di vetro, vibrando leggermente dal desiderio.</w:t>
       </w:r>
     </w:p>
     <w:p/>
@@ -444,19 +444,19 @@
     <w:p/>
     <w:p>
       <w:r>
-        <w:t>Mi rivolse uno sguardo di profondo e antico tradimento. Poi, siccome non era immune al dispetto, urtò il tavolo con la spalla mentre passava. L'intera composizione di cristallo oscillò. Una mezza dozzina di ospiti trattenne il fiato all'unisono, la donna anziana vicino al fuoco si sollevò a metà dalla poltrona e la ciotola tornò al suo posto. Trassi entrambi fuori dalla porta d'ingresso e sul portico prima che il mio scandaloso pinguino potesse finire ciò che aveva iniziato.</w:t>
-      </w:r>
-    </w:p>
-    <w:p/>
-    <w:p>
-      <w:r>
-        <w:t>All'esterno, il freddo fu un sollievo dopo la soffocante e ansiosa calura della hall. Rimasi un attimo appoggiata alla ringhiera del portico e lasciai che mi schiarisse la mente. Giù al parco, alcuni uomini sulle scale a pioli stavano infilando le luci della festa tra i lampioni, gridandosi l'un l'altro. Un cane abbaiava da qualche parte verso il parco, e il treno emise il suo fischio lontano mentre entrava in stazione. Tutto era così ordinario che la falsità sul volto di Fiona sembrò per un istante qualcosa che mi ero immaginata.</w:t>
-      </w:r>
-    </w:p>
-    <w:p/>
-    <w:p>
-      <w:r>
-        <w:t>Scendei i gradini e, quando mi voltai in fondo per guardare l'inn, la fila più vicina di luci arancioni della festa lungo i suoi cornicioni sfarfollò.</w:t>
+        <w:t xml:space="preserve">Mi rivolse uno sguardo di profondo e antico tradimento. Poi, siccome non era immune al dispetto, urtò il tavolo con la spalla mentre passava. L'intera composizione di cristallo oscillò. Una mezza dozzina di ospiti trattenne il fiato all'unisono, la donna anziana vicino al fuoco si sollevò a metà dalla poltrona e la ciotola tornò al suo posto. Trassi entrambe fuori dalla porta d'ingresso e sul portico prima che il mio scandaloso pinguino potesse finire ciò che aveva iniziato.</w:t>
+      </w:r>
+    </w:p>
+    <w:p/>
+    <w:p>
+      <w:r>
+        <w:t xml:space="preserve">All'esterno, il freddo fu un sollievo dopo la soffocante e ansiosa calura della hall. Rimasi un attimo appoggiata alla ringhiera del portico e lasciai che mi schiarisse la mente. Giù al prato, alcuni uomini sulle scale a pioli stavano infilando le luci della festa tra i lampioni, gridandosi l'un l'altro. Un cane abbaiava da qualche parte verso il parco, e il treno emise il suo fischio lontano mentre entrava in stazione. Tutto era così ordinario che ciò che non andava sul volto di Fiona sembrò per un istante qualcosa che mi ero immaginata.</w:t>
+      </w:r>
+    </w:p>
+    <w:p/>
+    <w:p>
+      <w:r>
+        <w:t xml:space="preserve">Scesi i gradini e, quando mi voltai in fondo per guardare la locanda, la fila più vicina di luci arancioni della festa lungo i suoi cornicioni sfarfallò.</w:t>
       </w:r>
     </w:p>
     <w:p/>
@@ -486,7 +486,7 @@
     <w:p/>
     <w:p>
       <w:r>
-        <w:t>Non era nulla. Un filo allentato. Un gioco del freddo su occhi stanchi. Me lo ripetei per tutta la risalita di Evergreen Avenue, oltre la panetteria dove il pane del mattino profumava l'intero isolato, oltre il parco con le sue luci mezze appese, oltre lo scheletro lettore di giornali della Gazette. Un filo allentato. Era solo quello.</w:t>
+        <w:t xml:space="preserve">Non era nulla. Un filo allentato. Un gioco del freddo su occhi stanchi. Me lo ripetei per tutta la risalita di Evergreen Avenue, oltre la panetteria dove il pane del mattino profumava l'intero isolato, oltre il prato con le sue luci mezze appese, oltre lo scheletro lettore di giornali della Gazette. Un filo allentato. Era solo quello.</w:t>
       </w:r>
     </w:p>
     <w:p/>
@@ -498,7 +498,7 @@
     <w:p/>
     <w:p>
       <w:r>
-        <w:t>E qualcosa non andava nella mia amica, non andava affatto per il verso giusto, abbastanza da mettere le ombre sotto i suoi occhi e quell'espressione circospetta sul suo volto. C'entrava qualcosa una spilla. E uno straniero con un bel sorriso e un taccuino era venuto in una piccola città a chiedere proprio di quella.</w:t>
+        <w:t xml:space="preserve">E qualcosa non andava nella mia amica, non andava affatto per il verso giusto, abbastanza da mettere le ombre sotto i suoi occhi e quell'espressione circospetta sul suo volto. C'entrava qualcosa una spilla. E uno sconosciuto con un bel sorriso e un taccuino era venuto in una piccola città a chiedere proprio di quella.</w:t>
       </w:r>
     </w:p>
     <w:p/>
@@ -510,7 +510,7 @@
     <w:p/>
     <w:p>
       <w:r>
-        <w:t>Lei pigolò, imperterrita. Ce ne tornammo a casa attraverso quella mattinata fredda e dorata, e non mi voltai a guardare indietro verso i tetti dell'inn, per quanto una parte di me desiderasse verificare se le luci lassù fossero ancora arancioni o fossero tornate quietamente d'oro mentre davo loro le spalle.</w:t>
+        <w:t xml:space="preserve">Lei pigolò, imperterrita. Ce ne tornammo a casa attraverso quella mattinata fredda e dorata, e non mi voltai a guardare indietro verso i cornicioni della locanda, per quanto una parte di me desiderasse verificare se le luci lassù fossero ancora arancioni o fossero tornate quietamente d'oro mentre davo loro le spalle.</w:t>
       </w:r>
     </w:p>
     <w:p>
@@ -566,12 +566,12 @@
     </w:p>
     <w:p>
       <w:r>
-        <w:t>La mattina si era fatta gelida durante la notte. Le pozzanghere nel viadotto erano velate di ghiaccio che scricchiolava sotto i miei stivali, e le foglie secche erano diventate rigide e argentate di brina. L'odore del fumo di legna dai camini lungo Evergreen ristagliava nell'aria fredda e immobile. La città era appena sveglia. La maggior parte dei negozi era ancora buia, con le zucche della festa sui gradini, e i nostri passi risonavano sul marciapiede vuoto.</w:t>
-      </w:r>
-    </w:p>
-    <w:p>
-      <w:r>
-        <w:t>La Winter Wonderland Inn spuntò alla vista mentre giravamo verso il prato, la facciata grigio-verde e la sua ghirlanda con il nastro d'oro esattamente come il giorno prima, eppure tutto mi sembrava diverso adesso, cambiato solo dal fatto che sapevo esserci dei guai là dentro. La ghirlanda catturava la prima luce. Le finestre erano buie tranne una.</w:t>
+        <w:t xml:space="preserve">La mattina si era fatta gelida durante la notte. Le pozzanghere nel viottolo erano velate di ghiaccio che scricchiolava sotto i miei stivali, e le foglie secche erano diventate rigide e argentate di brina. L'odore del fumo di legna dai camini lungo Evergreen ristagnava nell'aria fredda e immobile. La città era appena sveglia. La maggior parte dei negozi era ancora buia, con le zucche della festa sui gradini, e i nostri passi risuonavano sul marciapiede vuoto.</w:t>
+      </w:r>
+    </w:p>
+    <w:p>
+      <w:r>
+        <w:t xml:space="preserve">Il Winter Wonderland Inn spuntò alla vista mentre giravamo verso il prato, la facciata grigio-verde e la sua ghirlanda con il nastro d'oro esattamente come il giorno prima, eppure tutto mi sembrava diverso adesso, cambiato solo dal fatto che sapevo esserci dei guai là dentro. La ghirlanda catturava la prima luce. Le finestre erano buie tranne una.</w:t>
       </w:r>
     </w:p>
     <w:p>
@@ -606,18 +606,18 @@
     </w:p>
     <w:p>
       <w:r>
-        <w:t xml:space="preserve">Era un biglietto. La grafia era deliberatamente brutta, tutta storta e con lettere spezzate, la finta sbadataggine che una persona fa quando si impegna molto a camuffare la propria scrittura. La cifra fu la prima cosa che vidi, perché chiunque l'avesse scritto aveva voluto che quella fosse la prima cosa a saltare all'occhio. Cinquecento mila dollari. E sotto, con quella stessa calligrafia stentata, il resto. </w:t>
+        <w:t xml:space="preserve">Era un biglietto. La grafia era deliberatamente brutta, tutta storta e con lettere spezzate, la finta sbadataggine che una persona fa quando si impegna molto a camuffare la propria scrittura. La cifra fu la prima cosa che vidi, perché chiunque l'avesse scritto aveva voluto che quella fosse la prima cosa a saltare all'occhio. Cinquecentomila dollari. E sotto, con quella stessa calligrafia stentata, il resto. </w:t>
       </w:r>
       <w:r>
         <w:rPr>
           <w:i/>
         </w:rPr>
-        <w:t>So come la tua famiglia è entrata in possesso di questa locanda. So della spilla che la tua bisnonna ha preso ai Blackburn, quella con lo zaffiro al cuore, e del negozio a Ridgeline dove l'ha venduta per comprare questo posto. Paga, o l'intera città saprà la verità. Lascia i soldi sotto i gradini anteriori della locanda. Togli il nastro d'oro dalla ghirlanda e metti al suo posto uno rosso, così saprò che i soldi sono lì.</w:t>
-      </w:r>
-    </w:p>
-    <w:p>
-      <w:r>
-        <w:t>Lo lessi due volte. L'orologio a pendolo scandiva il tempo. Qualcosa nelle parole mi rimase impigliato in testa. Lo zaffiro al cuore. Un modo insolito, dolce, quasi tenero per un ricattatore per definire una pietra rubata, come una frase estratta da un libro. Lasciai perdere. Avevo questioni ben più grandi davanti a me in quel momento che la particolare espressione di un estraneo.</w:t>
+        <w:t xml:space="preserve">So come la tua famiglia è entrata in possesso di questa locanda. So della spilla che la tua bisnonna ha preso ai Blackburn, quella con lo zaffiro al suo cuore, e del negozio a Ridgeline dove l'ha venduta per comprare questo posto. Paga, o l'intera città saprà la verità. Lascia i soldi sotto i gradini anteriori della locanda. Togli il nastro d'oro dalla ghirlanda e metti al suo posto uno rosso, così saprò che i soldi sono lì.</w:t>
+      </w:r>
+    </w:p>
+    <w:p>
+      <w:r>
+        <w:t xml:space="preserve">Lo lessi due volte. L'orologio a pendolo scandiva il tempo. Qualcosa nelle parole mi rimase impigliato in testa. Lo zaffiro al suo cuore. Un modo insolito, dolce, quasi tenero per un ricattatore per definire una pietra rubata, come una frase estratta da un libro. Lasciai perdere. Avevo questioni ben più grandi davanti a me in quel momento che la particolare espressione di un estraneo.</w:t>
       </w:r>
     </w:p>
     <w:p>
@@ -632,7 +632,7 @@
     </w:p>
     <w:p>
       <w:r>
-        <w:t>Guardai. La fotografia mostrava una donna con gli abiti di cent'anni fa, snella e seria, i capelli scuri acconciati a onde strette vicino alla testa nello stile degli anni Venti, il mento sollevato, gli occhi che incontravano l'obiettivo dritti con qualcosa dentro che non era proprio un sorriso e non era proprio sfida, ma somigliava molto a entrambe le cose. Indossava un abito accollato, e alla gola, appuntita appena sotto il colletto, c'era una spilla. Anche nella morbida immagine color seppia si vedeva che era un pezzo pregiato, oro lavorato in un'incastonatura complessa attorno a una singola pietra grande che la vecchia pellicola aveva reso come un pallido chiarore grigio.</w:t>
+        <w:t xml:space="preserve">Guardai. La fotografia mostrava una donna con gli abiti di cent'anni fa, snella e seria, i capelli scuri acconciati a onde strette vicino alla testa nello stile degli anni Venti, il mento sollevato, gli occhi che incontravano l'obiettivo dritti con qualcosa dentro che non era proprio un sorriso e non era proprio sfida, ma somigliava molto a entrambe le cose. Indossava un abito accollato, e alla gola, appuntata appena sotto il colletto, c'era una spilla. Anche nella morbida immagine color seppia si vedeva che era un pezzo pregiato, oro lavorato in un'incastonatura complessa attorno a una singola pietra grande che la vecchia pellicola aveva reso come un pallido chiarore grigio.</w:t>
       </w:r>
     </w:p>
     <w:p>
@@ -662,12 +662,12 @@
     </w:p>
     <w:p>
       <w:r>
-        <w:t>«La portò due città più in là, a Ridgeline, in un banco dei pegni, e la vendette. E con quei soldi.» La voce di Fiona si incrinò di netto a metà. «Con quei soldi ha comprato questa locanda. Questa. La Winter Wonderland Inn. È così che la mia famiglia è arrivata a possederla. È questa la base su cui poggia ogni cosa. Cent'anni di Natali e matrimoni, colazioni la domenica, viaggiatori arrivati dalla neve, e sotto tutto quanto, a sorreggere il tutto, una spilla che una ragazza spaventata ha rubato alle persone per cui lavorava.»</w:t>
-      </w:r>
-    </w:p>
-    <w:p>
-      <w:r>
-        <w:t>Il peso di quelle parole calò sul stanzino. Rimasi seduta con la fotografia in una mano e il biglietto nell'altra e cercai di assimilare il tutto. La locanda, dove metà della città aveva festeggiato qualcosa in un momento o nell'altro, costruita su un furto di un secolo prima.</w:t>
+        <w:t xml:space="preserve">«La portò due città più in là, a Ridgeline, in un banco dei pegni, e la vendette. E con quei soldi.» La voce di Fiona si incrinò di netto a metà. «Con quei soldi ha comprato questa locanda. Questa. Il Winter Wonderland Inn. È così che la mia famiglia è arrivata a possederla. È questa la base su cui poggia ogni cosa. Cent'anni di Natali e matrimoni, colazioni la domenica, viaggiatori arrivati dalla neve, e sotto tutto quanto, a sorreggere il tutto, una spilla che una ragazza spaventata ha rubato alle persone per cui lavorava.»</w:t>
+      </w:r>
+    </w:p>
+    <w:p>
+      <w:r>
+        <w:t xml:space="preserve">Il peso di quelle parole calò sullo stanzino. Rimasi seduta con la fotografia in una mano e il biglietto nell'altra e cercai di assimilare il tutto. La locanda, dove metà della città aveva festeggiato qualcosa in un momento o nell'altro, costruita su un furto di un secolo prima.</w:t>
       </w:r>
     </w:p>
     <w:p>
@@ -686,12 +686,12 @@
         <w:t>non perdere</w:t>
       </w:r>
       <w:r>
-        <w:t>. Perciò naturalmente l'ho aperto.» Una piccola risata spezzata. «Lettere. Una ricevuta di pegno, quella vera, del negozio di Ridgeline, con la data e la somma. Qualcos'altro. Tutte piegate piccole e infilate negli angoli, come qualcosa che non riesci a sopportare di buttare via ma che non riesci neppure a guardare. Mia madre lo sapeva. Sua madre lo sapeva. E ora lo so io. E nessuno di noi ne ha mai fatto parola con un'anima viva.» Alzò lo sguardo verso di me, e i suoi occhi erano vivi dal dolore. «A chi potevo dirlo? Come fai a raccontare una cosa del genere a qualcuno? Cosa penserebbero di me, della locanda, se lo sapessero?»</w:t>
-      </w:r>
-    </w:p>
-    <w:p>
-      <w:r>
-        <w:t>Mi porsi in avanti e le appoggiai la mano sopra quella fredda. «Fiona. Ascoltami. Quello che tua bisnonna ha fatto o non ha fatto, cento anni fa, in un inverno difficile che non possiamo neanche immaginare, non è chi sei tu. Hai riversato tutto il tuo cuore in questo posto e in questa città. È questo che la gente vede. È questa la verità su di te.»</w:t>
+        <w:t xml:space="preserve">. Perciò naturalmente l'ho aperto.» Una piccola risata spezzata. «Lettere. Una ricevuta di pegno, quella vera, del negozio di Ridgeline, con la data e la somma. Qualcos'altro. Tutte piegate piccole e infilate negli angoli, come qualcosa che non riesci a sopportare di buttare via ma che non riesci neppure a guardare. Mia madre lo sapeva. Sua madre lo sapeva. E ora lo so io. E nessuna di noi ne ha mai fatto parola con un'anima viva.» Alzò lo sguardo verso di me, e i suoi occhi erano arrossati dal pianto. «A chi potevo dirlo? Come fai a raccontare una cosa del genere a qualcuno? Cosa penserebbero di me, della locanda, se lo sapessero?»</w:t>
+      </w:r>
+    </w:p>
+    <w:p>
+      <w:r>
+        <w:t xml:space="preserve">Mi sporsi in avanti e le appoggiai la mano sopra quella fredda. «Fiona. Ascoltami. Quello che tua bisnonna ha fatto o non ha fatto, cento anni fa, in un inverno difficile che non possiamo neanche immaginare, non è chi sei tu. Hai riversato tutto il tuo cuore in questo posto e in questa città. È questo che la gente vede. È questa la verità su di te.»</w:t>
       </w:r>
     </w:p>
     <w:p>
@@ -711,7 +711,7 @@
     </w:p>
     <w:p>
       <w:r>
-        <w:t>«Fiona,» dissi lentamente, abbassando il biglietto. «Leggilo di nuovo. Cita lo zaffiro. Lo zaffiro al cuore, esattamente quelle parole. E nomina Ridgeline, dove l'ha venduta.» Girai la fotografia verso di lei, con il dito vicino al pallido bagliore della gemma alla gola della donna. «Hai mai raccontato a qualcuno queste due cose? Che l'ha venduta a Ridgeline? Che quella pietra era uno zaffiro?»</w:t>
+        <w:t xml:space="preserve">«Fiona,» dissi lentamente, abbassando il biglietto. «Leggilo di nuovo. Cita lo zaffiro. Lo zaffiro al suo cuore, esattamente quelle parole. E nomina Ridgeline, dove l'ha venduta.» Girai la fotografia verso di lei, con il dito vicino al pallido bagliore della gemma alla gola della donna. «Hai mai raccontato a qualcuno queste due cose? Che l'ha venduta a Ridgeline? Che quella pietra era uno zaffiro?»</w:t>
       </w:r>
     </w:p>
     <w:p>
@@ -731,7 +731,7 @@
     </w:p>
     <w:p>
       <w:r>
-        <w:t>«Dove finiscono le vecchie carte di questa città, Fiona? Alla fine? Quando le famiglie che la possedevano non ci sono più o non vogliono averle tra i piedi?»</w:t>
+        <w:t xml:space="preserve">«Dove finiscono le vecchie carte di questa città, Fiona? Alla fine? Quando le famiglie che le possedevano non ci sono più o non vogliono averle tra i piedi?»</w:t>
       </w:r>
     </w:p>
     <w:p>
@@ -746,7 +746,7 @@
     </w:p>
     <w:p>
       <w:r>
-        <w:t>«Prendili.» Lasciò andare un respiro che era quasi una risata, quella logora che non ha più alcuna allegria dentro. «Prendili, e ti prego, Jessica, ti prego fa' che finisca. Sono rimasta sveglia ogni notte a fare i conti nel buio. Non ce li ho. Cinquecento mila dollari. Non ne ho un decimo. Ho una locanda piena d'amore, una pila di fatture nel cassetto dell'ufficio e la buona settimana dei Worthington. Questo è tutto ciò che ho in questo mondo.»</w:t>
+        <w:t xml:space="preserve">«Prendili.» Lasciò andare un respiro che era quasi una risata, quella logora che non ha più alcuna allegria dentro. «Prendili, e ti prego, Jessica, ti prego fa' che finisca. Sono rimasta sveglia ogni notte a fare i conti nel buio. Non ce li ho. Cinquecentomila dollari. Non ne ho un decimo. Ho una locanda piena d'amore, una pila di fatture nel cassetto dell'ufficio e la buona settimana dei Worthington. Questo è tutto ciò che ho in questo mondo.»</w:t>
       </w:r>
     </w:p>
     <w:p>
@@ -766,7 +766,7 @@
     </w:p>
     <w:p>
       <w:r>
-        <w:t>«Risolveremo la faccenda,» dissi, e lo pensavo fino in fondo. Infilai con cura il biglietto e la fotografia nella tasca interna del cappotto, contro il cuore. «Hai capito? Non te ne stai più in giro da sola. Non per un altro giorno. Qualunque cosa costi, chiunque salti fuori, ora hai un'amica in questa storia, e io sono molto caparbia, e ho più tempo e pazienza di chiunque tu conosca.»</w:t>
+        <w:t xml:space="preserve">«Risolveremo la faccenda,» dissi, e lo pensavo fino in fondo. Infilai con cura il biglietto e la fotografia nella tasca interna del cappotto, contro il cuore. «Hai capito? Non porti più questo peso da sola. Non per un altro giorno. Qualunque cosa costi, chiunque salti fuori, ora hai un'amica in questa storia, e io sono molto caparbia, e ho più tempo e pazienza di chiunque tu conosca.»</w:t>
       </w:r>
     </w:p>
     <w:p>
@@ -802,19 +802,19 @@
     <w:p/>
     <w:p>
       <w:r>
-        <w:t>Nick aveva messo su la zuppa quando tornai a casa, il che era esattamente quello che faceva Nick quando il mondo si metteva di traverso. Altri uomini camminavano in lungo e in largo, o lucidavano oggetti, oppure si intristivano e tagliavano legna. Mio marito preparava la zuppa. Sosteneva che un problema sembrasse più piccolo oltre una ciotola colma, e in diversi secoli di matrimonio non gli avevo mai visto sbagliare un colpo.</w:t>
-      </w:r>
-    </w:p>
-    <w:p/>
-    <w:p>
-      <w:r>
-        <w:t>Nick sapeva leggermi dentro da capo a fondo. Entrai scrollando il freddo dagli stivali, mi diede un'occhiata in volto e non fece una sola domanda. Mescolò due porzioni di una minestra d'orzo, carote e gli ultimi porri autunnali, le posò sul tavolo della cucina e tirò fuori la mia sedia. Aspettò che avessi mandato giù tre cucchiai prima di accennare a sollevare un sopracciglio.</w:t>
-      </w:r>
-    </w:p>
-    <w:p/>
-    <w:p>
-      <w:r>
-        <w:t>Così glielo raccontai. Per filo e per segno, mentre la zuppa fumava e Pip sonnecchiava vicino alla stufa con una natatoia sugli occhi. La telefonata. Il salottino con l'orologio rumoroso. Il biglietto, il nastro rosso e i contanti sotto i gradini. La foto della donna dei Blackburn senza nome con la spilla alla gola. Constance Okafor, diciannove o venti anni in un inverno rigido, il furto, il rigattiere due paesi più in là a Ridgeline, la locanda comprata con quei soldi. E il baule chiuso a chiave in soffitta che nessuno aveva aperto se non Fiona in persona.</w:t>
+        <w:t xml:space="preserve">Nick aveva messo su la zuppa quando tornai a casa, il che era esattamente quello che faceva Nick quando il mondo si metteva di traverso. Altri uomini camminavano in lungo e in largo, o lucidavano oggetti, oppure si chiudevano nel silenzio e spaccavano legna. Mio marito preparava la zuppa. Sosteneva che un problema sembrasse più piccolo oltre una ciotola colma, e in diversi secoli di matrimonio non gli avevo mai visto sbagliare un colpo.</w:t>
+      </w:r>
+    </w:p>
+    <w:p/>
+    <w:p>
+      <w:r>
+        <w:t xml:space="preserve">Nick sapeva leggermi dentro da capo a fondo. Entrai scrollando il freddo dagli stivali, mi diede un'occhiata in volto e non fece una sola domanda. Versò col mestolo due scodelle di una minestra d'orzo, carote e gli ultimi porri autunnali, le posò sul tavolo della cucina e tirò fuori la mia sedia. Aspettò che avessi mandato giù tre cucchiai prima di accennare a sollevare un sopracciglio.</w:t>
+      </w:r>
+    </w:p>
+    <w:p/>
+    <w:p>
+      <w:r>
+        <w:t xml:space="preserve">Così glielo raccontai. Per filo e per segno, mentre la zuppa fumava e Pip sonnecchiava vicino alla stufa con una natatoia sugli occhi. La telefonata. Il salottino con l'orologio rumoroso. Il biglietto, il nastro rosso e i contanti sotto i gradini. La foto della donna dei Blackburn senza nome con la spilla alla gola. Constance Okafor, diciannove o venti anni in un inverno rigido, il furto, il banco dei pegni due paesi più in là a Ridgeline, la locanda comprata con quei soldi. E il baule chiuso a chiave in soffitta che nessuno aveva aperto se non Fiona in persona.</w:t>
       </w:r>
     </w:p>
     <w:p/>
@@ -874,7 +874,7 @@
     <w:p/>
     <w:p>
       <w:r>
-        <w:t>«Allora ecco l'altra verità, e potrebbe esserti d'aiuto». Si sporse in avanti. «Molte mani sfiorano quelle scatole, Jess. I volontari vanno e vengono. I ricercatori scrivono in anticipo e si fermano una settimana. Le scolaresche in gita. Chiunque Theo lasci entrare, e Theo fa entrare chiunque, perché per lui uno straniero incuriosito è la cosa migliore che possa capitare a un martedì. Quindi sapere che il segreto è uscito dalle carte dei Blackburn non ti dice che sia stato Theo. Ti dice solo dove posizionarti. Ti indica il pozzo da cui è stata attinta l'acqua. Ora devi scoprire di chi fosse il secchio calato giù».</w:t>
+        <w:t xml:space="preserve">«Allora ecco l'altra verità, e potrebbe esserti d'aiuto». Si sporse in avanti. «Molte mani sfiorano quelle scatole, Jess. I volontari vanno e vengono. I ricercatori scrivono in anticipo e si fermano una settimana. Le scolaresche in gita. Chiunque Theo lasci entrare, e Theo fa entrare chiunque, perché per lui uno sconosciuto incuriosito è la cosa migliore che possa capitare a un martedì. Quindi sapere che il segreto è uscito dalle carte dei Blackburn non ti dice che sia stato Theo. Ti dice solo dove posizionarti. Ti indica il pozzo da cui è stata attinta l'acqua. Ora devi scoprire di chi fosse il secchio calato giù».</w:t>
       </w:r>
     </w:p>
     <w:p/>
@@ -934,7 +934,7 @@
     <w:p/>
     <w:p>
       <w:r>
-        <w:t>«Per tutti». Venne a darmi un bacio sulla sommità del capo mentre andava a riporre le ciotole. «Ma non ancora. Non andare là fuori, Jess. Promettimelo. Non è pronta, e una cosa che non è pronta rischia di rovinarsi se viene guardata troppo presto. Certe cose hanno bisogno del buio per crescere. I bulbi ce l'hanno. E anche questo».</w:t>
+        <w:t xml:space="preserve">«Per tutti». Venne a darmi un bacio sulla sommità del capo mentre andava a riporre le ciotole. «Ma non ancora. Non andare là fuori, Jess. Promettimelo. Non è pronta, e una cosa che non è pronta rischia di rovinarsi se viene guardata troppo presto. Certe cose hanno bisogno del buio per crescere. Per i bulbi è così. E anche questo».</w:t>
       </w:r>
     </w:p>
     <w:p/>
@@ -958,7 +958,7 @@
     <w:p/>
     <w:p>
       <w:r>
-        <w:t>Le luci della festa lungo i tetti lontani, i fili che gli uomini avevano teso tra i lampioni sul prato verde, ardevano di un color oro anziché arancione, un oro profondo e costante, ogni singolo filo, dal verde fino alla stazione, per quanto la vista potesse spingersi.</w:t>
+        <w:t xml:space="preserve">Le luci della festa lungo i tetti lontani, i fili che gli uomini avevano teso tra i lampioni sul prato verde, ardevano di un color oro anziché arancione, un oro profondo e costante, ogni singolo filo, dal prato fino alla stazione, per quanto la vista potesse spingersi.</w:t>
       </w:r>
     </w:p>
     <w:p/>
@@ -1053,7 +1053,7 @@
     <w:p/>
     <w:p>
       <w:r>
-        <w:t xml:space="preserve">La Società Storica di Frost Falls era un edificio in mattoni stretti sulla piazza e, la mattina in cui la mostra d'archivio aprì, c'era più gente che entrava e usciva di quanta ne avessi mai vista lì. Il marciapiede davanti era un fiume lento di cappotti. Qualcuno aveva appeso uno striscione sopra la porta, dipinto a mano, </w:t>
+        <w:t xml:space="preserve">La Società Storica di Frost Falls era uno stretto edificio in mattoni sulla piazza e, la mattina in cui la mostra d'archivio aprì, c'era più gente che entrava e usciva di quanta ne avessi mai vista lì. Il marciapiede davanti era un fiume lento di cappotti. Qualcuno aveva appeso uno striscione sopra la porta, dipinto a mano, </w:t>
       </w:r>
       <w:r>
         <w:rPr>
@@ -1117,12 +1117,12 @@
     </w:p>
     <w:p>
       <w:r>
-        <w:t>Jamal Washington se ne stava lungo la parete di fondo in maniche di camicia, con le maniche arrotolate, asciugandosi la nuca con un fazzoletto, con l'aria di un uomo che aveva fatto il lavoro pesante e ora ne faceva la guardia per abitudine. Quando una donna indietreggiò verso una vetrina, lui tese una mano silenziosa per raddrizzarla prima che potesse urtarla, e tornò a mettersi di sbieco. Aveva trasportato tutto questo. Ogni vetrina, ogni cassa.</w:t>
-      </w:r>
-    </w:p>
-    <w:p>
-      <w:r>
-        <w:t>Vera Reed era alla reception, intenta a posare una scatola d'archivio piatta piena di documenti, svelta e bottonata fino alla gola, con movimenti rapidi ed economici. Disse qualcosa a Theo dall'altra parte della stanza, e lui le sollevò una mano, un piccolo cenno di ringraziamento. Lei rispose annuendo, una volta, e si chinò per allineare il bordo della scatola al bordo della scrivania, mettendoli esattamente a filo, incapace, come certe persone, di lasciare una cosa storta.</w:t>
+        <w:t xml:space="preserve">Jamal Washington se ne stava lungo la parete di fondo in maniche di camicia, con le maniche arrotolate, asciugandosi la nuca con un fazzoletto, con l'aria di un uomo che aveva fatto il lavoro pesante e ora ne faceva la guardia per abitudine. Quando una donna indietreggiò verso una vetrina, lui tese una mano silenziosa per raddrizzarla prima che potesse urtarla, e tornò ad appoggiarsi alla parete. Aveva trasportato tutto questo. Ogni vetrina, ogni cassa.</w:t>
+      </w:r>
+    </w:p>
+    <w:p>
+      <w:r>
+        <w:t xml:space="preserve">Vera Reed era alla reception, intenta a posare una scatola d'archivio piatta piena di documenti, svelta e abbottonata fino alla gola, con movimenti rapidi ed economici. Disse qualcosa a Theo dall'altra parte della stanza, e lui le sollevò una mano, un piccolo cenno di ringraziamento. Lei rispose annuendo, una volta, e si chinò per allineare il bordo della scatola al bordo della scrivania, mettendoli esattamente a filo, incapace, come certe persone, di lasciare una cosa storta.</w:t>
       </w:r>
     </w:p>
     <w:p>
@@ -1148,17 +1148,17 @@
     </w:p>
     <w:p>
       <w:r>
-        <w:t>«Sei ancora a caccia della tua spilla,» dissi.</w:t>
-      </w:r>
-    </w:p>
-    <w:p>
-      <w:r>
-        <w:t>«Sono sempre a caccia della mia spilla. È il mio lavoro.» Si raddrizzò e infilò il taccuino sotto il braccio. «Poco fa un uomo mi è venuto incontro al tavolo del sidro e mi ha detto che i Blackburn un tempo possedevano metà di Maple Street. Lo sapeva? La gente adora raccontarti cosa possedevano le famiglie ricche. Non sanno mai dirti cosa le famiglie ricche hanno fatto alle persone che lavoravano per loro. Quella parte non finisce nelle carte di famiglia.» Fece un cenno verso il vetro. «Divertente, vero? Venti lettere e nessuna scritta da una cameriera.»</w:t>
-      </w:r>
-    </w:p>
-    <w:p>
-      <w:r>
-        <w:t>Era un'affermazione più tagliente di quanto mi fossi aspettata da parte sua, e più vera, e la archiviavi nella mia mente. Neil Carter ci aveva riflettuto sopra più di quanto lasciasse intendere.</w:t>
+        <w:t xml:space="preserve">«È ancora a caccia della sua spilla,» dissi.</w:t>
+      </w:r>
+    </w:p>
+    <w:p>
+      <w:r>
+        <w:t xml:space="preserve">«Sono sempre a caccia della mia spilla. È il mio lavoro.» Si raddrizzò e infilò il taccuino sotto il braccio. «Poco fa un uomo mi è venuto incontro al tavolo del sidro e mi ha detto che i Blackburn un tempo possedevano metà di Maple Street. Lo sapeva? La gente adora raccontarti cosa possedevano le famiglie ricche. Non sanno mai dirti cosa le famiglie ricche hanno fatto alle persone che lavoravano per loro. Quella parte non finisce nelle carte di famiglia.» Fece un cenno verso il vetro. «Curioso, vero? Vent'anni di lettere e nessuna scritta da una cameriera.»</w:t>
+      </w:r>
+    </w:p>
+    <w:p>
+      <w:r>
+        <w:t xml:space="preserve">Era un'affermazione più tagliente di quanto mi fossi aspettata da parte sua, e più vera, e la archiviai nella mia mente. Neil Carter ci aveva riflettuto sopra più di quanto lasciasse intendere.</w:t>
       </w:r>
     </w:p>
     <w:p>
@@ -1188,17 +1188,17 @@
     </w:p>
     <w:p>
       <w:r>
-        <w:t>Io non risi. Rimasi immobile in mezzo alla stanza calda e ridente e sentii il freddo salirmi dentro, perché le lettere dei Blackburn più interessanti, quelle che avrebbero detto che una spilla era scomparsa e dove era finita, si erano smarrite. E piegata nella tasca interna del mio cappotto c'era una lettera di ricatto che sapeva esattamente cosa dicevano quelle lettere.</w:t>
-      </w:r>
-    </w:p>
-    <w:p>
-      <w:r>
-        <w:t>Girai per la sala dopo quello, lentamente. Ammirai i vecchi atti insieme a Dot, la quale definì l'intera faccenda «un gran fracasso per la posta degli altri» e rimase comunque per un'ora. Lasciai che Theo mi accompagnasse attraverso tre delle teche di vetro, e osservai come le toccava, o meglio come non le toccava, con le dita che fluttuavano sopra il vetro di ciascuna come una mano tesa sulla schiena di un bambino addormentato per sentirla respirare senza svegliarlo. E per tutto il tempo tenni d'occhio la sala.</w:t>
-      </w:r>
-    </w:p>
-    <w:p>
-      <w:r>
-        <w:t>La carta nelle teche era vecchia, marrone, fragile alle pieghe. Ma sulla reception, accanto alla scatola piatta di Vera, c'era una risma di carta intestata della Società, la carta bianca che usavano per le etichette e per l'intestazione, color crema, un po' più pesante della carta ordinaria, con una leggera tramatura impressa, sottili linee parallele che avresti colto solo tenendola controluce o avendo motivo di guardare.</w:t>
+        <w:t xml:space="preserve">Io non risi. Rimasi immobile in mezzo alla stanza calda e ridente e sentii il freddo salirmi dentro, perché le lettere dei Blackburn più interessanti, quelle che avrebbero detto che una spilla era scomparsa e dove era finita, si erano smarrite. E piegata nella tasca interna del mio cappotto c'era un biglietto di ricatto che sapeva esattamente cosa dicevano quelle lettere.</w:t>
+      </w:r>
+    </w:p>
+    <w:p>
+      <w:r>
+        <w:t xml:space="preserve">Girai per la sala dopo quello, lentamente. Ammirai i vecchi atti insieme a Dot, la quale definì l'intera faccenda «un sacco di storie per la posta degli altri» e rimase comunque per un'ora. Lasciai che Theo mi accompagnasse attraverso tre delle teche di vetro, e osservai come le toccava, o meglio come non le toccava, con le dita che fluttuavano sopra il vetro di ciascuna come una mano tesa sulla schiena di un bambino addormentato per sentirlo respirare senza svegliarlo. E per tutto il tempo tenni d'occhio la sala.</w:t>
+      </w:r>
+    </w:p>
+    <w:p>
+      <w:r>
+        <w:t xml:space="preserve">La carta nelle teche era vecchia, marrone, fragile alle pieghe. Ma sulla reception, accanto alla scatola piatta di Vera, c'era una risma di carta intestata della Società, la carta non stampata che usavano per le etichette e per l'intestazione, color crema, un po' più pesante della carta ordinaria, con una leggera tramatura impressa, sottili linee parallele che avresti colto solo tenendola controluce o avendo motivo di guardare.</w:t>
       </w:r>
     </w:p>
     <w:p>
@@ -1213,12 +1213,12 @@
     </w:p>
     <w:p>
       <w:r>
-        <w:t>Pip mi trovò vicino alla porta pochi minuti dopo, e si era messa nei guai, come le capitava spesso. Stava sfilando lungo l'atrio d'ingresso con uno spezzone di nastro rosso che le penzolava dal becco, un ricciolo di nastro festivo che aveva staccato da un festone di verdura vicino alle scale, tenendo la testa alta, la coda in movimento, supremamente fiera di sé.</w:t>
-      </w:r>
-    </w:p>
-    <w:p>
-      <w:r>
-        <w:t>«Dove lo hai preso,» dissi, e mi accovacciai per prenderlo, ma lei ballonzolò appena fuori dalla mia portata, fiera come una duchessa a un'incoronazione. Nastro rosso. Tra tutti i nastri in un edificio ghermito di oro e arancio, era andata a trovare proprio quel ricciolo di rosso. Glielo tolsi di dosso alla fine, delicatamente, e lo tenni in mano, una piccola e brillante spirale di raso rosso, lo stesso rosso che la lettera aveva detto a Fiona di appendere alla sua ghirlanda, affinché il ricattatore sapesse che il denaro stava ad aspettare sotto i gradini.</w:t>
+        <w:t xml:space="preserve">Pip mi trovò vicino alla porta pochi minuti dopo, e si era messa nei guai, come le capitava spesso. Stava sfilando lungo l'atrio d'ingresso con uno spezzone di nastro rosso che le penzolava dal becco, un ricciolo di nastro festivo che aveva staccato da un festone di rami sempreverdi vicino alle scale, tenendo la testa alta, la coda in movimento, supremamente fiera di sé.</w:t>
+      </w:r>
+    </w:p>
+    <w:p>
+      <w:r>
+        <w:t xml:space="preserve">«Dove lo hai preso,» dissi, e mi accovacciai per prenderlo, ma lei ballonzolò appena fuori dalla mia portata, fiera come una duchessa a un'incoronazione. Nastro rosso. Tra tutti i nastri in un edificio addobbato d'oro e d'arancio, era andata a trovare proprio quel ricciolo di rosso. Glielo tolsi di dosso alla fine, delicatamente, e lo tenni in mano, una piccola e brillante spirale di raso rosso, lo stesso rosso che il biglietto aveva detto a Fiona di appendere alla sua ghirlanda, affinché il ricattatore sapesse che il denaro stava ad aspettare sotto i gradini.</w:t>
       </w:r>
     </w:p>
     <w:p>
@@ -1228,7 +1228,7 @@
     </w:p>
     <w:p>
       <w:r>
-        <w:t>Ma lo piallai nella tasca del cappotto comunque, accanto alla lettera. Mi raddrizzai e guardai indietro verso la stanza calda e affollata un'ultima volta. Verso Theo, accovacciato ora accanto al tavolo del sidro, che raccontava a un bambino la fondazione della città con tutto il suo cuore stanco, con gli occhi del ragazzino spalancati. Verso Vera, alla scrivania, intenta a raddrizzare per l'ennesima frazione di pollice la sua scatola di documenti. Verso Neil Carter, vicino alla teca, che scriveva qualcosa sul suo taccuino. E verso la risma di carta color crema accanto al gomito di Vera, che catturava la luce.</w:t>
+        <w:t xml:space="preserve">Ma lo piegai nella tasca del cappotto comunque, accanto al biglietto. Mi raddrizzai e guardai indietro verso la stanza calda e affollata un'ultima volta. Verso Theo, accovacciato ora accanto al tavolo del sidro, che raccontava a un bambino la fondazione della città con tutto il suo cuore stanco, con gli occhi del ragazzino spalancati. Verso Vera, alla scrivania, intenta a raddrizzare di un ultimo mezzo centimetro la sua scatola di documenti. Verso Neil Carter, vicino alla teca, che scriveva qualcosa sul suo taccuino. E verso la risma di carta color crema accanto al gomito di Vera, che catturava la luce.</w:t>
       </w:r>
     </w:p>
     <w:p>
@@ -1249,12 +1249,12 @@
     <w:p/>
     <w:p>
       <w:r>
-        <w:t>Yarn Tales sorgeva all'angolo tra Evergreen e Maple, con la vetrina colma di matasse accatastate per colore come una scatola di tempere lasciata aperta. Dentro si stava al caldo e nella penombra. Odorava di lana e della camomilla che Olivia teneva sempre in infusione sul piccolo fornelletto dietro il bancone. Quel pomeriggio le donne del circolo avevano avvicinato le sedie verso la parte anteriore, nella luce acquosa di ottobre che filtrava dalla finestra, ed erano tutte lì. Olivia stava in mezzo, naturalmente, perché era il suo negozio, la sua camomilla e, chissà come, sempre la sua conversazione; Dot seduta accanto a lei, robusta e grigia, secca come un cracker; Claire con la sua sveltezza da giornalista, già tre ferri avanti a tutte; Ivy, che rideva delle cose prima ancora che fossero del tutto comiche; Martha, dritta nella sedia buona con le caviglie incrociate; ed Ellie, la dolce Ellie, che aggrottava la fronte su una maglia caduta.</w:t>
-      </w:r>
-    </w:p>
-    <w:p>
-      <w:r>
-        <w:t>E io, e Pip, che diede un'occhiata al posticino caldo davanti alla stufa a legna, girò due volte su se stessa, infilò il becco sotto un'alula e si addormentò.</w:t>
+        <w:t xml:space="preserve">Yarn Tales sorgeva all'angolo tra Evergreen e Maple, con la vetrina colma di matasse accatastate per colore come una scatola di tempere lasciata aperta. Dentro si stava al caldo e nella penombra. Odorava di lana e della camomilla che Olivia teneva sempre in infusione sul piccolo fornelletto dietro il bancone. Quel pomeriggio le donne del circolo avevano avvicinato le sedie verso la parte anteriore, nella luce acquosa di ottobre che filtrava dalla finestra, ed erano tutte lì. Olivia stava in mezzo, naturalmente, perché era il suo negozio, la sua camomilla e, chissà come, sempre la sua conversazione; Dot seduta accanto a lei, robusta e grigia, secca come un cracker; Claire con la sua sveltezza da giornalista, già tre giri avanti a tutte; Ivy, che rideva delle cose prima ancora che fossero del tutto comiche; Martha, dritta nella sedia buona con le caviglie incrociate; ed Ellie, la dolce Ellie, che aggrottava la fronte su una maglia caduta.</w:t>
+      </w:r>
+    </w:p>
+    <w:p>
+      <w:r>
+        <w:t xml:space="preserve">E io, e Pip, che diede un'occhiata al posticino caldo davanti alla stufa a legna, girò due volte su se stessa, infilò il becco sotto una natatoia e si addormentò.</w:t>
       </w:r>
     </w:p>
     <w:p>
@@ -1294,7 +1294,7 @@
     </w:p>
     <w:p>
       <w:r>
-        <w:t>Olivia si sporse per rimborsarmi il tè senza che le venisse chiesto.</w:t>
+        <w:t xml:space="preserve">Olivia si sporse per versarmi altro tè senza che le venisse chiesto.</w:t>
       </w:r>
     </w:p>
     <w:p>
@@ -1354,7 +1354,7 @@
     </w:p>
     <w:p>
       <w:r>
-        <w:t>«Sapere che il segreto proveniva dai documenti ti diceva dove metterti», aveva detto Nick. «Non chi.» Molte persone a Frost Falls provavano compassione per Theo. Metà del paese avrebbe pianto nello scoprire quanto fosse grave la situazione. Provare compassione per un uomo, ed essere persino l'uomo più disperato del paese, non equivale a ricattare un'amica per soldi, e non avrei permesso che l'una cosa si mescolasse all'altra nella mia mente senza qualcosa di più solido dell'aritmetica e di una brutta sensazione. Così continuai a sferruzzare, tenni il pugno chiuso e mantenni il sospetto leggero, come una brace, pronta a lasciarla cadere.</w:t>
+        <w:t xml:space="preserve">«Sapere che il segreto proveniva dai documenti ti diceva dove metterti», aveva detto Nick. «Non chi.» Molte persone a Frost Falls provavano compassione per Theo. Metà del paese avrebbe pianto nello scoprire quanto fosse grave la situazione. Provare compassione per un uomo, ed essere persino l'uomo più disperato del paese, non equivale a ricattare un'amica per soldi, e non avrei permesso che l'una cosa si mescolasse all'altra nella mia mente senza qualcosa di più solido dell'aritmetica e di una brutta sensazione. Così continuai a sferruzzare, tenni il pugno aperto e mantenni il sospetto leggero, come una brace, pronta a lasciarla cadere.</w:t>
       </w:r>
     </w:p>
     <w:p>
@@ -1374,7 +1374,7 @@
     </w:p>
     <w:p>
       <w:r>
-        <w:t>La conversazione passò oltre, alle manopole, al nuovo bebè della figlia di Ivy, e a stabilire se la neve del primo ottobre significasse un inverno rigido o mite, cosa che nessuno riuscì a decidere. Lasciai che il discorso fluisse. Accanto a me, Martha era rimasta in silenzio sul suo lavoro. Dopo un po' si sporse leggermente verso di me e disse sottovoce, solo per noi due: «E come sta la nostra Fiona? Ho sentito dire che non è in sé».</w:t>
+        <w:t xml:space="preserve">La conversazione passò oltre, alle manopole, al nuovo bebè della figlia di Ivy, e a stabilire se una prima neve in ottobre significasse un inverno rigido o mite, cosa che nessuno riuscì a decidere. Lasciai che il discorso fluisse. Accanto a me, Martha era rimasta in silenzio sul suo lavoro. Dopo un po' si sporse leggermente verso di me e disse sottovoce, solo per noi due: «E come sta la nostra Fiona? Ho sentito dire che non è in sé».</w:t>
       </w:r>
     </w:p>
     <w:p>
@@ -1384,7 +1384,7 @@
     </w:p>
     <w:p>
       <w:r>
-        <w:t>«Mm.» Martha non era nata ieri. Lasciò che quel mm aleggiasse per un momento, senza credermi e senza insistere. «Dille che il circolo è qui, se ha bisogno di noi. Siamo vecchie, ma non inutili. Non c'è guaio in questo paese che non abbiamo affrontato sedute accanto a qualcuno.» Poi posò di nuovo i ferri, allungò una mano e poggiò la sua vecchia mano forte e macchiata sul mio ginocchio. «E tu, Jessica. Hai quella faccia lì. Quella che avevi qualche settimana fa, per il figlio dei Redfern, quando non volevi lasciar perdere e il resto di noi pensava che avresti dovuto. Ti porti dietro un peso.»</w:t>
+        <w:t xml:space="preserve">«Mm.» Martha non era nata ieri. Lasciò che quel mm aleggiasse per un momento, senza credermi e senza insistere. «Dille che il circolo è qui, se ha bisogno di noi. Siamo vecchie, ma non inutili. Non c'è guaio in questo paese che non abbiamo affrontato sedute accanto a qualcuno.» Poi posò di nuovo i ferri, allungò una mano e poggiò la sua vecchia mano forte e macchiata sul mio ginocchio. «E tu, Jessica. Hai quella faccia lì. Quella che avevi qualche settimana fa, per la bambina dei Redfern, quando non volevi lasciar perdere e il resto di noi pensava che avresti dovuto. Ti porti dietro un peso.»</w:t>
       </w:r>
     </w:p>
     <w:p>
@@ -1429,7 +1429,7 @@
     </w:p>
     <w:p>
       <w:r>
-        <w:t>Ma avevo vissuto a lungo, e il desiderio non aveva mai cambiato la realtà dei fatti. Così tenni il desiderio in una mano e la fredda aritmetica nell'altra. Avrei detto a Nick ciò che il circolo mi aveva rivelato, e avrei tenuto il pugno chiuso.</w:t>
+        <w:t xml:space="preserve">Ma avevo vissuto a lungo, e il desiderio non aveva mai cambiato la realtà dei fatti. Così tenni il desiderio in una mano e la fredda aritmetica nell'altra. Avrei detto a Nick ciò che il circolo mi aveva rivelato, e avrei tenuto il pugno aperto.</w:t>
       </w:r>
     </w:p>
     <w:p>
@@ -1445,17 +1445,17 @@
     </w:p>
     <w:p>
       <w:r>
-        <w:t>Il prato era il luogo in cui si sarebbe svolto il festival, la grande spianata a sud di Evergreen che si estendeva a partire dalla piazza, con il monumento ai caduti vicino alla sommità e il grande olmo all'estremità opposta. L'intero paese si era mobilitato per addobbarlo. C'erano tavoli da cavalletto da portare fuori e disporre in file, un palco da montare all'estremità settentrionale e quelle che sembravano mille piccole zucche da sistemare in modo che sembrassero casuali. In realtà, il comitato vi avrebbe confabulato sopra per un'ora. Ero arrivata solo per consegnare al comitato del festival la prima dozzina di paia di guanti del circolo e, nel giro di novanta secondi dal mio arrivo, mi ero ritrovata tra le braccia una cassetta di zucche da torta da parte di un uomo che non conoscevo, il quale mi aveva detto: «Le metteresti lungo il fronte del palco? Fa' attenzione a quella morbida». Le cose andavano così in quel paese, e la cosa non mi dispiaceva affatto. Non c'era modo di pensare con una cassetta di zucche tra le braccia, e questo mi andava a genio.</w:t>
-      </w:r>
-    </w:p>
-    <w:p>
-      <w:r>
-        <w:t>Le stavo sistemando lungo la parte anteriore del palco, dalla più grande alla più piccola, quando una voce piccola e seria dietro di me disse: «Signora Claus, il suo pinguino sta mangiando una zucca».</w:t>
-      </w:r>
-    </w:p>
-    <w:p>
-      <w:r>
-        <w:t>Mi voltai. Pip aveva l'intera testa sepolta nella sommità sventrata di una zucca intagliata in anticipo da qualcuno, mentre estraeva i semi umidi e li scagliava sull'erba con la beatitudine monotona che riservava a qualsiasi cosa proibita. In piedi sopra di lei, sospesa tra l'orrore e la gioia, c'era Emma Redfern.</w:t>
+        <w:t xml:space="preserve">Il prato era il luogo in cui si sarebbe svolto il festival, la grande spianata a sud di Evergreen che si estendeva a partire dalla piazza, con il monumento ai caduti vicino alla sommità e il grande olmo all'estremità opposta. L'intero paese si era mobilitato per addobbarlo. C'erano tavoli a cavalletto da portare fuori e disporre in file, un palco da montare all'estremità settentrionale e quelle che sembravano mille piccole zucche da sistemare in modo che sembrassero casuali. In realtà, il comitato ci avrebbe armeggiato sopra per un'ora. Ero arrivata solo per consegnare al comitato del festival la prima dozzina di manopole del circolo e, nel giro di novanta secondi dal mio arrivo, mi ero ritrovata tra le braccia una cassetta di zucche da torta da parte di un uomo che non conoscevo, il quale mi aveva detto: «Le metterebbe lungo il fronte del palco? Faccia attenzione a quella morbida». Le cose andavano così in quel paese, e la cosa non mi dispiaceva affatto. Non c'era modo di pensare con una cassetta di zucche tra le braccia, e questo mi andava a genio.</w:t>
+      </w:r>
+    </w:p>
+    <w:p>
+      <w:r>
+        <w:t xml:space="preserve">Le stavo sistemando lungo la parte anteriore del palco, dalla più grande alla più piccola, quando una voce piccola e seria dietro di me disse: «Signora Claus, il tuo pinguino sta mangiando una zucca».</w:t>
+      </w:r>
+    </w:p>
+    <w:p>
+      <w:r>
+        <w:t xml:space="preserve">Mi voltai. Pip aveva l'intera testa sepolta nella sommità sventrata di una zucca intagliata in anticipo da qualcuno, mentre estraeva i semi umidi e li scagliava sull'erba con la beatitudine assorta che riservava a qualsiasi cosa proibita. In piedi sopra di lei, sospesa tra l'orrore e la gioia, c'era Emma Redfern.</w:t>
       </w:r>
     </w:p>
     <w:p>
@@ -1470,7 +1470,7 @@
     </w:p>
     <w:p>
       <w:r>
-        <w:t>Le uscì limpida e sorpresa, una vera risata, di quelle che sfuggono a un bambino prima che decida se permetterselo o meno, e mi fece più bene di una settimana di sonno, perché c'era stato un lungo periodo, dopo la morte di sua madre, in cui Emma Redfern non rideva. La malattia di Sarah Redfern era durata quasi un anno e, in seguito, Emma aveva vagato in un paese che non sapeva come raggiungerla, un piccolo fantasma grigio di bambina. Aveva preso il cagnolino di Martha all'inizio di quel mese, l'aveva preso, nascosto e tenuto con sé, a causa di un dolore troppo grande per entrare in una bambina di otto anni. L'intero paese si era mobilitato per cercarle. Alla fine le avevo trovate entrambe, la bambina e il cane insieme in un vecchio capannone, e quel ritrovamento era stato l'inizio del ritorno di Emma a se stessa. Ora portava a spasso il cane tre pomeriggi alla settimana, un accordo che Martha si era inventato di sana pianta per dare a una bambina sola un motivo per alzarsi e qualcosa di caldo di cui essere responsabile, e aveva funzionato, di sguincio, senza che nessuno dicesse mai ad alta voce a cosa servisse.</w:t>
+        <w:t xml:space="preserve">Le uscì limpida e sorpresa, una vera risata, di quelle che sfuggono a un bambino prima che decida se permetterselo o meno, e mi fece più bene di una settimana di sonno, perché c'era stato un lungo periodo, dopo la morte di sua madre, in cui Emma Redfern non rideva. La malattia di Sarah Redfern era durata quasi un anno e, in seguito, Emma aveva vagato in un paese che non sapeva come raggiungerla, un piccolo fantasma grigio di bambina. Aveva preso il cagnolino di Martha all'inizio di quel mese, l'aveva preso, nascosto e tenuto con sé, a causa di un dolore troppo grande per entrare in una bambina di otto anni. L'intero paese si era mobilitato per cercarli. Alla fine li avevo trovati entrambi, la bambina e il cane insieme in un vecchio capannone, e quel ritrovamento era stato l'inizio del ritorno di Emma a se stessa. Ora portava a spasso il cane tre pomeriggi alla settimana, un accordo che Martha si era inventato di sana pianta per dare a una bambina sola un motivo per alzarsi e qualcosa di caldo di cui essere responsabile, e aveva funzionato, di sguincio, senza che nessuno dicesse mai ad alta voce a cosa servisse.</w:t>
       </w:r>
     </w:p>
     <w:p>
@@ -1490,7 +1490,7 @@
     </w:p>
     <w:p>
       <w:r>
-        <w:t>Questo mi valse un'altra risata, e dietro di essa arrivò Mark Redfern con un bracciolo carico di sedie pieghevoli. Quando le posò, si raddrizzò e si scostò i capelli dalla fronte, vidi quello che avevo sperato di vedere sul suo viso: la serenità. Era stato un uomo svuotato quando lo avevo conosciuto, che teneva in piedi se stesso e sua figlia con entrambe le mani e niente altro. Ora aveva un po' di colore dentro di sé. Guardò Emma che rideva del pinguino e le sue spalle, tese per un anno intero, si rilassarono.</w:t>
+        <w:t xml:space="preserve">Questo mi valse un'altra risata, e dietro di essa arrivò Mark Redfern con una bracciata di sedie pieghevoli. Quando le posò, si raddrizzò e si scostò i capelli dalla fronte, vidi quello che avevo sperato di vedere sul suo viso: la serenità. Era stato un uomo svuotato quando lo avevo conosciuto, che teneva in piedi se stesso e sua figlia con entrambe le mani e niente altro. Ora aveva un po' di colore dentro di sé. Guardò Emma che rideva del pinguino e le sue spalle, tese per un anno intero, si rilassarono.</w:t>
       </w:r>
     </w:p>
     <w:p>
@@ -1525,7 +1525,7 @@
     </w:p>
     <w:p>
       <w:r>
-        <w:t>«Meglio.» Lo disse con cautela, come un uomo che si avventura su un ghiaccio di cui non era ancora sicuro. «Stiamo meglio. Ora c'erano intere ore in cui dimenticavo, e poi mi ricordavo, e il ricordo non mi stendeva più al tappeto. Camminava solo al mio fianco per un po' e poi si placava di nuovo.» Posò l'estremità di una panca. «È stato il paese a fare questo. Continuo a cercare di capire come si fa a ringraziare un intero paese e non c'è modo di farlo. La gente continuava a presentarsi. Casseruole. Qualcuno prendeva Emma per un pomeriggio. Martha e quel cane. Tu e quel volatile ridicolo. Nessuno ha aggiustato niente. Nessuno poteva farlo. Continuavano semplicemente a presentarsi finché il presentarsi era tornato a essere una vita, e un giorno mi sono guardato intorno e la stavamo vivendo.»</w:t>
+        <w:t xml:space="preserve">«Meglio.» Lo disse con cautela, come un uomo che si avventura su un ghiaccio di cui non è ancora sicuro. «Stiamo meglio. Ora ci sono intere ore in cui dimentico, e poi mi ricordo, e il ricordo non mi stende più al tappeto. Cammina solo al mio fianco per un po' e poi si placa di nuovo.» Posò l'estremità di una panca. «È stato il paese a fare questo. Continuo a cercare di capire come si fa a ringraziare un intero paese e non c'è modo di farlo. La gente continuava a presentarsi. Casseruole. Qualcuno prendeva Emma per un pomeriggio. Martha e quel cane. Tu e quel volatile ridicolo. Nessuno ha aggiustato niente. Nessuno poteva farlo. Continuavano semplicemente a presentarsi finché il presentarsi era tornato a essere una vita, e un giorno mi sono guardato intorno e la stavamo vivendo.»</w:t>
       </w:r>
     </w:p>
     <w:p>
@@ -1540,12 +1540,12 @@
     </w:p>
     <w:p>
       <w:r>
-        <w:t>I guanti erano ancora nella mia borsa. Andai a cercare chiunque gestisse il comitato e trovai il capo della polizia. Noriko Tanaka se ne stava in mezzo al prato con un parka e un berretto di lana, con una tavoletta portablocco in una mano e una tazza termica nell'altra, a mandare la gente dove ce n'era bisogno. Era una donna tarchiata di circa cinquant'anni con dei capelli grigi alle tempie e un taccuino logoro che spuntava dalla tasca del cappotto. Olivia mi aveva detto che era tornata a casa dopo vent'anni con la polizia di stato per dirigere un dipartimento di sei persone, e che nessuno a Frost Falls l'aveva mai sentita alzare la voce.</w:t>
-      </w:r>
-    </w:p>
-    <w:p>
-      <w:r>
-        <w:t>«Signora Claus.» Prese i guanti, li contò e annotò il numero. «Banco dell'artigianato, fondo. Grazie. E le sue renne non sono in programma quest'anno.»</w:t>
+        <w:t xml:space="preserve">Le manopole erano ancora nella mia borsa. Andai a cercare chiunque gestisse il comitato e trovai il capo della polizia. Noriko Tanaka se ne stava in mezzo al prato con un parka e un berretto di lana, con una tavoletta portablocco in una mano e una tazza termica nell'altra, a mandare la gente dove ce n'era bisogno. Era una donna tarchiata di circa cinquant'anni con dei capelli grigi alle tempie e un taccuino logoro che spuntava dalla tasca del cappotto. Olivia mi aveva detto che era tornata a casa dopo vent'anni con la polizia di stato per dirigere un dipartimento di sei persone, e che nessuno a Frost Falls l'aveva mai sentita alzare la voce.</w:t>
+      </w:r>
+    </w:p>
+    <w:p>
+      <w:r>
+        <w:t xml:space="preserve">«Signora Claus.» Prese le manopole, le contò e annotò il numero. «Banco dell'artigianato, fondo. Grazie. E le sue renne non sono in programma quest'anno.»</w:t>
       </w:r>
     </w:p>
     <w:p>
@@ -1555,7 +1555,7 @@
     </w:p>
     <w:p>
       <w:r>
-        <w:t>«Dillo a Bram. La settimana scorsa gli ho scritto un avvertimento per Cometa su Maple Street, e lui mi ha ringraziato.» Un angolo della sua bocca si sollevò. «Nessuno mi ringrazia per un avvertimento.»</w:t>
+        <w:t xml:space="preserve">«Lo dica a Bram. La settimana scorsa gli ho scritto un avvertimento per Cometa su Maple Street, e lui mi ha ringraziato.» Un angolo della sua bocca si sollevò. «Nessuno mi ringrazia per un avvertimento.»</w:t>
       </w:r>
     </w:p>
     <w:p>
@@ -1575,7 +1575,7 @@
     </w:p>
     <w:p>
       <w:r>
-        <w:t>Mi avvicinai e guardai. Fuori dalla polpa d'arancia bagnata, nell'ultima settimana di ottobre, era spuntato un ramoscello di agrifoglio: tre foglie scure e lucide, dai bordi taglienti e inconfondibili, e tra di esse tre bacche rosse rotonde come gocce di sangue, che crescevano da una zucca di Halloween rovinata nell'ora trascorsa da quando Pip l'aveva aperta.</w:t>
+        <w:t xml:space="preserve">Mi avvicinai e guardai. Fuori dalla polpa arancione bagnata, nell'ultima settimana di ottobre, era spuntato un ramoscello di agrifoglio: tre foglie scure e lucide, dai bordi taglienti e inconfondibili, e tra di esse tre bacche rosse rotonde come gocce di sangue, che crescevano da una zucca di Halloween rovinata nell'ora trascorsa da quando Pip l'aveva aperta.</w:t>
       </w:r>
     </w:p>
     <w:p>
@@ -1666,7 +1666,7 @@
     </w:p>
     <w:p>
       <w:r>
-        <w:t>«Continuo a pensarci» disse, dopo un po', posando il cucchiaio. «Constance. Non lo facevo mai. Era solo un nome su una parete, un volto serio dentro una cornice. E ora è tutto ciò a cui penso. Quella ragazza, e quello che ha fatto, e quello che ha fatto a me cento anni dopo.» Fece una piccola risata infelice. «È divertente, vero. Ho passato tutta la mia vita a vivere nella sua casa e non ho mai cercato di conoscerla. Vieni a vedere. Voglio mostrarti una cosa.»</w:t>
+        <w:t xml:space="preserve">«Continuo a pensarci» disse, dopo un po', posando il cucchiaio. «Constance. Non lo facevo mai. Era solo un nome su una parete, un volto serio dentro una cornice. E ora è tutto ciò a cui penso. Quella ragazza, e quello che ha fatto, e quello che ha fatto a me cento anni dopo.» Fece una piccola risata infelice. «Strano, vero? Ho passato tutta la mia vita a vivere nella sua casa e non ho mai cercato di conoscerla. Vieni a vedere. Voglio mostrarti una cosa.»</w:t>
       </w:r>
     </w:p>
     <w:p>
@@ -1696,7 +1696,7 @@
     </w:p>
     <w:p>
       <w:r>
-        <w:t>«Sei più coraggiosa di quanto pensi» dissi infine. «Hai custodito il suo segreto da sola tutti questi anni e non hai mai permesso che ti facesse diventare fredda. La locanda è ancora calda, Fiona. Dopo cento anni, un baule chiuso a chiave e una lettera di ricatto, è ancora la casa più calda della città. Non è niente. È tutto ciò che lei ha costruito, tenuto in vita da te.»</w:t>
+        <w:t xml:space="preserve">«Sei più coraggiosa di quanto pensi» dissi infine. «Hai custodito il suo segreto da sola tutti questi anni e non hai mai permesso che ti facesse diventare fredda. La locanda è ancora calda, Fiona. Dopo cento anni, un baule chiuso a chiave e una lettera di ricatto, è ancora la casa più calda della città. Non è poco. È tutto ciò che lei ha costruito, tenuto in vita da te.»</w:t>
       </w:r>
     </w:p>
     <w:p>
@@ -1711,7 +1711,7 @@
     </w:p>
     <w:p>
       <w:r>
-        <w:t>Si asciugò gli occhi e rise, bagnata. «Ascoltaci. A piangere nell'atrio. Ho una festa da organizzare e quaranta sedie da contare.»</w:t>
+        <w:t xml:space="preserve">Si asciugò gli occhi e rise tra le lacrime. «Ascoltaci. A piangere nell'atrio. Ho una festa da organizzare e quaranta sedie da contare.»</w:t>
       </w:r>
     </w:p>
     <w:p>
@@ -1749,7 +1749,7 @@
     <w:p/>
     <w:p>
       <w:r>
-        <w:t>Sam Patel si trovava all'incudine. Teneva stretta tra le tenaglie una stella piatta di ferro, con una punta che brillava di un colore arancione al centro, e la lavorava con colpi brevi e regolari, girandola di qualche grado a ogni battito. Dapprima non mi vide, e io non ebbi fretta. Pip si diresse barcollando verso il bordo del cerchio tiepido emanato dal fuoco e lì si fermò, uccello saggio, mettendosi a sedere per osservare la luce arancione con la testa inclinata.</w:t>
+        <w:t xml:space="preserve">Sam Patel si trovava all'incudine. Teneva stretta tra le tenaglie una stella piatta di ferro, con una punta che brillava di un colore arancione al centro, e la lavorava con colpi brevi e regolari, girandola di qualche grado a ogni colpo. Dapprima non mi vide, e io non ebbi fretta. Pip si diresse barcollando verso il bordo del cerchio tiepido emanato dal fuoco e lì si fermò, uccello saggio, mettendosi a sedere per osservare la luce arancione con la testa inclinata.</w:t>
       </w:r>
     </w:p>
     <w:p/>
@@ -1779,19 +1779,19 @@
     <w:p/>
     <w:p>
       <w:r>
-        <w:t>E mentre lo ammiravo, inalai l'odore della fucina, ed eccolo lì, inconfondibile, l'esatto odore che impregnava un foglio di carta color avorio piegato nel mio cappotto. Era sulla nota, ed era lì. E mi costrinsi a procedere con calma, a tenere il carbone nella mano aperta senza chiudere il pugno, perché un odore non è una confessione. Sam Patel era stato, a detta di chiunque, assolutamente onesto con l'intero paese per dieci anni, ed ero venuta per osservare, non per emettere giudizi.</w:t>
-      </w:r>
-    </w:p>
-    <w:p/>
-    <w:p>
-      <w:r>
-        <w:t>«Ha fatto la locanda», dissi con disinvoltura, rigirando il portacandele. «Tutta quella ferratura nella hall di Fiona. Le stelle sul caminetto, le staffe delle lampade, il parasale».</w:t>
-      </w:r>
-    </w:p>
-    <w:p/>
-    <w:p>
-      <w:r>
-        <w:t>«Tutta quanta». La sua mascella si contrasse, e lui prese uno straccio iniziando a passarlo su un paio di tenaglie che erano già pulite. «Non che io abbia visto un centesimo per l'ultima parte». Non mi guardò. «Mi deve venti dollari. So che baccano fa. Un uomo adulto che fa storie per venti dollari, come un ragazzino a cui è dovuto l'assegno. Non è per i soldi».</w:t>
+        <w:t xml:space="preserve">E mentre lo ammiravo, inalai l'odore della fucina, ed eccolo lì, inconfondibile, l'esatto odore che impregnava un foglio di carta color crema piegato nel mio cappotto. Era sulla lettera, ed era lì. E mi costrinsi a procedere con calma, a tenere il carbone nella mano aperta senza chiudere il pugno, perché un odore non è una confessione. Sam Patel era stato, a detta di chiunque, assolutamente onesto con l'intero paese per dieci anni, ed ero venuta per osservare, non per emettere giudizi.</w:t>
+      </w:r>
+    </w:p>
+    <w:p/>
+    <w:p>
+      <w:r>
+        <w:t xml:space="preserve">«Ha fatto la locanda», dissi con disinvoltura, rigirando il portacandele. «Tutto quel ferro battuto nella hall di Fiona. Le stelle sul caminetto, le staffe delle lampade, il parafuoco».</w:t>
+      </w:r>
+    </w:p>
+    <w:p/>
+    <w:p>
+      <w:r>
+        <w:t xml:space="preserve">«Tutta quanta». La sua mascella si contrasse, e lui prese uno straccio iniziando a passarlo su un paio di tenaglie che erano già pulite. «Non che io abbia visto un centesimo per l'ultima parte». Non mi guardò. «Mi deve venti dollari. So come suona. Un uomo adulto che fa storie per venti dollari, come un ragazzino a cui devono la paghetta. Non è per i soldi».</w:t>
       </w:r>
     </w:p>
     <w:p/>
@@ -1809,7 +1809,7 @@
     <w:p/>
     <w:p>
       <w:r>
-        <w:t>Lo osservai mentre parlava. Ho trascorso una lunga vita imparando a distinguere gli uomini che sanno mostrare un sentimento da quelli che hanno una sola espressione, e Sam Patel, mentre mi parlava di venti dollari, era un uomo con una sola faccia, con tutto il suo dolore ben in superficie, là dove la luce del fuoco lo catturava. La sua rabbia era la rabbia di un amico, per lo più fatta di dolore, priva di quella fredda calcolusità tipica di un ricattatore.</w:t>
+        <w:t xml:space="preserve">Lo osservai mentre parlava. Ho trascorso una lunga vita imparando a distinguere gli uomini che sanno mostrare un sentimento da quelli che hanno una sola espressione, e Sam Patel, mentre mi parlava di venti dollari, era un uomo con una sola faccia, con tutto il suo dolore ben in superficie, là dove la luce del fuoco lo catturava. La sua rabbia era la rabbia di un amico, per lo più fatta di dolore, priva del freddo calcolo tipico di un ricattatore.</w:t>
       </w:r>
     </w:p>
     <w:p/>
@@ -1833,7 +1833,7 @@
     <w:p/>
     <w:p>
       <w:r>
-        <w:t>E questo, più di ogni altra cosa, dissolse il residuo dei miei sospetti, o quasi, perché un uomo dedito all'estorsione non se ne starebbe nella propria fucina con il cuore in mano a chiedere se la donna che sta dissanguando stia bene. Ma l'essere vicini alla verità non significa esserne sicuri, e mantenni la mia posizione, ponendo la domanda per cui ero venuta a metà sotto l'influsso di quell'odore.</w:t>
+        <w:t xml:space="preserve">E questo, più di ogni altra cosa, dissolse il residuo dei miei sospetti, o quasi, perché un uomo dedito all'estorsione non se ne starebbe nella propria fucina con il cuore in mano a chiedere se la donna che sta dissanguando stia bene. Ma l'essere vicini alla verità non significa esserne sicuri, e mantenni la mia posizione, ponendo la domanda per cui, oltre che per l'odore, ero venuta.</w:t>
       </w:r>
     </w:p>
     <w:p/>
@@ -1863,7 +1863,7 @@
     <w:p/>
     <w:p>
       <w:r>
-        <w:t>«Anche queste sono sue», disse, raccogliendone una e rigirandola controluce, e vi era amore nelle sue mani per quell'oggetto persino allora. «Le staffe per il portico. Le ultime dell'ordine. Ci ho messo molto di me in quella hall quest'anno, sa? Non si può attraversare la stanza d'ingresso di Fiona senza toccare qualcosa che ho fatto, o senza essergli vicini». Posò la stella. «Mi sta bene. A un fabbro piace lasciare un luogo che profuma del suo fuoco».</w:t>
+        <w:t xml:space="preserve">«Anche queste sono sue», disse, raccogliendone una e rigirandola controluce, e vi era amore nelle sue mani per quell'oggetto persino allora. «Le staffe per il portico. Le ultime dell'ordine. Ci ho messo molto di me in quella hall quest'anno, sa? Non si può attraversare la stanza d'ingresso di Fiona senza toccare qualcosa che ho fatto, o senza stargli vicino». Posò la stella. «Mi sta bene. A un fabbro piace lasciare un luogo che profuma del suo fuoco».</w:t>
       </w:r>
     </w:p>
     <w:p/>
@@ -1881,7 +1881,7 @@
     <w:p/>
     <w:p>
       <w:r>
-        <w:t>«Grazie, Sam», dissi, e lo pagai per il portacandele, intendendo quel ringraziamento per qualcosa che andava ben oltre l'oggetto. «Per il lavoro. E per esserti interessato a lei con tutto il cuore. Le dirò che l'hai fatto. Gentilmente».</w:t>
+        <w:t xml:space="preserve">«Grazie, Sam», dissi, e lo pagai per il portacandele, intendendo quel ringraziamento per qualcosa che andava ben oltre l'oggetto. «Per il lavoro. E per essersi interessato a lei con tutto il cuore. Le dirò che l'ha fatto. Gentilmente».</w:t>
       </w:r>
     </w:p>
     <w:p/>
@@ -1928,19 +1928,19 @@
     <w:p/>
     <w:p>
       <w:r>
-        <w:t>«Signora Claus! Venga a guardare questo, le piacerà.» Girò verso di me una pagina fragile del registro mentre mi avvicinavo. «Ottocentonovantuno. I Blackburn sborsarono metà dei soldi per la chiesa sulla piazza. Lo sapeva? Metà. Generosi, i vecchi, quando faceva comodo che si vedesse.» Scosse la testa con quella che sembrava un'ammirazione sincera. «Adoro una famiglia fondatrice. Tutta quell'ambizione spudorata e rapace nella prima generazione, che si inacidisce in rispettabilità entro la terza, e per la quarta si sono dimenticati di aver mai arraffato qualcosa. È la stessa storia in ogni cittadina in cui abbia mai messo piede.»</w:t>
-      </w:r>
-    </w:p>
-    <w:p/>
-    <w:p>
-      <w:r>
-        <w:t>«È molto interessata ai Blackburn» dissi, tirando fuori la sedia di fronte a lui e sedendomi.</w:t>
-      </w:r>
-    </w:p>
-    <w:p/>
-    <w:p>
-      <w:r>
-        <w:t>«Sono pagato per esserlo.» Lo disse con allegria, il che mi bloccò, perché mi ero preparata a una mossa evasiva. «Ricerche successorie. Questo è il mio mestiere, signora Claus. Quando l'ultimo di una stirpe di vecchi ricchi muore, si lascia dietro una matassa intricata, un groviglio di chi possedeva cosa, a chi si doveva cosa, dove sia finita qualche cosa di valore, e qualcuno deve sedersi nelle biblioteche a districare quel groviglio, e quel qualcuno sono io.» Allargò le mani sopra le scatole. «Proprio adesso sto districando un groviglio dei Blackburn. C'era un gioiello in famiglia, un tempo. Una spilla. Una di quelle vere. Uno zaffiro al centro, lavorazione in oro tutt'intorno, un pezzo autentico, che valeva moltissimo allora e una piccola fortuna adesso.» Prese la lente d'ingrandimento e la posò di nuovo, e da sotto il tavolo Pip fissò con un occhio il bordo d'ottone. «E sparì di netto dai registri della famiglia intorno al dicianquettentaquattro. Smette semplicemente di essere menzionata. E gli avvocati della famiglia vorrebbero molto sapere dove sia finita, perché c'è un'eredità che non può essere chiusa correttamente finché qualcuno non riesce a mettere per iscritto che fine abbia fatto quella spilla.»</w:t>
+        <w:t xml:space="preserve">«Signora Claus! Venga a guardare questo, le piacerà.» Girò verso di me una pagina fragile del registro mentre mi avvicinavo. «Ottocentonovantuno. I Blackburn sborsarono metà dei soldi per la chiesa sul prato. Lo sapeva? Metà. Generosi, i vecchi, quando faceva comodo che si vedesse.» Scosse la testa con quella che sembrava un'ammirazione sincera. «Adoro una famiglia fondatrice. Tutta quell'ambizione spudorata e rapace nella prima generazione, che si inacidisce in rispettabilità entro la terza, e per la quarta si sono dimenticati di aver mai arraffato qualcosa. È la stessa storia in ogni cittadina in cui abbia mai messo piede.»</w:t>
+      </w:r>
+    </w:p>
+    <w:p/>
+    <w:p>
+      <w:r>
+        <w:t xml:space="preserve">«È molto interessato ai Blackburn» dissi, tirando fuori la sedia di fronte a lui e sedendomi.</w:t>
+      </w:r>
+    </w:p>
+    <w:p/>
+    <w:p>
+      <w:r>
+        <w:t xml:space="preserve">«Sono pagato per esserlo.» Lo disse con allegria, il che mi bloccò, perché mi ero preparata a una mossa evasiva. «Ricerche successorie. Questo è il mio mestiere, signora Claus. Quando l'ultimo di una stirpe di vecchi ricchi muore, si lascia dietro una matassa intricata, un groviglio di chi possedeva cosa, a chi si doveva cosa, dove sia finita qualche cosa di valore, e qualcuno deve sedersi nelle biblioteche a districare quel groviglio, e quel qualcuno sono io.» Allargò le mani sopra le scatole. «Proprio adesso sto districando un groviglio dei Blackburn. C'era un gioiello in famiglia, un tempo. Una spilla. Una di quelle vere. Uno zaffiro al centro, lavorazione in oro tutt'intorno, un pezzo autentico, che valeva moltissimo allora e una piccola fortuna adesso.» Prese la lente d'ingrandimento e la posò di nuovo, e da sotto il tavolo Pip fissò con un occhio il bordo d'ottone. «E sparì di netto dai registri della famiglia intorno al millenovecentoventiquattro. Smette semplicemente di essere menzionata. E gli avvocati della famiglia vorrebbero molto sapere dove sia finita, perché c'è un'eredità che non può essere chiusa correttamente finché qualcuno non riesce a mettere per iscritto che fine abbia fatto quella spilla.»</w:t>
       </w:r>
     </w:p>
     <w:p/>
@@ -1958,7 +1958,7 @@
     <w:p/>
     <w:p>
       <w:r>
-        <w:t>«Non ancora la fine. Ci siamo vicini, però.» Diede un debole colpo sul fianco di una scatola. «So che lasciò la casa dei Blackburn nell'inverno del ventiquattro. So che non uscì da nessuna delle porte giuste. Nessuna vendita registrata, nessun dono, nessun lascito, niente di messo per iscritto, il che nella mia esperienza significa che uscì dalla porta sbagliata. Furto, quasi certamente, anche se è tardi di cento anni per fare qualcosa al riguardo.» Si appoggiò allo schienale. «Dopo che lascia la casa, la pista si fa fredda qui e calda di nuovo, flebile, due paesi più in là. Un banchino dei pegni a Ridgeline. Tenevano registri pessimi, quei vecchi negozi, ma qualcosina la conservavano, ed è sopravvissuto il giornale di cassa di un commesso; sto cercando di far coincidere una data con l'inverno in cui la spilla sparì. Allora avrò l'intero arco della faccenda, dalla casa al banco dei pegni, e potrò scrivere la mia riga, chiudere il mio fascicolo e tornarmene a casa.»</w:t>
+        <w:t xml:space="preserve">«Non ancora la fine. Ci siamo vicini, però.» Diede un debole colpo sul fianco di una scatola. «So che lasciò la casa dei Blackburn nell'inverno del ventiquattro. So che non uscì da nessuna delle porte giuste. Nessuna vendita registrata, nessun dono, nessun lascito, niente di messo per iscritto, il che nella mia esperienza significa che uscì dalla porta sbagliata. Furto, quasi certamente, anche se è tardi di cento anni per fare qualcosa al riguardo.» Si appoggiò allo schienale. «Dopo che lascia la casa, la pista si fa fredda qui e calda di nuovo, flebile, due paesi più in là. Un banco dei pegni a Ridgeline. Tenevano registri pessimi, quei vecchi negozi, ma qualcosina la conservavano, ed è sopravvissuto il giornale di cassa di un commesso; sto cercando di far coincidere una data con l'inverno in cui la spilla sparì. Allora avrò l'intero arco della faccenda, dalla casa al banco dei pegni, e potrò scrivere la mia riga, chiudere il mio fascicolo e tornarmene a casa.»</w:t>
       </w:r>
     </w:p>
     <w:p/>
@@ -1994,7 +1994,7 @@
     <w:p/>
     <w:p>
       <w:r>
-        <w:t>Chiunque avesse scritto quella nota lavorava nell'oscurità. Il suo intero potere, ogni singolo grammo, derivava dal non essere visto. Aveva scritto con una calligrafia che non era la sua. Aveva detto a una donna di appendere un nastro rosso alla sua ghirlanda in modo che non dovesse mai mostrare la faccia per riscuotere. E qui, attraverso il tavolo di una biblioteca nella stanza più luminosa della città, c'era Neil Carter, che distribuiva biglietti da visita come un candidato in campagna elettorale, dicendo alla bibliotecaria, al sindaco, alla signora Claus e a chiunque volesse ascoltare che stava dando la caccia a una spilla dei Blackburn che aveva lasciato la città dalla porta sbagliata nel 1924.</w:t>
+        <w:t xml:space="preserve">Chiunque avesse scritto quel biglietto lavorava nell'oscurità. Il suo intero potere, ogni singolo grammo, derivava dal non essere visto. Aveva scritto con una calligrafia che non era la sua. Aveva detto a una donna di appendere un nastro rosso alla sua ghirlanda in modo che non dovesse mai mostrare la faccia per riscuotere. E qui, attraverso il tavolo di una biblioteca nella stanza più luminosa della città, c'era Neil Carter, che distribuiva biglietti da visita come un candidato in campagna elettorale, dicendo alla bibliotecaria, al sindaco, alla signora Claus e a chiunque volesse ascoltare che stava dando la caccia a una spilla dei Blackburn che aveva lasciato la città dalla porta sbagliata nel 1924.</w:t>
       </w:r>
     </w:p>
     <w:p/>
@@ -2036,7 +2036,7 @@
     <w:p/>
     <w:p>
       <w:r>
-        <w:t>Ero andata in biblioteca per leggere dei Blackburn e avevo trovato invece un uomo così rumoroso e così spudoratamente curioso riguardo alla spilla che si era quasi scagionato grazie alla pura vastità del suo appetito per essa. Quasi. Non ero pronta ad accantonare la sua posizione. Ma più passavo il tempo seduta con lui, meno Neil Carter sembrava un uomo che lavorava nell'oscurità.</w:t>
+        <w:t xml:space="preserve">Ero andata in biblioteca per leggere dei Blackburn e avevo trovato invece un uomo così rumoroso e così spudoratamente curioso riguardo alla spilla che si era quasi scagionato grazie alla pura vastità del suo appetito per essa. Quasi. Non ero pronta a scagionarlo del tutto. Ma più passavo il tempo seduta con lui, meno Neil Carter sembrava un uomo che lavorava nell'oscurità.</w:t>
       </w:r>
     </w:p>
     <w:p/>
@@ -2058,12 +2058,12 @@
     </w:p>
     <w:p>
       <w:r>
-        <w:t>«Signora Claus!» Bram sbucò di trotto da dietro l'angolo del cottage, strizzandosi il berretto tra le mani. Bram era l'elfo che era venuto a sud con noi, il caporeparto dell'officina trasferita, devoto, apprensivo e fatto più o meno con la corporatura di una patata preoccupata, ed era al colmo dell'ansia. «È Fulmine. Si è liberata di nuovo. È la terza volta questa settimana, signora Claus, la terza. E giuro su ogni singolo bottone che possiedo che quel paletto era abbassato quando sono uscito, abbassato e provato, e adesso eccola qui che si mangia i cavoli buoni e non c'è verso di muoverla, e non mi piace per niente la piega che sta prendendo la cosa, glielo dico io.»</w:t>
-      </w:r>
-    </w:p>
-    <w:p>
-      <w:r>
-        <w:t>«Buon pomeriggio anche a te, Bram» dissi, posando il cestino dentro la porta della cucina. Fuori in giardino, Fulmine sollevò la grande testa dall'orto dei cavoli, mi guardò con blando interesse e tornò a concentrarsi sui cavoli. «Bene. Perché non ti piace la piega che sta prendendo?»</w:t>
+        <w:t xml:space="preserve">«Signora Claus!» Bram sbucò di trotto da dietro l'angolo del cottage, strizzandosi il berretto tra le mani. Bram era l'elfo che era venuto a sud con noi, il caporeparto dell'officina trasferita, devoto, apprensivo e fatto più o meno con la corporatura di una patata preoccupata, ed era al colmo dell'ansia. «È Ballerina. Si è liberata di nuovo. È la terza volta questa settimana, signora Claus, la terza. E giuro su ogni singolo bottone che possiedo che quel paletto era abbassato quando sono uscito, abbassato e provato, e adesso eccola qui che si mangia i cavoli buoni e non c'è verso di muoverla, e non mi piace per niente la piega che sta prendendo la cosa, glielo dico io.»</w:t>
+      </w:r>
+    </w:p>
+    <w:p>
+      <w:r>
+        <w:t xml:space="preserve">«Buon pomeriggio anche a te, Bram» dissi, posando il cestino dentro la porta della cucina. Fuori in giardino, Ballerina sollevò la grande testa dall'orto dei cavoli, mi guardò con blando interesse e tornò a concentrarsi sui cavoli. «Bene. Perché non ti piace la piega che sta prendendo?»</w:t>
       </w:r>
     </w:p>
     <w:p>
@@ -2073,7 +2073,7 @@
     </w:p>
     <w:p>
       <w:r>
-        <w:t>Aveva ragione, naturalmente, anche se non glielo dissi. Uscii nel giardino freddo e appoggiai la mano aperta sulla spalla calda di Fulmine. Lei si lasciò fare, appoggiandosi appena al mio palmo. Non si sarebbe fatta smuovere di un solo centimetro da Bram, ma io la condussi dall'altra parte della stradina, verso il recinto, senza la minima difficoltà. Il cancello era aperto e normale. La guidai all'interno e abbassai il paletto. Rimanemmo tutti e tre a guardare la chiusura. Rimase chiusa. Fulmine allungò il muso oltre il traverso superiore e soffiò un lungo sospiro caldo verso Bram e me.</w:t>
+        <w:t xml:space="preserve">Aveva ragione, naturalmente, anche se non glielo dissi. Uscii nel giardino freddo e appoggiai la mano aperta sulla spalla calda di Ballerina. Lei si lasciò fare, appoggiandosi appena al mio palmo. Non si sarebbe fatta smuovere di un solo centimetro da Bram, ma io la condussi dall'altra parte della stradina, verso il recinto, senza la minima difficoltà. Il cancello era aperto e normale. La guidai all'interno e abbassai il paletto. Rimanemmo tutti e tre a guardare la chiusura. Rimase chiusa. Ballerina allungò il muso oltre il traverso superiore e soffiò un lungo sospiro caldo verso Bram e me.</w:t>
       </w:r>
     </w:p>
     <w:p>
@@ -2088,7 +2088,7 @@
     </w:p>
     <w:p>
       <w:r>
-        <w:t>«In officina. Dove sennò.» Bram tirò col naso, di nuovo offeso nell'orgoglio. «Non mi fa entrare. Non fa entrare Fenn. Costruisce chissà cosa dietro una porta chiusa a chiave a tutte le ore e canticchia tra sé. Faccio il caporeparto in quell'officina da duecento anni, signora Claus, duecento, e adesso vengo tenuto fuori da metà stanza come un estraneo venuto a leggere il contatore.» Si riscosse e aggiunse in fretta: «Non che io sia curioso. Non mi impiccierei mai. È solo che un'officina ha bisogno di un caporeparto che sappia cosa c'è dentro, tutto qui, è una questione di dignità professionale».</w:t>
+        <w:t xml:space="preserve">«In officina. Dove sennò.» Bram tirò col naso, di nuovo offeso nell'orgoglio. «Non mi fa entrare. Non fa entrare Fenn. Costruisce chissà cosa dietro una porta chiusa a chiave a tutte le ore e canticchia tra sé. Faccio il caporeparto in quell'officina da duecento anni, signora Claus, duecento, e adesso vengo tenuto fuori da metà stanza come un estraneo venuto a leggere il contatore.» Si riscosse e aggiunse in fretta: «Non che io sia curioso. Non mi impiccerei mai. È solo che un'officina ha bisogno di un caporeparto che sappia cosa c'è dentro, tutto qui, è una questione di dignità professionale».</w:t>
       </w:r>
     </w:p>
     <w:p>
@@ -2098,7 +2098,7 @@
     </w:p>
     <w:p>
       <w:r>
-        <w:t>L'officina brillava attraverso gli interstizi. Quella fu la prima cosa, e mi fermò sul sentiero. Ogni crepa attorno alla porta chiusa a chiave, ogni fessura nelle vecchie pareti di assi, lasciava filtrare una calda luce dorata, lo stesso oro che i lampioni della festa stavano assumendo, e quando poggiai il palmo della mano contro la porta, il legno era caldo come una pagnotta appena sfornata. Da dentro arrivava il borbottio basso e stonato di Nick e, sotto quel mormorio, un suono a cui non sapevo dare un nome. Un suono simile a un fuoco che si assesta per la notte. Un suono simile a qualcosa di grande che respirava lentamente nel sonno.</w:t>
+        <w:t xml:space="preserve">L'officina brillava attraverso gli interstizi. Quella fu la prima cosa, e mi fermò sul sentiero. Ogni crepa attorno alla porta chiusa a chiave, ogni fessura nelle vecchie pareti di assi, lasciava filtrare una calda luce dorata, lo stesso oro che le luci della festa stavano assumendo, e quando poggiai il palmo della mano contro la porta, il legno era caldo come una pagnotta appena sfornata. Da dentro arrivava il borbottio basso e stonato di Nick e, sotto quel mormorio, un suono a cui non sapevo dare un nome. Un suono simile a un fuoco che si assesta per la notte. Un suono simile a qualcosa di grande che respirava lentamente nel sonno.</w:t>
       </w:r>
     </w:p>
     <w:p>
@@ -2168,7 +2168,7 @@
     </w:p>
     <w:p>
       <w:r>
-        <w:t>Lei accettò la cosa come nient'altro che il suo logico compenso, poi guardò con insistenza la credenza in cui tenevano le sardine e ne ottenne una.</w:t>
+        <w:t xml:space="preserve">Lei accettò la cosa come nient'altro che il suo logico compenso, poi guardò con insistenza la credenza in cui tenevamo le sardine e ne ottenne una.</w:t>
       </w:r>
     </w:p>
     <w:p>
@@ -2184,7 +2184,7 @@
     <w:p/>
     <w:p>
       <w:r>
-        <w:t>Il municipio era un edificio in mattoni pretenziosi in fondo alla piazza, con una torre dell'orologio che andava avanti di quattro minuti da che memoria d'uomo esisteva. Ci andai di lunedì con Pip, per due commissioni, una reale e l'altra un po' meno. La commissione reale consisteva nell'aggiungere il nome del circolo alla lista dei collaboratori del festival e nel chiedere, a nome di nessuno se non della cittadinanza, se Frost Falls potesse trovare un po' di denaro per la Società Storica prima che il tetto venisse giù del tutto. La commissione meno reale consisteva nell'osservare, per bene e da vicino, Vera Reed.</w:t>
+        <w:t xml:space="preserve">Il municipio era un pretenzioso edificio in mattoni in cima al prato, con una torre dell'orologio che andava avanti di quattro minuti da che memoria d'uomo esisteva. Ci andai di lunedì con Pip, per due commissioni, una reale e l'altra un po' meno. La commissione reale consisteva nell'aggiungere il nome del circolo alla lista dei collaboratori del festival e nel chiedere, a nome di nessuno se non della cittadinanza, se Frost Falls potesse trovare un po' di denaro per la Società Storica prima che il tetto venisse giù del tutto. La commissione meno reale consisteva nell'osservare, per bene e da vicino, Vera Reed.</w:t>
       </w:r>
     </w:p>
     <w:p>
@@ -2219,7 +2219,7 @@
     </w:p>
     <w:p>
       <w:r>
-        <w:t>«È una nobile causa,» disse, quando ebbi finito. «Theo fa un ottimo lavoro, a modo suo. Ma il bilancio del paese è il bilancio del paese, signora Claus, e la storia, mi perdonerà se glielo dico, non spala le strade a febbraio né tiene accesi i lampioni. La Società si è sempre retta sulle proprie gambe. Sono sicura che troveranno il modo, lo hanno sempre fatto.» Sbozzò un sorriso, il sorriso di un uomo che aveva deciso di essere stato generoso solo ad ascoltare. «Forse il vostro festival si rivelerà una bella e piccola raccolta fondi per loro. La gente diventa sentimentale in questo periodo dell'anno.»</w:t>
+        <w:t xml:space="preserve">«È una nobile causa,» disse, quando ebbi finito. «Theo fa un ottimo lavoro, a modo suo. Ma il bilancio del paese è il bilancio del paese, signora Claus, e la storia, mi perdonerà se glielo dico, non spala le strade a febbraio né tiene accesi i lampioni. La Società si è sempre retta sulle proprie gambe. Sono sicuro che troveranno il modo, lo hanno sempre fatto.» Sfoderò un sorriso, il sorriso di un uomo che aveva deciso di essere stato generoso solo ad ascoltare. «Forse il vostro festival si rivelerà una bella e piccola raccolta fondi per loro. La gente diventa sentimentale in questo periodo dell'anno.»</w:t>
       </w:r>
     </w:p>
     <w:p>
@@ -2263,7 +2263,7 @@
     </w:p>
     <w:p>
       <w:r>
-        <w:t>«Chiedo solo perché un'amica si è chiesta di recente qualcosa sulle vecchie famiglie. I Blackburn. Da dove provengono i primi soldi, i giorni della fondazione. Le ho detto che lei saprebbe meglio di chiunque altro dove persino cercare una cosa del genere.»</w:t>
+        <w:t xml:space="preserve">«Chiedo solo perché un'amica si è chiesta di recente qualcosa sulle vecchie famiglie. I Blackburn. Da dove provengono i primi soldi, i giorni della fondazione. Le ho detto che tu sapresti meglio di chiunque altro dove persino cercare una cosa del genere.»</w:t>
       </w:r>
     </w:p>
     <w:p>
@@ -2283,7 +2283,7 @@
     </w:p>
     <w:p>
       <w:r>
-        <w:t>Non insistei. Insistere le avrebbe solo fatto capire che me n'ero accorta. Invece addolciti ogni mio modo di fare.</w:t>
+        <w:t xml:space="preserve">Non insistei. Insistere le avrebbe solo fatto capire che me n'ero accorta. Invece addolcii ogni mio modo di fare.</w:t>
       </w:r>
     </w:p>
     <w:p>
@@ -2293,7 +2293,7 @@
     </w:p>
     <w:p>
       <w:r>
-        <w:t>La gentilezza la raggiunse laddove la domanda aveva fallito. Le spalle le scesero di una frazione, e il suo viso vacillò come sul punto di cedere prima di riprendersi. «È la stagione,» disse. «E il sindaco paga uno stipendio comunale per una mole di lavoro da grande città, e alla fine del mese non bastano mai. Non per chiunque quest'anno. Le bollette non si pagano da sole.» Emise una piccola risata logora che non conteneva alcuna allegria. «Le bollette di nessuno si pagano da sole quest'anno, vero, signora Claus.»</w:t>
+        <w:t xml:space="preserve">La gentilezza la raggiunse laddove la domanda aveva fallito. Le spalle le scesero di una frazione, e il suo viso vacillò come sul punto di cedere prima di riprendersi. «È la stagione,» disse. «E il sindaco paga uno stipendio comunale per una mole di lavoro da grande città, e alla fine del mese non bastano mai. Non per nessuno quest'anno. Le bollette non si pagano da sole.» Emise una piccola risata logora che non conteneva alcuna allegria. «Le bollette di nessuno si pagano da sole quest'anno, vero, signora Claus.»</w:t>
       </w:r>
     </w:p>
     <w:p>
@@ -2313,7 +2313,7 @@
     </w:p>
     <w:p>
       <w:r>
-        <w:t>Non sapevo cosa significasse. Poteva non significare altro che una donna stanca a cui non importava ricevere domande ficcanaso in una lunga giornata. Ma la mia supplica per la Società era fallita, esattamente come Dot aveva predetto che avrebbe fatto, e la Società stava ancora sprofondando nell'oscurità. E ora c'erano due persone a Frost Falls di cui non potevo sentire il nome Blackburn senza pensarci. Una di loro gestiva l'archivio dove le lettere erano sparite.</w:t>
+        <w:t xml:space="preserve">Non sapevo cosa significasse. Poteva non significare altro che una donna stanca a cui non piacevano le domande ficcanaso in una lunga giornata. Ma la mia supplica per la Società era fallita, esattamente come Dot aveva predetto che avrebbe fatto, e la Società stava ancora sprofondando nell'oscurità. E ora c'erano due persone a Frost Falls a cui non potevo fare a meno di pensare sentendo il nome Blackburn. Una di loro gestiva l'archivio dove le lettere erano sparite.</w:t>
       </w:r>
     </w:p>
     <w:p>
@@ -2329,7 +2329,7 @@
     <w:p/>
     <w:p>
       <w:r>
-        <w:t>Il consiglio d'amministrazione della Società Storica si riunì quel lunedì sera nella fredda stanzetta sul retro, sotto un tetto che faceva acqua. Claire mi chiese di accompagnarla, in parte perché la gazzetta voleva un volto amico in quella stanza e in parte, lo sospettavo, perché aveva intuito più di quanto lasciasse a intendere riguardo a ciò che avevo con me, e voleva che vedessi con i miei occhi quanto fosse grave la situazione.</w:t>
+        <w:t xml:space="preserve">Il consiglio d'amministrazione della Società Storica si riunì quel lunedì sera nella fredda stanzetta sul retro, sotto un tetto che faceva acqua. Claire mi chiese di accompagnarla, in parte perché la Gazette voleva un volto amico in quella stanza e in parte, lo sospettavo, perché aveva intuito più di quanto lasciasse a intendere riguardo al peso che mi portavo dentro, e voleva che vedessi con i miei occhi quanto fosse grave la situazione.</w:t>
       </w:r>
     </w:p>
     <w:p/>
@@ -2383,19 +2383,19 @@
     <w:p/>
     <w:p>
       <w:r>
-        <w:t>Sarebbe stato molto più semplice se Theo fosse stato un malvagio, qualcuno che avrei potuto disprezzare senza rimorsi. Ma me ne stavo seduta in quella stanza gelida a comprendere fino in fondo come Theo Hussein, assistendo a tutto ciò, ascoltando quelle cose, potesse aprire una cartella di vecchie lettere, vederci dentro non un crimine vecchio di un secolo bensì un'ancora di salvezza, e allungare la mano, ripetendosi per tutto il tempo che lo stava facendo per la Società. Non lo giustificavo. Ma lo capivo, e mi portai dietro quel peso freddo per il resto della riunione.</w:t>
-      </w:r>
-    </w:p>
-    <w:p/>
-    <w:p>
-      <w:r>
-        <w:t>Anche Vera era lì, in un angolo, a redigere il verbale. L'ufficio del sindaco mandava sempre qualcuno a registrare le riunioni degli enti che finanziava, e quel qualcuno era Vera, con il suo blocchetto per stenografia e il cardigan abbottonato, che annotava tutto con la sua grafia ordinata e rapida. Osservai anche lei, quando potevo farlo senza dare nell'occhio. Trscrisse le cifre senza scomporsi. Ma quando Theo pronunciò quella frase sul fare la vittima, sulla lettera gentile che diceva di no, la sua penna si fermò per un istante. La sua mascella si contrasse. Sollevò lo sguardo verso l'alone marrone sul soffitto, e ciò che le passò sul viso fu qualcosa di molto simile al dolore, o alla paura, o a entrambi insieme. Non riuscivo a immaginare di cosa potesse rattristarsi o aver paura una donna in una riunione del consiglio in cui era presente solo per trascrivere i verbali.</w:t>
-      </w:r>
-    </w:p>
-    <w:p/>
-    <w:p>
-      <w:r>
-        <w:t>Il consiglio si avvitò in discussioni inconcludenti per un'ora, proponendo mercatini di beneficenza e una campagna di lettere, ciascuna idea infinitamente più piccola del buco che avrebbe dovuto tappare. L'intera stanza lo sapeva e ciononostante continuava a pronunciare quelle piccole frasi di speranza, perché non dire nulla sarebbe stato peggio. Alla fine votarono per mantenere le porte aperte oltre il nuovo anno e per «esplorare tutte le opzioni». Si sciolsero nel freddo. Il bollitore sibilò e si spense, e Theo rimase indietro a riordinare da solo le sedie pieghevoli.</w:t>
+        <w:t xml:space="preserve">Sarebbe stato molto più semplice se Theo fosse stato un malvagio, qualcuno che avrei potuto disprezzare senza rimorsi. Ma me ne stavo seduta in quella stanza gelida a comprendere fino in fondo come Theo Hussein, assistendo a tutto ciò, ascoltando quelle cose, potesse aprire una cartella di vecchie lettere, vederci dentro non un crimine vecchio di un secolo bensì un'ancora di salvezza, e allungare la mano, ripetendosi per tutto il tempo che lo stava facendo per la Società. Non lo perdonavo. Ma lo capivo, e mi portai dietro quel peso freddo per il resto della riunione.</w:t>
+      </w:r>
+    </w:p>
+    <w:p/>
+    <w:p>
+      <w:r>
+        <w:t xml:space="preserve">Anche Vera era lì, in un angolo, a redigere il verbale. L'ufficio del sindaco mandava sempre qualcuno a registrare le riunioni degli enti che finanziava, e quel qualcuno era Vera, con il suo blocchetto per stenografia e il cardigan abbottonato, che annotava tutto con la sua grafia ordinata e rapida. Osservai anche lei, quando potevo farlo senza dare nell'occhio. Trascrisse le cifre senza scomporsi. Ma quando Theo pronunciò quella frase sul fare la vittima, sulla lettera gentile che diceva di no, la sua penna si fermò per un istante. La sua mascella si contrasse. Sollevò lo sguardo verso l'alone marrone sul soffitto, e ciò che le passò sul viso fu qualcosa di molto simile al dolore, o alla paura, o a entrambi insieme. Non riuscivo a immaginare di cosa potesse rattristarsi o aver paura una donna in una riunione del consiglio in cui era presente solo per trascrivere i verbali.</w:t>
+      </w:r>
+    </w:p>
+    <w:p/>
+    <w:p>
+      <w:r>
+        <w:t xml:space="preserve">Il consiglio si avvitò in discussioni inconcludenti per un'ora, proponendo mercatini di beneficenza e una campagna di lettere, ciascuna idea infinitamente più piccola del buco che avrebbe dovuto tappare. L'intera stanza lo sapeva e ciononostante continuava a pronunciare quelle piccole frasi di speranza, perché non dire nulla sarebbe stato peggio. Alla fine votarono per mantenere le porte aperte fino al nuovo anno e per «esplorare tutte le opzioni». Si sciolsero nel freddo. Il bollitore sibilò e si spense, e Theo rimase indietro a riordinare da solo le sedie pieghevoli.</w:t>
       </w:r>
     </w:p>
     <w:p/>
@@ -2429,12 +2429,12 @@
     </w:p>
     <w:p>
       <w:r>
-        <w:t>«Signora Claus! E Pip!» Fece il giro del bancone e s'accovacciò per salutare il pinguino, che la tollerò con l'aria di un reale in visita. «Non avrei mai pensato di dirlo, ma un pinguino è esattamente il socio che mi mancava. Fatto per il freddo. Nuotatore nato. Continuano a dirmi che dovrei far installare una piscina, e io continuo a ripetere che non ho abbastanza spazio, ma per Pip lo spazio lo troverei.»</w:t>
-      </w:r>
-    </w:p>
-    <w:p>
-      <w:r>
-        <w:t>«Se ne aprirebbe una tutta sua nel giro di una settimana» dissi. «Non riusciresti più a nuotare da solo in una corsia.»</w:t>
+        <w:t xml:space="preserve">«Signora Claus! E Pip!» Fece il giro del bancone e s'accovacciò per salutare il pinguino, che tollerò la cosa con l'aria di un reale in visita. «Non avrei mai pensato di dirlo, ma un pinguino è esattamente il socio che mi mancava. Fatto per il freddo. Nuotatore nato. Continuano a dirmi che dovrei far installare una piscina, e io continuo a ripetere che non ho abbastanza spazio, ma per Pip lo spazio lo troverei.»</w:t>
+      </w:r>
+    </w:p>
+    <w:p>
+      <w:r>
+        <w:t xml:space="preserve">«Se ne impadronirebbe nel giro di una settimana» dissi. «Non riusciresti più a nuotare da solo in una corsia.»</w:t>
       </w:r>
     </w:p>
     <w:p>
@@ -2498,7 +2498,7 @@
     </w:p>
     <w:p>
       <w:r>
-        <w:t>«A guardarle?» Rise, colto di sorpresa. «Signora Claus, stavo trasportando teche da esposizione due alla volta cercando di non piantare un piede dentro una sedia vecchia di cent'anni. Non ho letto una sola parola. Non avrei saputo distinguere un Blackburn da una mora selvatica. Theo mi porgeva una scatola e mi diceva fai attenzione, bada bene, questa è preziosa, e io portavo la scatola preziosa dove mi indicava per poi tornare subito a prenderne un'altra.» Scosse la testa, sorridendo al ricordo. «Alla fine della settimana ero così distrutto che avrei firmato qualsiasi cosa pur di avere il permesso di sedermi. Quella è stata tutta la mia carriera da storico.»</w:t>
+        <w:t xml:space="preserve">«A guardarle?» Rise, colto di sorpresa. «Signora Claus, stavo trasportando teche da esposizione due alla volta cercando di non sfondare con un piede una sedia vecchia di cent'anni. Non ho letto una sola parola. Non avrei saputo distinguere un Blackburn da una mora selvatica. Theo mi porgeva una scatola e mi diceva fai attenzione, bada bene, questa è preziosa, e io portavo la scatola preziosa dove mi indicava per poi tornare subito a prenderne un'altra.» Scosse la testa, sorridendo al ricordo. «Alla fine della settimana ero così distrutto che avrei firmato qualsiasi cosa pur di avere il permesso di sedermi. Quella è stata tutta la mia carriera da storico.»</w:t>
       </w:r>
     </w:p>
     <w:p>
@@ -2523,7 +2523,7 @@
     </w:p>
     <w:p>
       <w:r>
-        <w:t>Lo lasciai alla sua splendida palestra e alla sua porta transennata di plastica. Pip ed io uscimmo nel freddo. Da qualche parte tra la porta e l'angolo della strada cancellai Jamal Washington dalla lista nella mia mente, dolcemente, come si depone un oggetto che si è felici di non dover più reggere. Tre lavori e nessun segreto dentro di sé. Problemi di denaro affrontati a viso aperto alla luce del sole, dove chiunque poteva vederli.</w:t>
+        <w:t xml:space="preserve">Lo lasciai alla sua scintillante palestra e alla sua porta transennata di plastica. Pip ed io uscimmo nel freddo. Da qualche parte tra la porta e l'angolo della strada cancellai Jamal Washington dalla lista nella mia mente, dolcemente, come si depone un oggetto che si è felici di non dover più reggere. Tre lavori e nessun segreto dentro di sé. Problemi di denaro affrontati a viso aperto alla luce del sole, dove chiunque poteva vederli.</w:t>
       </w:r>
     </w:p>
     <w:p>
@@ -2568,7 +2568,7 @@
         <w:t>&lt;/bt&gt;</w:t>
       </w:r>
       <w:r>
-        <w:t>, un oggettino per turisti con dentro una piccola Frost Falls di ceramica, il verde del parco cittadino e tutto il resto. Quella mattina, quando passai per i panini alla cannella di Nick, la neve all'interno non voleva saperne di posarsi. Turbineggiava e turbinava senza che nessuna mano la toccasse, una minuscola tormenta che girava e rigirava dietro il vetro. Greta aveva drappeggiato un canovaccio su metà della sfera, come se la cosa potesse servire, e continuava a vendere i suoi panini lì accanto con l'allegria risoluta di una donna che aveva deciso di non parlare della palla di neve.</w:t>
+        <w:t xml:space="preserve">, un oggettino per turisti con dentro una piccola Frost Falls di ceramica, il prato, il municipio e tutto il resto. Quella mattina, quando passai per i panini alla cannella di Nick, la neve all'interno non voleva saperne di posarsi. Turbinava e turbinava senza che nessuna mano la toccasse, una minuscola tormenta che girava e rigirava dietro il vetro. Greta aveva drappeggiato un canovaccio su metà della sfera, come se la cosa potesse servire, e continuava a vendere i suoi panini lì accanto con l'allegria risoluta di una donna che aveva deciso di non parlare della palla di neve.</w:t>
       </w:r>
     </w:p>
     <w:p/>
@@ -2580,13 +2580,13 @@
     <w:p/>
     <w:p>
       <w:r>
-        <w:t>«Buongiorno, signora Claus» disse Greta. «Non faccia caso alla palla. Va avanti così dall'alba.» Mi fece scivolare i panini incontro. «È il frullatore grande, credo. Fa tremare tutto il banco.»</w:t>
-      </w:r>
-    </w:p>
-    <w:p/>
-    <w:p>
-      <w:r>
-        <w:t>Si era convinta che fosse colpa del frullatore, e io le diedi retta.</w:t>
+        <w:t xml:space="preserve">«Buongiorno, signora Claus» disse Greta. «Non faccia caso alla palla. Va avanti così dall'alba.» Mi fece scivolare i panini incontro. «È l'impastatrice grande, credo. Fa tremare tutto il banco.»</w:t>
+      </w:r>
+    </w:p>
+    <w:p/>
+    <w:p>
+      <w:r>
+        <w:t xml:space="preserve">Si era convinta che fosse colpa dell'impastatrice, e io le diedi retta.</w:t>
       </w:r>
     </w:p>
     <w:p/>
@@ -2610,7 +2610,7 @@
     <w:p/>
     <w:p>
       <w:r>
-        <w:t>«Signora Claus!» Non si voltò nemmeno. «Questa volta è Prancer! Prancer! È nella fontana, e non c'è nemmeno l'acqua, non vuole uscire, c'è un sacco di gente che si sta radunando, e ho provato di tutto, ho provato con lo zucchero, ho provato a essere severo, ho provato a ragionare con lei, il che ammetto fosse un tantino ottimista.» Tirò la capezza, e Prancer lo guardò con la serena indifferenza di una creatura che non aveva alcuna intenzione di muoversi da lì. «Ne sono scappate due adesso. Due! Prancer nella fontana e Vixen si è infilata in qualche modo nel salone della chiesa e si è mangiata la paglia della stalla del presepe, e non le dispiace neanche, si vede lontano un miglio che non le dispiace, guardatela... oh, non è qui, è in chiesa, ma se fosse qui vedreste che non le dispiace affatto.»</w:t>
+        <w:t xml:space="preserve">«Signora Claus!» Non si voltò nemmeno. «Questa volta è Prancer! Prancer! È nella fontana, e non c'è nemmeno l'acqua, non vuole uscire, c'è un sacco di gente che si sta radunando, e ho provato di tutto, ho provato con lo zucchero, ho provato a essere severo, ho provato a ragionare con lei, il che ammetto fosse un tantino ottimista.» Tirò la capezza, e Prancer lo guardò con la serena indifferenza di una creatura che non aveva alcuna intenzione di muoversi da lì. «Ne sono scappate due adesso. Due! Prancer nella fontana e Vixen si è infilata in qualche modo nel salone della chiesa e si è mangiata la paglia della stalla del presepe, e non le dispiace neanche, si vede lontano un miglio che non le dispiace, la guardi... oh, non è qui, è in chiesa, ma se fosse qui vedrebbe che non le dispiace affatto.»</w:t>
       </w:r>
     </w:p>
     <w:p/>
@@ -2628,13 +2628,13 @@
     <w:p/>
     <w:p>
       <w:r>
-        <w:t>«Bram» dissi, «smetti di tirare. Ti dislocherai qualcosa, a te o a lei.»</w:t>
-      </w:r>
-    </w:p>
-    <w:p/>
-    <w:p>
-      <w:r>
-        <w:t>Mi avvicinai alla fontana, poggiai una mano sul collo caldo di Prancer e mi sporsi in avanti. «Non c'è niente in questo paese che sia caldo neanche lontanamente quanto casa» le dissi a bassa voce, solo per lei. «Se vuoi il caldo, torna a casa. Vai a vedere.»</w:t>
+        <w:t xml:space="preserve">«Bram» dissi, «smetti di tirare. Ti slogherai qualcosa, tu o lei.»</w:t>
+      </w:r>
+    </w:p>
+    <w:p/>
+    <w:p>
+      <w:r>
+        <w:t xml:space="preserve">Mi avvicinai alla fontana, poggiai una mano sul collo caldo di Prancer e mi sporsi in avanti. «Non c'è niente su questo prato che sia caldo neanche lontanamente quanto casa» le dissi a bassa voce, solo per lei. «Se vuoi il caldo, torna a casa. Vai a vedere.»</w:t>
       </w:r>
     </w:p>
     <w:p/>
@@ -2676,7 +2676,7 @@
     <w:p/>
     <w:p>
       <w:r>
-        <w:t>La cosa avrebbe dovuto preoccuparmi più di quanto facesse in realtà. C'era un ricattatore in paese e un'amicizia stremata per mezzo milione di dollari. Ma una renna era appena uscita da una fontana perché le avevo detto che c'era qualcosa di più caldo su per la strada. I bambini l'avevano acclamata per tutto il tragitto fino all'angolo. Il mio cuore, contro ogni logica e ogni evidenza, stava volando in alto come un aquilone.</w:t>
+        <w:t xml:space="preserve">La cosa avrebbe dovuto preoccuparmi più di quanto facesse in realtà. C'era un ricattatore in paese e un'amica messa alle strette per mezzo milione di dollari. Ma una renna era appena uscita da una fontana perché le avevo detto che c'era qualcosa di più caldo su per la strada. I bambini l'avevano acclamata per tutto il tragitto fino all'angolo. Il mio cuore, contro ogni logica e ogni evidenza, stava volando in alto come un aquilone.</w:t>
       </w:r>
     </w:p>
     <w:p>
@@ -2884,7 +2884,7 @@
     </w:p>
     <w:p>
       <w:r>
-        <w:t>«Jamal ha portato le scatole ma non ne ha mai aperta una», dissi. «Me lo ha detto lui stesso, e gli credo. La sua intera borsa di studio in storia si basava sul "prezioso, maneggiare con cura". È stato a contatto con il segreto per tutta la settimana senza mai guardarci dentro. E quell'uomo fa tre lavori per uscire dalla miseria in modo onesto, il corso all'alba e il turno di notte come custode. Non è lui». Tracciai una linea sul nome di Jamal con decisione. «Ha avuto l'occasione ma non la conoscenza. E neppure il fegato, il che per me conta anche se non basterebbe in un'aula di tribunale».</w:t>
+        <w:t xml:space="preserve">«Jamal ha portato le scatole ma non ne ha mai aperta una», dissi. «Me lo ha detto lui stesso, e gli credo. Tutta la sua erudizione storica si riduceva al "prezioso, maneggiare con cura". È stato a contatto con il segreto per tutta la settimana senza mai guardarci dentro. E quell'uomo fa tre lavori per uscire dalla miseria in modo onesto, il corso all'alba e il turno di notte come custode. Non è lui». Tracciai una linea sul nome di Jamal con decisione. «Ha avuto l'occasione ma non la conoscenza. E neppure il fegato, il che per me conta anche se non basterebbe in un'aula di tribunale».</w:t>
       </w:r>
     </w:p>
     <w:p>
@@ -2894,7 +2894,7 @@
     </w:p>
     <w:p>
       <w:r>
-        <w:t>«Sam non ha avuto alcuna occasione. Non ha mai messo piede nell'archivio, dice che la polvere gli fa starnutire, e credo anche a questo. Mi ha detto che le vecchie famiglie sono il campo di Theo, e lo pensava davvero». Picchiettai sul foglio. «L'odore di forgia lo ha messo sulla lista, e penso che quell'odore sarà esattamente ciò che lo toglierà dalla lista, perché Pip mi dice fin dalla prima notte che il biglietto sa del ferro di Sam, non di Sam. E il ferro di Sam è dappertutto nell'atrio di Fiona. Qualsiasi cosa lasciata in quell'atrio si impregna del profumo del suo fuoco. Qualsiasi cosa».</w:t>
+        <w:t xml:space="preserve">«Sam non ha avuto alcuna occasione. Non ha mai messo piede nell'archivio, dice che la polvere lo fa starnutire, e credo anche a questo. Mi ha detto che le vecchie famiglie sono il campo di Theo, e lo pensava davvero». Picchiettai sul foglio. «L'odore di forgia lo ha messo sulla lista, e penso che quell'odore sarà esattamente ciò che lo toglierà dalla lista, perché Pip mi dice fin dalla prima notte che il biglietto sa del ferro di Sam, non di Sam. E il ferro di Sam è dappertutto nell'atrio di Fiona. Qualsiasi cosa lasciata in quell'atrio si impregna del profumo del suo fuoco. Qualsiasi cosa».</w:t>
       </w:r>
     </w:p>
     <w:p>
@@ -2914,7 +2914,7 @@
     </w:p>
     <w:p>
       <w:r>
-        <w:t>Aggrottai la fronte al nome di lui sul foglio. «È quello che non riesco a inquadrare. Sa tutto quello che sa il ricattatore. La spilla, la pietra singola, Ridgeline, tutto quanto. Ci è arrivato dalla parte dei Blackburn, quella degli avvocati della tenuta, e ha tracciato la storia quasi fino alla porta di Constance». Girai lentamente la mia tazza di mezzo giro sul tavolo. «Ma lo va a dire a tutti. Distribuisce biglietti da visita. Si è seduto nella biblioteca pubblica e mi ha raccontato tutto prima ancora che io potessi chiedere. Un ricattatore si nasconde, Nick. Il suo intero potere sta nel nascondersi. E Neil Carter fa esattamente il contrario di nascondersi, a ogni ora del giorno. Quindi o non è affatto il nostro uomo, o è il più furbo del gruppo, capace di fare così tanto chiasso onesto sulla spilla che nessuno in paese sospetterebbe mai dell'uomo che ne parla di più». Lasciai un punto interrogativo accanto a Neil. «Non sono pronta a escluderlo. Ma dico questo. Conosce il segreto, ci è arrivato in modo onesto, e non si è mai avvicinato a Fiona per un centesimo. Si è avvicinato a lei per avere risposte, alla luce del sole, con un taccuino in mano».</w:t>
+        <w:t xml:space="preserve">Aggrottai la fronte al nome di lui sul foglio. «È quello che non riesco a inquadrare. Sa tutto quello che sa il ricattatore. La spilla, la pietra singola, Ridgeline, tutto quanto. Ci è arrivato dalla parte dei Blackburn, quella degli avvocati della successione, e ha tracciato la storia quasi fino alla porta di Constance». Girai lentamente la mia tazza di mezzo giro sul tavolo. «Ma lo va a dire a tutti. Distribuisce biglietti da visita. Si è seduto nella biblioteca pubblica e mi ha raccontato tutto prima ancora che io potessi chiedere. Un ricattatore si nasconde, Nick. Il suo intero potere sta nel nascondersi. E Neil Carter fa esattamente il contrario di nascondersi, a ogni ora del giorno. Quindi o non è affatto il nostro uomo, o è il più furbo del gruppo, capace di fare così tanto chiasso onesto sulla spilla che nessuno in paese sospetterebbe mai dell'uomo che ne parla di più». Lasciai un punto interrogativo accanto a Neil. «Non sono pronta a escluderlo. Ma dico questo. Conosce il segreto, ci è arrivato in modo onesto, e non si è mai avvicinato a Fiona per un centesimo. Si è avvicinato a lei per avere risposte, alla luce del sole, con un taccuino in mano».</w:t>
       </w:r>
     </w:p>
     <w:p>
@@ -2924,7 +2924,7 @@
     </w:p>
     <w:p>
       <w:r>
-        <w:t>«Ne restano due». Guardai il foglio e non avrei voluto farlo. Vera. Theo. I due nomi su cui non avevo alcuna linea da tracciare. «Ed è questo che mi preoccupa. Di tutti quelli su questo foglio, gli unici due che non riesco a scagionare sono quelli che tengono le chiavi dei vecchi documenti del paese. Vera custodisce gli atti e i registri di proprietà, un secolo di chi-possedeva-cosa, l'atto della locanda da qualche parte in mezzo a quelli. Si è irrigidita come un baccalà e mi ha detto che non legge mai le carte che custodisce alle spalle. E Theo». Mi costrinsi a dirlo lentamente. «Theo vive nell'archivio. Le lettere dei Blackburn erano sotto la sua custodia, nelle sue mani. E le più interessanti, proprio quelle che direbbero che una spilla è sparita e dove è finita, sono quelle che lui si è alzato a annunciare davanti a tutto il paese che erano andate smarrite».</w:t>
+        <w:t xml:space="preserve">«Ne restano due». Guardai il foglio e non avrei voluto farlo. Vera. Theo. I due nomi su cui non avevo alcuna linea da tracciare. «Ed è questo che mi preoccupa. Di tutti quelli su questo foglio, gli unici due che non riesco a scagionare sono quelli che tengono le chiavi dei vecchi documenti del paese. Vera custodisce gli atti e i registri di proprietà, un secolo di chi-possedeva-cosa, l'atto della locanda da qualche parte in mezzo a quelli. Si è irrigidita come un baccalà e mi ha detto che non legge mai le carte che custodisce alle spalle. E Theo». Mi costrinsi a dirlo lentamente. «Theo vive nell'archivio. Le lettere dei Blackburn erano sotto la sua custodia, nelle sue mani. E le più interessanti, proprio quelle che direbbero che una spilla è sparita e dove è finita, sono quelle che lui si è alzato ad annunciare davanti a tutto il paese che erano andate smarrite».</w:t>
       </w:r>
     </w:p>
     <w:p>
@@ -2939,7 +2939,7 @@
     </w:p>
     <w:p>
       <w:r>
-        <w:t>«Non voglio che sia nessuno». Pressi le mani aperte sul tavolo ai lati del foglio. «Vorrei aver capito tutto male. Vorrei che Neil si rivelasse un furfante astuto così potrebbe essere un estraneo capitato in paese, e non un amico che vive qui da trenta anni. Ma il volere non è una prova, Nick, non lo è mai stata, e ogni fatto che scopro costruisce la stessa forma, e quella forma ha il nome di Theo in mezzo. Le lettere sono uscite dall'archivio. Il biglietto è scritto sulla carta dell'archivio stesso. E l'uomo che gestisce l'archivio è disperato. Ha bussato a ogni porta onesta che c'è e se le è viste tutte sbattere in faccia». Scossi la testa. «È una forma terribile. Spero sempre che il fatto successivo la rompa. E il fatto successivo continua invece a metterci un'altra pietra sopra».</w:t>
+        <w:t xml:space="preserve">«Non voglio che sia nessuno». Premetti le mani aperte sul tavolo ai lati del foglio. «Vorrei aver capito tutto male. Vorrei che Neil si rivelasse un furfante astuto così potrebbe essere un estraneo capitato in paese, e non un amico che vive qui da trenta anni. Ma il volere non è una prova, Nick, non lo è mai stato, e ogni fatto che scopro costruisce la stessa forma, e quella forma ha il nome di Theo in mezzo. Le lettere sono uscite dall'archivio. Il biglietto è scritto sulla carta dell'archivio stesso. E l'uomo che gestisce l'archivio è disperato. Ha bussato a ogni porta onesta che c'è e se le è viste tutte sbattere in faccia». Scossi la testa. «È una forma terribile. Spero sempre che il fatto successivo la rompa. E il fatto successivo continua invece a metterci un'altra pietra sopra».</w:t>
       </w:r>
     </w:p>
     <w:p>
@@ -2954,7 +2954,7 @@
     </w:p>
     <w:p>
       <w:r>
-        <w:t>«Presto», dissi. «Ci sono due fili da annodare prima. Sam e lo straniero. Voglio che siano entrambi fuori dai giochi per certo, scagionati oltre ogni dubbio, prima di permettermi di entrare in quell'archivio e guardare Theo in faccia. Gli devo almeno questo, non puntare il dito contro di lui finché non resta nessun altro da sospettare. E poi andrò, guarderò le lettere e scoprirò se le parole corrispondono».</w:t>
+        <w:t xml:space="preserve">«Presto», dissi. «Ci sono due fili da annodare prima. Sam e lo sconosciuto. Voglio che siano entrambi fuori dai giochi per certo, scagionati oltre ogni dubbio, prima di permettermi di entrare in quell'archivio e guardare Theo in faccia. Gli devo almeno questo, non puntare il dito contro di lui finché non resta nessun altro da sospettare. E poi andrò, guarderò le lettere e scoprirò se le parole corrispondono».</w:t>
       </w:r>
     </w:p>
     <w:p>
@@ -2964,7 +2964,7 @@
     </w:p>
     <w:p>
       <w:r>
-        <w:t>Me ne tenni stretta mentre salivo le scale per andare a letto, considerandola la gentilezza che era. Dormii male e sognai cassetti chiusi a chiave di cui non riuscivo a trovare le chiavi.</w:t>
+        <w:t xml:space="preserve">Mi aggrappai a quelle parole mentre salivo le scale per andare a letto, prendendole per la gentilezza che erano. Dormii male e sognai cassetti chiusi a chiave di cui non riuscivo a trovare le chiavi.</w:t>
       </w:r>
     </w:p>
     <w:p>
@@ -3005,7 +3005,7 @@
     <w:p/>
     <w:p>
       <w:r>
-        <w:t>Camminammo fino all'estremità tranquilla del portico, fuori dalla portata d'orecchio della hall, dove il sole del mattino non era ancora arrivato e il nostro fiato formava nuvolette. Glielo dissi. Non tutto. Ma ne tracciai i contorni. Che Fiona era in un pasticcio serio. Che qualcuno la stava ricattando per una vecchia storia di famiglia, una faccenda vecchia di cent'anni e che non c'entrava affatto con lei. Che era per quello che era diventata strana e pallida, perché non poteva pagarlo, perché non riusciva a guardarlo negli occhi. Che era spaventata, Sam, non fredda. Mai fredda.</w:t>
+        <w:t xml:space="preserve">Camminammo fino all'estremità tranquilla del portico, fuori dalla portata d'orecchio della hall, dove il sole del mattino non era ancora arrivato e il nostro fiato formava nuvolette. Glielo dissi. Non tutto. Ma ne tracciai i contorni. Che Fiona era in un pasticcio serio. Che qualcuno la stava ricattando per una vecchia storia di famiglia, una faccenda vecchia di cent'anni di cui lei non aveva alcuna colpa. Che era per quello che era diventata strana e pallida, perché non poteva pagarlo, perché non riusciva a guardarlo negli occhi. Che era spaventata, Sam, non fredda. Mai fredda.</w:t>
       </w:r>
     </w:p>
     <w:p/>
@@ -3041,7 +3041,7 @@
     <w:p/>
     <w:p>
       <w:r>
-        <w:t>Il profumo su quel biglietto non era mai stato di Sam. Era il profumo del suo lavoro. Un maniscalco rifinisce il ferro bruciandovi sopra dell'olio mentre è ancora rovente, e i lavori in ferro nuovo trattengono quell'odore di fumo per settimane. La hall di Fiona ne era impregnata, così come il corrimano delle scale, il parascintille, le staffe montate sul portico, e il cappotto e la borsa degli attrezzi di Sam erano rimasti appesi vicino alla sua porta ogni giorno per tre settimane. Qualsiasi foglio poggiato su quella scrivania assorbiva quell'odore. Anche il biglietto era rimasto lì. L'indizio che lo aveva messo in cima alla mia lista mi stava dicendo da principio dove fosse stato il biglietto. Non chi lo avesse scritto. Lo stavo leggendo al contrario. Adesso potevo leggerlo nel verso giusto, e il verso giusto lo scagionava in modo totale e inequivocabile.</w:t>
+        <w:t xml:space="preserve">Il profumo su quel biglietto non era mai stato di Sam. Era il profumo del suo lavoro. Un fabbro rifinisce il ferro bruciandovi sopra dell'olio mentre è ancora rovente, e i lavori in ferro nuovo trattengono quell'odore di fumo per settimane. La hall di Fiona ne era impregnata, così come il corrimano delle scale, il parafuoco, le staffe montate sul portico, e il cappotto e la borsa degli attrezzi di Sam erano rimasti appesi vicino alla sua porta ogni giorno per tre settimane. Qualsiasi foglio poggiato su quella scrivania assorbiva quell'odore. Anche il biglietto era rimasto lì. L'indizio che lo aveva messo in cima alla mia lista mi stava dicendo da principio dove fosse stato il biglietto. Non chi lo avesse scritto. Lo stavo leggendo al contrario. Adesso potevo leggerlo nel verso giusto, e il verso giusto lo scagionava in modo totale e inequivocabile.</w:t>
       </w:r>
     </w:p>
     <w:p/>
@@ -3053,7 +3053,7 @@
     <w:p/>
     <w:p>
       <w:r>
-        <w:t>«Posso farlo.» Mi strinse la mano, ruvida e calda come il ferro. «E signora Claus. Qualunque cosa serva per rimettere a posto le cose. Se si tratta di soldi, se ha bisogno di soldi per essere al sicuro, dille che i maniscalchi di tre contee mi devono dei favori e io li chiamerò fino all'ultimo senza pensarci due volte. Dille anche questo, quando le parlerai dei venti dollari.»</w:t>
+        <w:t xml:space="preserve">«Posso farlo.» Mi strinse la mano, ruvida e calda come il ferro. «E signora Claus. Qualunque cosa serva per rimettere a posto le cose. Se si tratta di soldi, se ha bisogno di soldi per essere al sicuro, dille che i fabbri di tre contee mi devono dei favori e io li chiamerò fino all'ultimo senza pensarci due volte. Dille anche questo, quando le parlerai dei venti dollari.»</w:t>
       </w:r>
     </w:p>
     <w:p/>
@@ -3116,12 +3116,12 @@
     </w:p>
     <w:p>
       <w:r>
-        <w:t>«Mezzo milione». Si appoggiò allo schienale e lasciò sfuggire un basso fischio. «Mio Dio. Qualcuno sta stringendo alle corde la discendente. Per una cosa che la legge non può toccare». Scosse lentamente la testa, e c'era disgusto in quel gesto, vero disgusto. «È crudele, signora Claus, ed è stupido. Non c'è capo d'accusa che qualcuno possa muovere per quella spilla oggi. L'eredità Blackburn non vuole i soldi della sua amica e di certo non vuole la sua pelle. Vuole una sola riga in un registro che dica dove è finito l'oggetto, così gli avvocati possono chiudere il fascicolo e smettere di farsi parcelle a vicenda. Chiunque stia dissanguando la sua amica le sta vendendo un terrore che non è nemmeno reale. La vergogna è l'unica arma rimasta in questa storia. Non è rimasto alcun caso legale, non dopo cent'anni».</w:t>
-      </w:r>
-    </w:p>
-    <w:p>
-      <w:r>
-        <w:t>Pensai che fosse la cosa più utile che mi fosse stata detta in tutta questa faccenda, e lui me l'aveva servita su un piatto d'argento, ripulendosi un po' di più a ogni parola. Un ricattatore fa leva sulla portata della minaccia. Neil mi aveva appena detto, senza che glielo chiedessi, che la minaccia era vuota, che la spilla non poteva fare del male a Fiona in nessun tribunale sulla faccia della terra, e che l'unico spigolo tagliente rimasto era la sua paura degli sguardi del paese. Un uomo che stesse portando avanti quell'estorsione si sarebbe tagliato la lingua piuttosto che dirmelo. Avrebbe lasciato intatto il terrore, perché il terrore era il suo unico prodotto.</w:t>
+        <w:t xml:space="preserve">«Mezzo milione». Si appoggiò allo schienale e lasciò sfuggire un basso fischio. «Mio Dio. Qualcuno sta mettendo alle corde la discendente. Per una cosa che la legge non può toccare». Scosse lentamente la testa, e c'era disgusto in quel gesto, vero disgusto. «È crudele, signora Claus, ed è stupido. Non c'è capo d'accusa che qualcuno possa muovere per quella spilla oggi. L'eredità Blackburn non vuole i soldi della sua amica e di certo non vuole la sua pelle. Vuole una sola riga in un registro che dica dove è finito l'oggetto, così gli avvocati possono chiudere il fascicolo e smettere di farsi parcelle a vicenda. Chiunque stia dissanguando la sua amica le sta vendendo un terrore che non è nemmeno reale. La vergogna è l'unica arma rimasta in questa storia. Non è rimasto alcun caso legale, non dopo cent'anni».</w:t>
+      </w:r>
+    </w:p>
+    <w:p>
+      <w:r>
+        <w:t xml:space="preserve">Pensai che fosse la cosa più utile che mi fosse stata detta in tutta questa faccenda, e lui me l'aveva servita su un piatto d'argento, scagionandosi un po' di più a ogni parola. Un ricattatore fa leva sulla portata della minaccia. Neil mi aveva appena detto, senza che glielo chiedessi, che la minaccia era vuota, che la spilla non poteva fare del male a Fiona in nessun tribunale sulla faccia della terra, e che l'unico spigolo tagliente rimasto era la sua paura degli sguardi del paese. Un uomo che stesse portando avanti quell'estorsione si sarebbe tagliato la lingua piuttosto che dirmelo. Avrebbe lasciato intatto il terrore, perché il terrore era il suo unico prodotto.</w:t>
       </w:r>
     </w:p>
     <w:p>
@@ -3141,7 +3141,7 @@
     </w:p>
     <w:p>
       <w:r>
-        <w:t>«Le erano dovuti», disse Neil, guardandomi leggere. «Questa è la parte che i pettegolezzi tralasciano sempre, perché i pettegolezzi vogliono un cattivo pulito e un crimine pulito. I Blackburn non pagavano il personale di servizio da mesi, quell'inverno del ventiquattro. Lì dentro ho i reclami, gli altri domestici che se ne andarono, e una lettera, signora Claus, una lettera di Constance in persona, in cui chiedeva, molto educatamente, i suoi arretrati, e si sentiva rispondere di essere grata di avere un tetto sopra la testa. Sua madre stava morendo proprio quell'inverno, a tre strade di distanza, e non c'erano soldi per un medico, nessuno. Ed eccola lì, giorno dopo giorno, a spolverare una spilla che valeva più di quanto avrebbe guadagnato in tre vite, mentre la famiglia che la possedeva le diceva di essere grata». Allargò le mani. «Non sto dicendo che avesse ragione a prenderla. Sto dicendo che non era una ladra nel modo semplice in cui la nota vuole far credere alla sua amica. Era una ragazza disperata, derubata per prima da persone ricche che potevano permettersi benissimo di pagarla e avevano scelto di non farlo. Si era ripagata con l'unica cosa che poteva raggiungere, e ci aveva costruito sopra cento anni di onesta accoglienza. Ci sono fondamenta peggiori per una locanda».</w:t>
+        <w:t xml:space="preserve">«Le erano dovuti», disse Neil, guardandomi leggere. «Questa è la parte che i pettegolezzi tralasciano sempre, perché i pettegolezzi vogliono un cattivo pulito e un crimine pulito. I Blackburn non pagavano il personale di servizio da mesi, quell'inverno del ventiquattro. Lì dentro ho i reclami, gli altri domestici che se ne andarono, e una lettera, signora Claus, una lettera di Constance in persona, in cui chiedeva, molto educatamente, i suoi arretrati, e si sentiva rispondere di essere grata di avere un tetto sopra la testa. Sua madre stava morendo proprio quell'inverno, a tre strade di distanza, e non c'erano soldi per un medico, nessuno. Ed eccola lì, giorno dopo giorno, a spolverare una spilla che valeva più di quanto avrebbe guadagnato in tre vite, mentre la famiglia che la possedeva le diceva di essere grata». Allargò le mani. «Non sto dicendo che avesse ragione a prenderla. Sto dicendo che non era una ladra nel modo semplice in cui la lettera vuole far credere alla sua amica. Era una ragazza disperata, derubata per prima da persone ricche che potevano permettersi benissimo di pagarla e avevano scelto di non farlo. Si era ripagata con l'unica cosa che poteva raggiungere, e ci aveva costruito sopra cento anni di onesta accoglienza. Ci sono fondamenta peggiori per una locanda».</w:t>
       </w:r>
     </w:p>
     <w:p>
@@ -3156,7 +3156,7 @@
     </w:p>
     <w:p>
       <w:r>
-        <w:t>«Tienila pure. Ho le copie di ogni singola pagina». Si fermò, e per una volta la vivacità dentro di lui si fece silenziosa e gentile. «Dica una cosa alla sua amica, da parte di un uomo che legge la posta dei morti per vivere. I segreti che rovinano la gente sono quelli raccontati a metà. Ogni fottuta volta. È il nascondere le cose che dà loro i denti, non la verità. Ho disseppellito cento segreti di famiglia sepolti nella mia carriera, e ognuno di essi si è rivelato più piccolo e più triste di quanto la famiglia avesse passato la vita a temere».</w:t>
+        <w:t xml:space="preserve">«La tenga pure. Ho le copie di ogni singola pagina». Si fermò, e per una volta la vivacità dentro di lui si fece silenziosa e gentile. «Dica una cosa alla sua amica, da parte di un uomo che legge la posta dei morti per vivere. I segreti che rovinano la gente sono quelli raccontati a metà. Ogni volta. È il nascondere le cose che dà loro i denti, non la verità. Ho disseppellito cento segreti di famiglia sepolti nella mia carriera, e ognuno di essi si è rivelato più piccolo e più triste di quanto la famiglia avesse passato la vita a temere».</w:t>
       </w:r>
     </w:p>
     <w:p>
@@ -3423,13 +3423,13 @@
     <w:p/>
     <w:p>
       <w:r>
-        <w:t>«No,» dissi, rigirandomi il biglietto tra le mani, rileggendolo. «Vuole che tu sia abbastanza spaventata da trovare ciò che non c'è. Le persone che non sono mai state veramente disperate credono che i disperati possano sempre inventarsi dei soldi in qualche modo, basta spremerli abbastanza. Pensa che tu abbia qualche ricca parente a cui sei stata troppo fiera per chiedere. Pensa che venderai qualcosa, ipotecherai qualcosa, andrai in ginocchio dai Worthington. Crede che la paura in persona farà saltar fuori i soldi, come monetine da una tasca rovesciata.» La guardai. «E questo mi dice qualcosa su di lui, Fiona, che lo volesse o no. Mi dice che è disperato anche lui. Le persone agiate non immaginarono che i soldi appaiano sotto pressione, perché per loro i soldi non hanno mai dovuto apparire dal nulla, ci sono semplicemente sempre stati. Solo chi ha dovuto farli comparire in qualche modo, in un mese difficile, ragiona così. Il biglietto mi ha spaventata per te in questi giorni. È solo adesso che mi è venuto in mente di avere un po' di paura anche per lui, chiunque sia.»</w:t>
-      </w:r>
-    </w:p>
-    <w:p/>
-    <w:p>
-      <w:r>
-        <w:t>Non era una grande consolazione, ma era la verità, e Fiona la accolse come un nuotatore che sta annegando si aggrappa a qualsiasi asse le passi accanto. «Sembra che tu sappia chi è,» disse, guardandomi in volto con gli occhi cerchiati di rosso. «Lo sai? Hai quell'espressione. Martha dice che ti viene un'espressione particolare.»</w:t>
+        <w:t xml:space="preserve">«No,» dissi, rigirandomi il biglietto tra le mani, rileggendolo. «Vuole che tu sia abbastanza spaventata da trovare ciò che non c'è. Le persone che non sono mai state veramente disperate credono che i disperati possano sempre inventarsi dei soldi in qualche modo, basta spremerli abbastanza. Pensa che tu abbia qualche parente ricco a cui sei stata troppo fiera per chiedere. Pensa che venderai qualcosa, ipotecherai qualcosa, andrai in ginocchio dai Worthington. Crede che la paura stessa farà saltar fuori i soldi, come monetine da una tasca rovesciata.» La guardai. «E questo mi dice qualcosa su di lui, Fiona, che lo volesse o no. Mi dice che è disperato anche lui. Le persone agiate non immaginano che i soldi appaiano sotto pressione, perché per loro i soldi non hanno mai dovuto apparire dal nulla, ci sono semplicemente sempre stati. Solo chi ha dovuto farli comparire in qualche modo, in un mese difficile, ragiona così. Il biglietto mi ha spaventata per te in questi giorni. È solo adesso che mi è venuto in mente di avere un po' di paura anche per lui, chiunque sia.»</w:t>
+      </w:r>
+    </w:p>
+    <w:p/>
+    <w:p>
+      <w:r>
+        <w:t xml:space="preserve">Non era una grande consolazione, ma era la verità, e Fiona la accolse come un nuotatore che sta annegando si aggrappa a qualsiasi asse gli passi accanto. «Sembra che tu sappia chi è,» disse, guardandomi in volto con gli occhi cerchiati di rosso. «Lo sai? Hai quell'espressione. Martha dice che ti viene un'espressione particolare.»</w:t>
       </w:r>
     </w:p>
     <w:p/>
@@ -3465,7 +3465,7 @@
     <w:p/>
     <w:p>
       <w:r>
-        <w:t>Ma ero venuta per ben più che dare conforto. Girai il biglietto e osservai, questa volta, non le parole crudeli ma la carta su cui erano scritte. Color crema. Un po' pesante tra le dita. Le delicate linee filigranate impresse nella trama, sottili e parallele, che si notano solo quando si tiene un oggetto controluce. La stessa del primo biglietto, e la stessa della pila che avevo visto su una scrivania vicino alla porta della Società Storica la mattina dell'inaugurazione della mostra. Il secondo biglietto non faceva che confermarlo. Il ricattatore stava ancora scrivendo ciò che dicevano le lettere di Blackburn sulla carta della Società.</w:t>
+        <w:t xml:space="preserve">Ma ero venuta per ben più che dare conforto. Girai il biglietto e osservai, questa volta, non le parole crudeli ma la carta su cui erano scritte. Color crema. Un po' pesante tra le dita. Le delicate linee filigranate impresse nella trama, sottili e parallele, che si notano solo quando si tiene un oggetto controluce. La stessa del primo biglietto, e la stessa della pila che avevo visto su una scrivania vicino alla porta della Società Storica la mattina dell'inaugurazione della mostra. Il secondo biglietto non faceva che confermarlo. Il ricattatore stava ancora scrivendo ciò che dicevano le lettere dei Blackburn sulla carta della Società.</w:t>
       </w:r>
     </w:p>
     <w:p/>
@@ -3516,12 +3516,12 @@
     </w:p>
     <w:p>
       <w:r>
-        <w:t>Il prato era cambiato rispetto alla mattina. I tavoli a cavalletto che avevamo tirato fuori e di cui ci eravamo prese cura erano ora carichi delle offerte della città: le torte di Greta, un centinaio di barattoli di conserve, i ravioli della moglie del signor Kim e un intero tavolo con le moffole del circolo disposte in file per taglia. Il palco all'estremità nord ospitava una band, una vera band, tre vecchi e una ragazza con un violino, che suonavano quel genere di musica capace di far battere uno stivale contro la terra fredda persino a chi giurava di non ballare mai. Delle lanterne pendevano dagli alberi spogli. Chioschi di sidro e castagne arrostite costeggiavano l'area comune, e sopra ogni cosa ardevano le luci del festival. Ora brillavano d'oro, ogni singola fila, stabili e calde. Nessuno fece notare la cosa, perché l'intera cittadina aveva deciso insieme, senza dire una parola, che quelle luci erano sempre state d'oro e fine della storia.</w:t>
-      </w:r>
-    </w:p>
-    <w:p>
-      <w:r>
-        <w:t>Pip fu un vero successo. Sapevo che lo sarebbe stata. Fiona aveva allestito un angolo del portico della locanda come set fotografico, con una sedia, un fondale invernale dipinto e un cesto di sciarpe lavorate a maglia; per un dollaro devoluto alla Società Storica ci si poteva far scattare una foto con il pinguino ufficiale del Polo Nord. La fila si estendeva per tutta la lunghezza del portico e giù per i gradini per tutto il pomeriggio. Pip indossava una sciarpa diversa per ogni fotografia e accettava l'adorazione come un suo antico diritto. Rifiutò, con grande dignità, ogni pezzetto di frolla che i bambini cercavano di allungarle di nascosto sotto il tavolo. Le banconote da un dollaro si accumulavano nel barattolo, e fu il primo denaro che la Società aveva incassato dalla cassetta delle offerte di Olivia. Non li avrebbe salvati. Un barattolo pieno di dollari non poteva salvare un edificio. Ma era qualcosa, e scaldava il cuore. Fiona stava in piedi accanto alla postazione a riscuotere i dollari con un sorriso sincero, e per un pomeriggio tornò a sembrare se stessa.</w:t>
+        <w:t xml:space="preserve">Il prato era cambiato rispetto alla mattina. I tavoli a cavalletto che avevamo tirato fuori e di cui ci eravamo prese cura erano ora carichi delle offerte della città: le torte di Greta, un centinaio di barattoli di conserve, i ravioli della moglie del signor Kim e un intero tavolo con le manopole del circolo disposte in file per taglia. Il palco all'estremità nord ospitava una band, una vera band, tre vecchi e una ragazza con un violino, che suonavano quel genere di musica capace di far battere uno stivale contro la terra fredda persino a chi giurava di non ballare mai. Delle lanterne pendevano dagli alberi spogli. Chioschi di sidro e castagne arrostite costeggiavano l'area comune, e sopra ogni cosa ardevano le luci del festival. Ora brillavano d'oro, ogni singola fila, stabili e calde. Nessuno fece notare la cosa, perché l'intera cittadina aveva deciso insieme, senza dire una parola, che quelle luci erano sempre state d'oro e fine della storia.</w:t>
+      </w:r>
+    </w:p>
+    <w:p>
+      <w:r>
+        <w:t xml:space="preserve">Pip fu un vero successo. Sapevo che lo sarebbe stata. Fiona aveva allestito un angolo del portico della locanda come set fotografico, con una sedia, un fondale invernale dipinto e un cesto di sciarpe lavorate a maglia; per un dollaro devoluto alla Società Storica ci si poteva far scattare una foto con il pinguino ufficiale del Polo Nord. La fila si estendeva per tutta la lunghezza del portico e giù per i gradini per tutto il pomeriggio. Pip indossava una sciarpa diversa per ogni fotografia e accettava l'adorazione come un suo antico diritto. Rifiutò, con grande dignità, ogni pezzetto di frolla che i bambini cercavano di allungarle di nascosto sotto il tavolo. Le banconote da un dollaro si accumulavano nel barattolo, e fu il primo denaro che la Società incassava dai tempi della cassetta delle offerte di Olivia. Non li avrebbe salvati. Un barattolo pieno di dollari non poteva salvare un edificio. Ma era qualcosa, e scaldava il cuore. Fiona stava in piedi accanto alla postazione a riscuotere i dollari con un sorriso sincero, e per un pomeriggio tornò a sembrare se stessa.</w:t>
       </w:r>
     </w:p>
     <w:p>
@@ -3531,7 +3531,7 @@
     </w:p>
     <w:p>
       <w:r>
-        <w:t>Da un lato c'ero io, una cittadina al festival della sua comunità, ed era meraviglioso. Emma Redfern mi trovò vicino al sidro e mi mostrò il suo costume, che aveva insistito per indossare con una notte d'anticipo: una costellazione, Orione, nero con stelle d'argento cucite nei posti giusti dalle mani sapienti del padre, la cintura perfettamente precisa. Volle che nominassi ogni singola stella, e lo feci, perché conosco quelle stelle da molto tempo. Ne fu entusiasta, l'idea che la signora Claus conoscesse le sue costellazioni la rese felice. Mark se ne stava lì vicino con due tazze di sidro e quell'aria rilassata e consueta di un uomo che guarda la propria figlia vivere i suoi otto anni a voce alta in mezzo a una folla. Martha mi infilò addosso un paio di moffole prese dal tavolo, quelle verdi, «per quelle tue mani fredde». Sam Patel mi accennò un saluto con la visiera del berretto dall'altra parte del prato, dalla sua postazione vicino al portico della locanda, dove era rimasto di guardia tutto il giorno con gli occhi puntati sulla reception appena dentro la porta, come gli avevo chiesto di fare.</w:t>
+        <w:t xml:space="preserve">Da un lato c'ero io, una cittadina al festival della sua comunità, ed era meraviglioso. Emma Redfern mi trovò vicino al sidro e mi mostrò il suo costume, che aveva insistito per indossare con una notte d'anticipo: una costellazione, Orione, nero con stelle d'argento cucite nei posti giusti dalle mani sapienti del padre, la cintura perfettamente precisa. Volle che nominassi ogni singola stella, e lo feci, perché conosco quelle stelle da molto tempo. Ne fu entusiasta, l'idea che la signora Claus conoscesse le sue costellazioni la rese felice. Mark se ne stava lì vicino con due tazze di sidro e quell'aria rilassata e consueta di un uomo che guarda la propria figlia vivere i suoi otto anni a voce alta in mezzo a una folla. Martha mi infilò addosso un paio di manopole prese dal tavolo, quelle verdi, «per quelle tue mani fredde». Sam Patel mi accennò un saluto con la visiera del berretto dall'altra parte del prato, dalla sua postazione vicino al portico della locanda, dove era rimasto di guardia tutto il giorno con gli occhi puntati sulla reception appena dentro la porta, come gli avevo chiesto di fare.</w:t>
       </w:r>
     </w:p>
     <w:p>
@@ -3541,7 +3541,7 @@
     </w:p>
     <w:p>
       <w:r>
-        <w:t>Una volta, a metà pomeriggio, credetti che stesse succedendo. Una figura sgattaiolò sul portico della locanda, si fermò alla porta aperta, si guardò intorno e tese la mano verso il banco della reception. Il mio cuore si bloccò. Mi diressi verso il prato camminando troppo in fretta, e Sam si stava già muovendo dalla sua postazione. Poi la figura si voltò, e non era altri che la signora Pelletier, del consiglio direttivo della Società, che stava lasciando una pila di opuscoli informativi sul banco affinché gli ospiti potessero vederli. Io e Sam arrivammo nello stesso istante, da direzioni opposte, entrambi troppo in fretta, e incrociammo i nostri sguardi sopra quegli opuscoli. La signora Pelletier ci guardò confusa, alternando lo sguardo tra noi due. Presi tre opuscoli di cui non avevo alcun bisogno, Sam borbottò qualcosa sul tempo e ce la demmo a gambe. Quello fu il momento in cui la giornata andò più vicina al pericolo. Un falso allarme. Ma mi fece capire quanto fossi tesa, sotto la musica del violino, e quanto fosse sottile il confine tra il calore e la paura.</w:t>
+        <w:t xml:space="preserve">Una volta, a metà pomeriggio, credetti che stesse succedendo. Una figura sgattaiolò sul portico della locanda, si fermò alla porta aperta, si guardò intorno e tese la mano verso il banco della reception. Il mio cuore si bloccò. Attraversai il prato camminando troppo in fretta, e Sam si stava già muovendo dalla sua postazione. Poi la figura si voltò, e non era altri che la signora Pelletier, del consiglio direttivo della Società, che stava lasciando una pila di opuscoli informativi sul banco affinché gli ospiti potessero vederli. Io e Sam arrivammo nello stesso istante, da direzioni opposte, entrambi troppo in fretta, e incrociammo i nostri sguardi sopra quegli opuscoli. La signora Pelletier ci guardò confusa, alternando lo sguardo tra noi due. Presi tre opuscoli di cui non avevo alcun bisogno, Sam borbottò qualcosa sul tempo e ce la demmo a gambe. Quello fu il momento in cui la giornata andò più vicina al pericolo. Un falso allarme. Ma mi fece capire quanto fossi tesa, sotto la musica del violino, e quanto fosse sottile il confine tra il calore e la paura.</w:t>
       </w:r>
     </w:p>
     <w:p>
@@ -3551,7 +3551,7 @@
     </w:p>
     <w:p>
       <w:r>
-        <w:t>«Avevi l'aria di voler placcare la signora Pelletier» disse.</w:t>
+        <w:t xml:space="preserve">«Aveva l'aria di voler placcare la signora Pelletier» disse.</w:t>
       </w:r>
     </w:p>
     <w:p>
@@ -3576,17 +3576,17 @@
     </w:p>
     <w:p>
       <w:r>
-        <w:t>Annuì, come se fosse una risposta che sentiva spesso. «Sai dov'è la stazione. Il caffè fa schifo, ma la porta è aperta. Anche la domenica». Accennò con la tazza in direzione del portico della locanda, dove Pip si era messa in posa con una sciarpa rossa per una famiglia di cinque persone. «Il tuo pinguino oggi ha fatto guadagnare alla Società più soldi di quanti ne abbia fatti il sindaco in tutto l'anno».</w:t>
-      </w:r>
-    </w:p>
-    <w:p>
-      <w:r>
-        <w:t>«Non glielo dire» dissi. «Vorrebbe una percentuale».</w:t>
-      </w:r>
-    </w:p>
-    <w:p>
-      <w:r>
-        <w:t>La magia era ovunque quel giorno, in piccoli dettagli che la cittadina poteva liquidare con un'alzata di spalle. Quando la band suonava una danza vivace, le lanterne sugli alberi oscillavano leggermente, sebbene non riuscissi a percepire alcun alito di vento. Delle felci di ghiaccio fiorivano sui vetri interni delle finestre della locanda con motivi troppo perfetti per essere casuali, per poi sciogliersi e ricominciare a crescere. E nell'ultima ora di luce, mentre il sole tramontava dietro le colline e le luci dorate del festival prendevano finalmente il sopravvento, iniziò a nevicare dolcemente, per la prima volta dalla settimana in cui avevamo trovato Snowball. Fiocchi grossi e lenti scesero giù sopra il prato, sopra la band, i chioschi e i volti rivolti all'insù. L'intera cittadina si fermò, di colpo, alzò lo sguardo e rimase in silenzio.</w:t>
+        <w:t xml:space="preserve">Annuì, come se fosse una risposta che sentiva spesso. «Sa dov'è il comando. Il caffè fa schifo, ma la porta è aperta. Anche la domenica». Accennò con la tazza in direzione del portico della locanda, dove Pip si era messa in posa con una sciarpa rossa per una famiglia di cinque persone. «Il suo pinguino oggi ha fatto guadagnare alla Società più soldi di quanti ne abbia fatti il sindaco in tutto l'anno».</w:t>
+      </w:r>
+    </w:p>
+    <w:p>
+      <w:r>
+        <w:t xml:space="preserve">«Non glielo dica» dissi. «Vorrebbe una percentuale».</w:t>
+      </w:r>
+    </w:p>
+    <w:p>
+      <w:r>
+        <w:t xml:space="preserve">La magia era ovunque quel giorno, in piccoli dettagli che la cittadina poteva liquidare con un'alzata di spalle. Quando la band suonava una danza vivace, le lanterne sugli alberi oscillavano leggermente, sebbene non riuscissi a percepire alcun alito di vento. Delle felci di ghiaccio fiorivano sui vetri interni delle finestre della locanda con motivi troppo perfetti per essere casuali, per poi sciogliersi e ricominciare a crescere. E nell'ultima ora di luce, mentre il sole tramontava dietro le colline e le luci dorate del festival prendevano finalmente il sopravvento, iniziò a nevicare dolcemente, per la prima volta dalla settimana in cui avevamo trovato Palla di Neve. Fiocchi grossi e lenti scesero giù sopra il prato, sopra la band, i chioschi e i volti rivolti all'insù. L'intera cittadina si fermò, di colpo, alzò lo sguardo e rimase in silenzio.</w:t>
       </w:r>
     </w:p>
     <w:p>
@@ -3649,17 +3649,17 @@
         <w:t>&lt;/bt&gt;</w:t>
       </w:r>
       <w:r>
-        <w:t>: cinque parole, la formulazione di uno storico e non di un ladro, che comparivano nel biglietto di ricatto esattamente come sulla scheda nella grafia minuta e inclinata di Theo. Il biglietto era scritto sulla carta color avorio della Società, la pesante carta vergata che avevo visto impilata sul bancone all'ingresso della mostra. L'uomo che dirigeva l'archivio stava annegando. Aveva bussato a ogni porta onesta in tre Stati vedendosele chiudere tutte in faccia. Si era alzato davanti a tutto il paese annunciando, con rammarico, che proprio le lettere che descrivono la spilla si erano smarrite.</w:t>
-      </w:r>
-    </w:p>
-    <w:p>
-      <w:r>
-        <w:t>Ogni strada di quell'intera faccenda conduceva alla stessa porta. Ne avevo percorsa ciascuna sperando che una di esse deviaste altrove prima di arrivare a destinazione, e nessuna lo faceva.</w:t>
-      </w:r>
-    </w:p>
-    <w:p>
-      <w:r>
-        <w:t>Presi il secondo biglietto e un foglio di carta della Società, uno bianco che Theo mi aveva dato all'archivio per intestare nuove etichette per i fascicoli, che avevo portato a casa nella mia borsa. Li tenni entrambi sollevati controluce vicino alla lampada. Lo stesso avorio. Lo stesso peso tra le dita. Le stesse deboli righe vergate impresse nella trama, le sottili creste parallele che il telaio di una cartiera lascia dietro di sé, facili da vedere se si sa come tenere un foglio controluce e osservarlo. Corrispondevano. Certo che corrispondevano. Il biglietto era stato scritto usando la carta della riserva di Theo, la pila sul bancone d'ingresso dell'edificio che lui non aveva lasciato da giorni.</w:t>
+        <w:t xml:space="preserve">: cinque parole, la formulazione di uno storico e non di un ladro, che comparivano nel biglietto di ricatto esattamente come sulla scheda nella grafia minuta e inclinata di Theo. Il biglietto era scritto sulla carta color crema della Società, la pesante carta vergata che avevo visto impilata sul bancone all'ingresso della mostra. L'uomo che dirigeva l'archivio stava annegando. Aveva bussato a ogni porta onesta in tre Stati vedendosele chiudere tutte in faccia. Si era alzato davanti a tutto il paese annunciando, con rammarico, che proprio le lettere che descrivono la spilla si erano smarrite.</w:t>
+      </w:r>
+    </w:p>
+    <w:p>
+      <w:r>
+        <w:t xml:space="preserve">Ogni strada di quell'intera faccenda conduceva alla stessa porta. Ne avevo percorsa ciascuna sperando che una di esse deviasse altrove prima di arrivare a destinazione, e nessuna lo faceva.</w:t>
+      </w:r>
+    </w:p>
+    <w:p>
+      <w:r>
+        <w:t xml:space="preserve">Presi il secondo biglietto e un foglio di carta della Società, uno non scritto che Theo mi aveva dato all'archivio per intestare nuove etichette per i fascicoli, che avevo portato a casa nella mia borsa. Li tenni entrambi sollevati controluce vicino alla lampada. Lo stesso color crema. Lo stesso peso tra le dita. Le stesse deboli righe vergate impresse nella trama, le sottili creste parallele che il telaio di una cartiera lascia dietro di sé, facili da vedere se si sa come tenere un foglio controluce e osservarlo. Corrispondevano. Certo che corrispondevano. Il biglietto era stato scritto usando la carta della riserva di Theo, la pila sul bancone d'ingresso dell'edificio che lui non aveva lasciato da giorni.</w:t>
       </w:r>
     </w:p>
     <w:p>
@@ -3685,7 +3685,7 @@
         <w:rPr>
           <w:i/>
         </w:rPr>
-        <w:t>I know how your family came by this inn,</w:t>
+        <w:t xml:space="preserve">So come la tua famiglia è entrata in possesso di questa locanda,</w:t>
       </w:r>
       <w:r>
         <w:t xml:space="preserve"> aveva detto il primo biglietto. Il furto in sé, la spilla, la pietra, il banco dei pegni a Ridgeline, era tutto nelle lettere dei Blackburn, nell'archivio di Theo. Ma l'acquisto della locanda, l'acquisto del 1924, la traccia cartacea di una proprietà che passava di mano in mano, non si trovava in nessuna lettera dei Blackburn. Quello era un registro immobiliare. Un rogito.</w:t>
@@ -3698,7 +3698,7 @@
     </w:p>
     <w:p>
       <w:r>
-        <w:t>Rimasi immobile alla luce della lampada. Il furto della spilla e l'acquisto della locanda erano due segreti differenti, custoditi in due edifici differenti. Theo ne possedeva uno. Aveva l'archivio, le lettere, la scheda di catalogo, la carta da lettere. Aveva il furto. Ma la prova che il denaro rubato si era trasformato in quell'amata locanda si trovava in Municipio, nei registri immobiliari che una donna rigida e stanca mi aveva guardato negli occhi giurando di non leggere mai.</w:t>
+        <w:t xml:space="preserve">Rimasi immobile alla luce della lampada. Il furto della spilla e l'acquisto della locanda erano due segreti differenti, custoditi in due edifici differenti. Theo ne possedeva uno. Aveva l'archivio, le lettere, la scheda di catalogo, la carta da lettere. Aveva le carte del furto. Ma la prova che il denaro rubato si era trasformato in quell'amata locanda si trovava in Municipio, nei registri immobiliari che una donna rigida e stanca mi aveva guardato negli occhi giurando di non leggere mai.</w:t>
       </w:r>
     </w:p>
     <w:p>
@@ -3740,13 +3740,13 @@
     <w:p/>
     <w:p>
       <w:r>
-        <w:t>La scusa era troppo noiosa per sembrare una bugia, ed era proprio quello il punto. Le dissi che il comitato del festival aveva bisogno della vecchia concessione per il prato, il terreno comune in persona, per risolvere una piccola diatriba su dove un venditore potesse montare il proprio carretto, e se poteva essere così gentile da tirarmela fuori. Lei sospirò, quel sospiro scocciato di una donna a cui si chiedeva l'ennesima piccola seccatura in una giornata lunga, e andò nella stanza degli archivi in fondo per trovarla.</w:t>
-      </w:r>
-    </w:p>
-    <w:p/>
-    <w:p>
-      <w:r>
-        <w:t>Mentre era via feci la scortesia per cui ero venuta. Avevo deciso di farlo con la coscienza pulita, perché un'amica era in pericolo e avevo esaurito le opzioni educate. Guardai la sua scrivania. Non aprii nessun cassetto. Guardai solo ciò che era già esposto alla luce, come cadono gli occhi di chiunque mentre aspetta. Pip, ai miei piedi, aveva fissato l'attenzione sulle etichette d'ottone delle cartelline lungo i cassetti degli schedari, che luccicavano.</w:t>
+        <w:t xml:space="preserve">La scusa era troppo noiosa per sembrare una bugia, ed era proprio quello il punto. Le dissi che il comitato del festival aveva bisogno della vecchia concessione per il prato, il terreno comunale vero e proprio, per risolvere una piccola diatriba su dove un venditore potesse montare il proprio carretto, e se poteva essere così gentile da tirarmela fuori. Lei sospirò, quel sospiro scocciato di una donna a cui si chiedeva l'ennesima piccola seccatura in una giornata lunga, e andò nella stanza degli archivi in fondo per trovarla.</w:t>
+      </w:r>
+    </w:p>
+    <w:p/>
+    <w:p>
+      <w:r>
+        <w:t xml:space="preserve">Mentre era via feci la scortesia per cui ero venuta. Avevo deciso di farlo con la coscienza pulita, perché un'amica era in pericolo e avevo esaurito le opzioni educate. Guardai la sua scrivania. Non aprii nessun cassetto. Guardai solo ciò che era già esposto alla luce, come cadono gli occhi di chiunque mentre aspetta. Pip, ai miei piedi, aveva fissato l'attenzione sulle cornici d'ottone dei cartellini lungo i cassetti degli schedari, che luccicavano.</w:t>
       </w:r>
     </w:p>
     <w:p/>
@@ -3758,7 +3758,7 @@
         <w:rPr>
           <w:i/>
         </w:rPr>
-        <w:t>PROPERTY — EVERGREEN AVE — WINTER WONDERLAND INN</w:t>
+        <w:t xml:space="preserve">PROPRIETÀ — EVERGREEN AVE — WINTER WONDERLAND INN</w:t>
       </w:r>
       <w:r>
         <w:t>.</w:t>
@@ -3767,19 +3767,19 @@
     <w:p/>
     <w:p>
       <w:r>
-        <w:t>L'atto di proprietà della locanda. Fuori dal suo cassetto. Messo nel cestino del riarchiviazione, maneggiato di recente, sulla scrivania di una donna che mi aveva guardata dritta negli occhi e mi aveva detto, per due volte, che non leggeva mai gli archivi alle sue spalle.</w:t>
-      </w:r>
-    </w:p>
-    <w:p/>
-    <w:p>
-      <w:r>
-        <w:t>Aveva letto proprio quello. Lo aveva tirato fuori. L'atto di proprietà della locanda, il documento che registrava l'acquisto del 1924, la metà del segreto che non si trovava in nessuna lettera di Blackburn e che non c'era mai stata. Era stato tra le mani di Vera Reed, abbastanza recentemente da non averlo ancora messo a posto.</w:t>
-      </w:r>
-    </w:p>
-    <w:p/>
-    <w:p>
-      <w:r>
-        <w:t>Quando tornò con una copia dell'atto del prato la ringraziai e feci le mie solite noiose chiacchiere da comitato sui venditori e sulla posizione dei carretti. Poi mi presi tutto il tempo per ripiegarla nella borsa. La osservai, e ora che sapevo cosa stavo guardando riuscii a leggerla chiaramente. Non era una donna dura. Fu questo a colpirmi. Avevo quasi sperato, quando finalmente l'avevo vista per intero, di trovare qualcosa di freddo e rapace sotto la stanchezza. Lì non c'era assolutamente nulla di freddo, solo paura ridotta allo stremo, la paura profonda fino alle ossa di una persona che aveva fatto una cosa molto più grande di lei e ci giaceva sveglia dentro ogni notte. Le mani non le tremavano mentre raddrizzava il cestino. Due tazze di caffè dimenticate giacevano fredde sulla scrivania. Sembrava colei che Fiona era sembrata per tutta la settimana, come una persona spremuta, solo che era lei a fare la spremitura, e in un certo senso la cosa era ancora più triste.</w:t>
+        <w:t xml:space="preserve">L'atto di proprietà della locanda. Fuori dal suo cassetto. Messo nel cestino delle cose da riarchiviare, maneggiato di recente, sulla scrivania di una donna che mi aveva guardata dritta negli occhi e mi aveva detto, per due volte, che non leggeva mai gli archivi alle sue spalle.</w:t>
+      </w:r>
+    </w:p>
+    <w:p/>
+    <w:p>
+      <w:r>
+        <w:t xml:space="preserve">Aveva letto proprio quello. Lo aveva tirato fuori. L'atto di proprietà della locanda, il documento che registrava l'acquisto del 1924, la metà del segreto che non si trovava in nessuna lettera dei Blackburn e che non c'era mai stata. Era stato tra le mani di Vera Reed, abbastanza recentemente da non averlo ancora messo a posto.</w:t>
+      </w:r>
+    </w:p>
+    <w:p/>
+    <w:p>
+      <w:r>
+        <w:t xml:space="preserve">Quando tornò con una copia dell'atto del prato la ringraziai e feci le mie solite noiose chiacchiere da comitato sui venditori e sulla posizione dei carretti. Poi mi presi tutto il tempo per ripiegarla nella borsa. La osservai, e ora che sapevo cosa stavo guardando riuscii a leggerla chiaramente. Non era una donna dura. Fu questo a colpirmi. Mi ero quasi aspettata, quando finalmente l'avevo vista per intero, di trovare qualcosa di freddo e rapace sotto la stanchezza. Lì non c'era assolutamente nulla di freddo, solo paura ridotta allo stremo, la paura profonda fino alle ossa di una persona che aveva fatto una cosa molto più grande di lei e ci giaceva sveglia dentro ogni notte. Le mani le tremavano mentre raddrizzava il cestino. Due tazze di caffè dimenticate giacevano fredde sulla scrivania. Sembrava colei che Fiona era sembrata per tutta la settimana, come una persona spremuta, solo che era lei a fare la spremitura, e in un certo senso la cosa era ancora più triste.</w:t>
       </w:r>
     </w:p>
     <w:p/>
@@ -3809,7 +3809,7 @@
     <w:p/>
     <w:p>
       <w:r>
-        <w:t>Theo aveva il furto. Lo aveva trovato nelle lettere di Blackburn, la spilla, la pietra, il banco dei pegni. Lo aveva catalogato con la sua mano accurata, il zaffiro nel suo cuore, e poi aveva estratto quelle lettere dagli archivi dicendole smarrite. Ma Theo, che affogava, sorvegliato dall'intera cittadina, mai a casa, non avrebbe potuto fare il resto. Non avrebbe potuto confermare che la locanda fosse stata comprata con quei soldi, perché quella prova non si trovava nel suo edificio. E non avrebbe potuto portare i biglietti attraverso la città e posarne uno su una scrivania affollata in pieno giorno di festival, perché Theo Hussein non poteva camminare lungo Evergreen Avenue inosservato neanche a salvar la pelle.</w:t>
+        <w:t xml:space="preserve">Theo aveva le carte del furto. Lo aveva trovato nelle lettere dei Blackburn, la spilla, la pietra, il banco dei pegni. Lo aveva catalogato con la sua mano accurata, lo zaffiro al suo cuore, e poi aveva estratto quelle lettere dagli archivi dicendole smarrite. Ma Theo, che affogava, sorvegliato dall'intera cittadina, mai a casa, non avrebbe potuto fare il resto. Non avrebbe potuto confermare che la locanda fosse stata comprata con quei soldi, perché quella prova non si trovava nel suo edificio. E non avrebbe potuto portare i biglietti attraverso la città e posarne uno su una scrivania affollata in pieno giorno di festival, perché Theo Hussein non poteva camminare lungo Evergreen Avenue inosservato neanche a salvar la pelle.</w:t>
       </w:r>
     </w:p>
     <w:p/>
@@ -3827,7 +3827,7 @@
     <w:p/>
     <w:p>
       <w:r>
-        <w:t>Li avevo entrambi. Dopo tutta quell'angoscia, avrebbe dovuto sembrare una vittoria, e invece sembrava di trovarsi in cima a una lunga collina che non volevo scendere. In fondo c'erano due persone che avevo conosciuto e apprezzato, un'intera e calda cittadina che avrebbe dovuto imparare qualcosa di brutto su due dei suoi figli.</w:t>
+        <w:t xml:space="preserve">Li avevo entrambi. Dopo tutta quell'angoscia, avrebbe dovuto sembrare una vittoria, e invece sembrava di trovarsi in cima a una lunga collina che non volevo scendere. In fondo c'erano due persone che avevo conosciuto e apprezzato, un'amica che i due avevano stretto in una morsa e un'intera e calda cittadina che avrebbe dovuto imparare qualcosa di brutto su due dei suoi figli.</w:t>
       </w:r>
     </w:p>
     <w:p/>
@@ -3856,19 +3856,19 @@
     <w:p/>
     <w:p>
       <w:r>
-        <w:t>Quella notte, davanti al cammino, mi costrinsi a pensare fino in fondo alla via più semplice, e le motivazioni a favore erano forti.</w:t>
-      </w:r>
-    </w:p>
-    <w:p/>
-    <w:p>
-      <w:r>
-        <w:t>Andava così. Sapevo chi era. Sapevo come. Ne avevo le prove: la scheda del catalogo, la carta corrispondente tenuta contro la lampada, l'atto della locanda lasciato fuori dal suo cassetto. Avrei potuto dunque andare da Theo e da Vera in silenzio, noi tre soli, nessun altro coinvolto, e dire: so tutto. Smettetela adesso, e finisce qui, stanotte, senza che nessuno ne sappia nulla. Mai più. E loro lo avrebbero fatto, perché erano persone impaurite e non incallite. Avrebbero pianto di sollievo per essere stati scagionati. Le lettere si sarebbero fermate e Fiona sarebbe stata al sicuro. Il segreto sarebbe tornato nel suo baule in soffitta. Theo avrebbe tenuto la sua Società e il suo buon nome, e Vera il suo lavoro. La città non avrebbe mai dovuto sapere che due dei suoi stessi abitanti avevano deviato per una sola stagione difficile. Ognuno dei miei cari sarebbe stato risparmiato da quel dolore.</w:t>
-      </w:r>
-    </w:p>
-    <w:p/>
-    <w:p>
-      <w:r>
-        <w:t>Niente polizia. Niente scandalo. Niente colonne sgradevoli sulla Gazzetta. Nessun bravo vecchio condotto fuori dall'edificio a cui aveva dedicato la vita. Solo una parola sussurrata nel buio, misericordia, e tutti a letto.</w:t>
+        <w:t xml:space="preserve">Quella notte, davanti al camino, mi costrinsi a pensare fino in fondo alla via più semplice, e le motivazioni a favore erano forti.</w:t>
+      </w:r>
+    </w:p>
+    <w:p/>
+    <w:p>
+      <w:r>
+        <w:t xml:space="preserve">Andava così. Sapevo chi era. Sapevo come. Ne avevo le prove: la scheda del catalogo, la carta corrispondente tenuta contro la lampada, l'atto della locanda lasciato fuori dal suo cassetto. Avrei potuto dunque andare da Theo e da Vera in silenzio, noi tre soli, nessun altro coinvolto, e dire: so tutto. Smettetela adesso, e finisce qui, stanotte, senza che nessuno ne sappia nulla. Mai più. E loro lo avrebbero fatto, perché erano persone impaurite e non incallite. Avrebbero pianto di sollievo per averla scampata. Le lettere si sarebbero fermate e Fiona sarebbe stata al sicuro. Il segreto sarebbe tornato nel suo baule in soffitta. Theo avrebbe tenuto la sua Società e il suo buon nome, e Vera il suo lavoro. La città non avrebbe mai dovuto sapere che due dei suoi stessi abitanti avevano deviato per una sola stagione difficile. Ognuno dei miei cari sarebbe stato risparmiato da quel dolore.</w:t>
+      </w:r>
+    </w:p>
+    <w:p/>
+    <w:p>
+      <w:r>
+        <w:t xml:space="preserve">Niente polizia. Niente scandalo. Niente colonne sgradevoli sulla Gazette. Nessun bravo vecchio condotto fuori dall'edificio a cui aveva dedicato la vita. Solo una parola sussurrata nel buio, misericordia, e tutti a letto.</w:t>
       </w:r>
     </w:p>
     <w:p/>
@@ -3916,7 +3916,7 @@
     <w:p/>
     <w:p>
       <w:r>
-        <w:t>«Non posso seppellirlo», dissi. «Lo vorrei. Dio sa quanto vorrei andare là stanotte, sussurrare via tutto e lasciare che tutti mantengano la loro vita. Ma se lo faccio, Fiona non smette mai di aver paura, non sul serio. Theo non deve mai diventare un uomo che potrebbe essere perdonato. E il marcio rimane laggiù dentro il muro dove non posso vederlo, a crescere». Mi premisi i palmi delle mani contro gli occhi. «La cosa gentile e la cosa facile non sono la stessa. Deve emergere alla luce. Tutto quanto. Per bene. Con Noriko Tanaka. Con la legge di mezzo, fatta con delicatezza, fatta con misericordia, ma fatta. Questo è l'unico modo in cui Fiona si libera per sempre di questa storia, e l'unico modo in cui Theo riesce a essere qualcosa di diverso da un uomo con un crimine sepolto sotto le assi del pavimento».</w:t>
+        <w:t xml:space="preserve">«Non posso seppellirlo», dissi. «Lo vorrei. Dio sa quanto vorrei andare là stanotte, sussurrare via tutto e lasciare che tutti mantengano la loro vita. Ma se lo faccio, Fiona non smette mai di aver paura, non sul serio. Theo non è mai costretto a diventare un uomo che possa essere perdonato. E il marcio rimane laggiù dentro il muro dove non posso vederlo, a crescere». Mi premisi i palmi delle mani contro gli occhi. «La cosa gentile e la cosa facile non sono la stessa. Deve emergere alla luce. Tutto quanto. Per bene. Con Noriko Tanaka. Con la legge di mezzo, fatta con delicatezza, fatta con misericordia, ma fatta. Questo è l'unico modo in cui Fiona si libera per sempre di questa storia, e l'unico modo in cui Theo riesce a essere qualcosa di diverso da un uomo con un crimine sepolto sotto le assi del pavimento».</w:t>
       </w:r>
     </w:p>
     <w:p/>
@@ -3928,7 +3928,7 @@
     <w:p/>
     <w:p>
       <w:r>
-        <w:t>Eccola lì, l'ultima paura, la più piccola di tutte e la più interamente mia. Ero ancora mezza estranea in quella città. Chiunque altro si conosceva fin da quando erano bambini che imparavano a camminare sugli stessi marciapiedi, e io mi ero guadagnata il mio posto un centimetro alla volta, uno sformato qui, una ricerca di cani là, una sedia tirata vicino al circolo di maglia. Trascinare Theo Hussein alla luce avrebbe potuto costarmi parte di quel centimetro conquistato a fatica. La gente non ama sempre chi dice la dura e nuda verità. Avrei potuto fare esattamente la cosa giusta ed essere, da allora in poi, l'estranea che aveva distrutto un brav'uomo e portato il lutto in paese.</w:t>
+        <w:t xml:space="preserve">Eccola lì, l'ultima paura, la più piccola di tutte e la più interamente mia. Ero ancora mezza estranea in quella città. Chiunque altro si conosceva fin da quando erano bambini che imparavano a camminare sugli stessi marciapiedi, e io mi ero guadagnata il mio posto un centimetro alla volta, uno sformato qui, la ricerca di un cane là, una sedia tirata vicino al circolo di maglia. Trascinare Theo Hussein alla luce avrebbe potuto costarmi parte di quel centimetro conquistato a fatica. La gente non ama sempre chi dice la dura e nuda verità. Avrei potuto fare esattamente la cosa giusta ed essere, da allora in poi, l'estranea che aveva distrutto un brav'uomo e portato il lutto in paese.</w:t>
       </w:r>
     </w:p>
     <w:p/>
@@ -3952,7 +3952,7 @@
     <w:p/>
     <w:p>
       <w:r>
-        <w:t>Nick si sporse e mi prese la mano. I suoi occhi erano fieri e addormentati insieme. «Allora lo troveremo insieme», disse. «E Jess. Qualunque cosa ti costi con la città, alla fine. Non sarai l'estranea che ha distrutto un brav'uomo. Sarai colei che ha amato questo posto abbastanza da guarirlo. Alcuni di loro non lo vedranno per un po'. Ma io lo vedo. E quelli che contano ci arriveranno».</w:t>
+        <w:t xml:space="preserve">Nick si sporse e mi prese la mano. I suoi occhi erano fieri e addolorati insieme. «Allora lo troveremo insieme», disse. «E Jess. Qualunque cosa ti costi con la città, alla fine. Non sarai l'estranea che ha distrutto un brav'uomo. Sarai colei che ha amato questo posto abbastanza da guarirlo. Alcuni di loro non lo vedranno per un po'. Ma io lo vedo. E quelli che contano ci arriveranno».</w:t>
       </w:r>
     </w:p>
     <w:p/>
@@ -3974,7 +3974,7 @@
     </w:p>
     <w:p>
       <w:r>
-        <w:t>Il capo Tanaka mi ascoltò nel suo piccolo ufficio alla stazione, con il taccuino consumato aperto sulla scrivania davanti a sé e la penna ferma sopra di esso. Non scriveva mentre decideva se credere o meno a qualcuno. Esposi tutto per filo e per segno, come avevo fatto per me stessa al tavolo della cucina. I due biglietti. Il cartellino del catalogo di Theo con le cinque parole corrispondenti. La carta da lettere della Società, con la stessa filigrana sotto la lampada. L'atto di proprietà dell'locanda fuori dal cassetto nel cesto in cui Vera rimetteva in ordine i documenti. Constance, la spilla, il banco dei pegni a Ridgeline, l'intera radice secolare della faccenda, e il fascicolo di Neil sotto tutto il resto, la parte che rendeva umana quella radice.</w:t>
+        <w:t xml:space="preserve">Il capo Tanaka mi ascoltò nel suo piccolo ufficio al comando, con il taccuino consumato aperto sulla scrivania davanti a sé e la penna ferma sopra di esso. Non scriveva mentre decideva se credere o meno a qualcuno. Esposi tutto per filo e per segno, come avevo fatto per me stessa al tavolo della cucina. I due biglietti. Il cartellino del catalogo di Theo con le cinque parole corrispondenti. La carta da lettere della Società, con la stessa filigrana sotto la lampada. L'atto di proprietà della locanda fuori dal cassetto nel cesto in cui Vera rimetteva in ordine i documenti. Constance, la spilla, il banco dei pegni a Ridgeline, l'intera radice secolare della faccenda, e il fascicolo di Neil sotto tutto il resto, la parte che rendeva umana quella radice.</w:t>
       </w:r>
     </w:p>
     <w:p>
@@ -3989,7 +3989,7 @@
     </w:p>
     <w:p>
       <w:r>
-        <w:t>«Sì, lo so. Lo sapevo.» Ci avevo pensato per tutto il tragitto fino alla stazione. «Non te lo porto perché tu lo seppellisca gentilmente per me. Te lo porto perché sia fatta giustizia nel modo giusto. Fiona si merita la legge dalla sua parte, non una stretta di mano silenziosa nel buio che potrebbe svanire in qualsiasi inverno per il resto della sua vita. Voglio che sia una cosa vera, Noriko. Voglio solo che sia vera e calda allo stesso tempo, se c'è un modo al mondo per avere entrambe le cose.»</w:t>
+        <w:t xml:space="preserve">«Sì, lo so. Lo sapevo.» Ci avevo pensato per tutto il tragitto fino al comando. «Non te lo porto perché tu lo seppellisca gentilmente per me. Te lo porto perché sia fatta giustizia nel modo giusto. Fiona si merita la legge dalla sua parte, non una stretta di mano silenziosa nel buio che potrebbe svanire in qualsiasi inverno per il resto della sua vita. Voglio che sia una cosa vera, Noriko. Voglio solo che sia vera e calda allo stesso tempo, se c'è un modo al mondo per avere entrambe le cose.»</w:t>
       </w:r>
     </w:p>
     <w:p>
@@ -3999,7 +3999,7 @@
     </w:p>
     <w:p>
       <w:r>
-        <w:t>«Un modo c'è» disse. «C'è quasi sempre un modo, quando le persone coinvolte non sono mostri, e da tutto quello che mi hai raccontato, questi due non sono mostri. Sono un uomo disperato e una donna spaventata che hanno fatto una brutta cosa per motivi di cui si erano più che convinti che fossero giusti.» Posò la penna. «Ecco cosa non farò. Non sfonderò una porta a calci e metterò le manette a Theo Hussein in mezzo al festival davanti a tutto il paese. Questo non aiuta nessuno, non è necessario, e non faccio una cosa così crudele quando ne funzionerà una più gentile.» Mi guardò fisso attraverso la scrivania. «Ecco cosa farò invece. Gli darò la possibilità di assumersi le proprie responsabilità, con me nella stanza, in modo che sia legale e documentato. Se ammette liberamente le sue colpe e rimedia, con un risarcimento e una vera resa dei conti, allora c'è spazio perché questa storia finisca in qualcosa di diverso dalla rovina. La chiamiamo giustizia riparativa. Ripara ciò che può invece di rompere solo ciò che è rimasto. Ma funziona solo se è sincero, Jessica. Se mente o cerca di svignarsela dalla porta sul retro, allora si procederà per vie legali, e quella sarà una scelta sua, non mia e non tua.»</w:t>
+        <w:t xml:space="preserve">«Un modo c'è» disse. «C'è quasi sempre un modo, quando le persone coinvolte non sono mostri, e da tutto quello che mi hai raccontato, questi due non sono mostri. Sono un uomo disperato e una donna spaventata che hanno fatto una brutta cosa per motivi che si erano convinti, più che a metà, fossero giusti.» Posò la penna. «Ecco cosa non farò. Non sfonderò una porta a calci e metterò le manette a Theo Hussein in mezzo al festival davanti a tutto il paese. Questo non aiuta nessuno, non è necessario, e non faccio una cosa così crudele quando ne funzionerà una più gentile.» Mi guardò fisso attraverso la scrivania. «Ecco cosa farò invece. Gli darò la possibilità di assumersi le proprie responsabilità, con me nella stanza, in modo che sia legale e documentato. Se ammette liberamente le sue colpe e rimedia, con un risarcimento e una vera resa dei conti, allora c'è spazio perché questa storia finisca in qualcosa di diverso dalla rovina. La chiamiamo giustizia riparativa. Ripara ciò che può invece di rompere solo ciò che è rimasto. Ma funziona solo se è sincero, Jessica. Se mente o cerca di svignarsela dalla porta sul retro, allora si procederà per vie legali, e quella sarà una scelta sua, non mia e non tua.»</w:t>
       </w:r>
     </w:p>
     <w:p>
@@ -4029,7 +4029,7 @@
     </w:p>
     <w:p>
       <w:r>
-        <w:t>«Hai avuto paura del segreto sbagliato per tutto questo tempo» le dissi. «Pendevi che il segreto fosse che Constance era una ladra. Leggi questo, Fiona. I Blackburn non la pagavano da mesi. Sua madre stava morendo a tre isolati di distanza senza i soldi per un medico. Dissero a una ragazza di essere grata per un tetto sopra la testa mentre una fortuna giaceva in una scatola che lei spolverava ogni singolo giorno. Non ha rubato a persone che si erano comportate bene con lei. Ha preso da persone che l'avevano derubata per prima, e ci ha costruito sopra cent'anni di onesta accoglienza.» Le chiusi le mani intorno al fascicolo. «Questo non è un segreto che ti rovina. Questa è una storia dentro cui puoi stare a testa alta. Il ricatto ha funzionato solo perché hai passato tutta la vita a nascondere la metà che ti fa vergognare, senza mai sapere che ce n'era una metà che non lo fa.»</w:t>
+        <w:t xml:space="preserve">«Hai avuto paura del segreto sbagliato per tutto questo tempo» le dissi. «Pensavi che il segreto fosse che Constance era una ladra. Leggi questo, Fiona. I Blackburn non la pagavano da mesi. Sua madre stava morendo a tre isolati di distanza senza i soldi per un medico. Dissero a una ragazza di essere grata per un tetto sopra la testa mentre una fortuna giaceva in una scatola che lei spolverava ogni singolo giorno. Non ha rubato a persone che si erano comportate bene con lei. Ha preso da persone che l'avevano derubata per prima, e ci ha costruito sopra cent'anni di onesta accoglienza.» Le chiusi le mani intorno al fascicolo. «Questo non è un segreto che ti rovina. Questa è una storia dentro cui puoi stare a testa alta. Il ricatto ha funzionato solo perché hai passato tutta la vita a nascondere la metà che ti fa vergognare, senza mai sapere che ce n'era una metà che non lo fa.»</w:t>
       </w:r>
     </w:p>
     <w:p>
@@ -4054,7 +4054,7 @@
     </w:p>
     <w:p>
       <w:r>
-        <w:t>«Essere nella stanza» dissi. «Se riesci a sopportarlo. Non per accusare nessuno. Solo per esserci, in modo che Theo debba guardare in faccia l'amico che ha cercato di ferire, e in modo che tu smetta di essere quella lasciata sola nel buio con questa storia. Non devi dire una sola parola se non vuoi. Ma è la tua storia, Fiona, più di chiunque altro. Dovresti esserci quando finalmente emergerà alla luce del sole.»</w:t>
+        <w:t xml:space="preserve">«Essere nella stanza» dissi. «Se riesci a sopportarlo. Non per accusare nessuno. Solo per esserci, in modo che Theo debba guardare in faccia l'amica che ha cercato di ferire, e in modo che tu smetta di essere quella lasciata sola nel buio con questa storia. Non devi dire una sola parola se non vuoi. Ma è la tua storia, Fiona, più di chiunque altro. Dovresti esserci quando finalmente emergerà alla luce del sole.»</w:t>
       </w:r>
     </w:p>
     <w:p>
@@ -4069,7 +4069,7 @@
     </w:p>
     <w:p>
       <w:r>
-        <w:t>Quel pomeriggio ci saremmo seduti a parlare con loro.</w:t>
+        <w:t xml:space="preserve">Quel pomeriggio ci saremmo sedute a parlare con loro.</w:t>
       </w:r>
     </w:p>
     <w:p>
@@ -4110,7 +4110,7 @@
     </w:p>
     <w:p>
       <w:r>
-        <w:t>«Theo», dissi. «Le lettere di ricatto a Fiona sono state scritte sulla carta intestata della Società. Quella pesante color avorio con le vergate. L'ho confrontata grammo per grammo con un foglio della tua riserva». Lui trasalì, ma io continuai, ferma. «E descrivono la spilla come la saffira al suo cuore. Queste sono parole tue, Theo. Sono sulla tua scheda di catalogo, di tuo pugno, la scheda delle lettere dei Blackburn che hai detto a tutto il paese durante l'inaugurazione essere andate smarrite. Le lettere non erano smarrite. Le avevi tolte tu, perché contenevano il segreto, e poi le avevi definite perdute affinché nessuno pensasse a chiedere cosa ci fosse dentro». Feci una pausa e lasciai che la parte successiva uscisse dolcemente. «Hai trovato il modo di salvare la Società in quelle lettere. E ne hai approfittato. Non è così?»</w:t>
+        <w:t xml:space="preserve">«Theo», dissi. «Le lettere di ricatto a Fiona sono state scritte sulla carta intestata della Società. Quella pesante color crema con le linee vergate. L'ho confrontata fibra per fibra con un foglio della tua riserva». Lui trasalì, ma io continuai, ferma. «E descrivono la spilla come lo zaffiro al suo cuore. Queste sono parole tue, Theo. Sono sulla tua scheda di catalogo, di tuo pugno, la scheda delle lettere dei Blackburn che hai detto a tutto il paese durante l'inaugurazione essere andate smarrite. Le lettere non erano smarrite. Le avevi tolte tu, perché contenevano il segreto, e poi le avevi definite perdute affinché nessuno pensasse a chiedere cosa ci fosse dentro». Feci una pausa e lasciai che la parte successiva uscisse dolcemente. «Hai trovato il modo di salvare la Società in quelle lettere. E ne hai approfittato. Non è così?»</w:t>
       </w:r>
     </w:p>
     <w:p>
@@ -4120,7 +4120,7 @@
     </w:p>
     <w:p>
       <w:r>
-        <w:t>«Dissi a me stesso che non era un vero furto», disse. «Non nei confronti di Fiona. Dissi a me stesso che la locanda era stata acquistata con denaro rubato fin dall'inizio, quindi riprenderne un po' non era un furto, era, non so, la storia che correggeva se stessa, un conto che finalmente giungeva a scadenza. Sono così bravo a far significare al passato qualunque cosa io abbia bisogno che significhi. È tutta la mia formazione, fare in modo che il passato abbia un senso». Si premette i pugni contro gli occhi come un bambino. «Il tetto sta cedendo. La caldaia sta morendo. Cent'anni di memoria di questo paese, ogni lettera, ogni fotografia e ogni atto, tutto che va in rovina, e ogni porta onesta a cui ho bussato chiusa in faccia, il sindaco, i fondi, le fondazioni, nessuna esclusa. E poi ho trovato quelle lettere, ed eccoli lì, mezzo milione di dollari, semplicemente seduti lì nel passato, e ho pensato: posso salvarla. Posso salvare tutto, ogni singolo frammento, e nessuno si farà davvero male, perché il denaro era sporco in origine». Sollevò lo sguardo, addolorato. «E poi ho visto cosa stava facendo a lei. A Fiona. L'ho vista incanutire. E ho detto a me stesso che avrei smesso, e non ho smesso, perché a quel punto ero già dentro fino al collo, e una volta che l'avevo fatto, mi dissi che un'altra volta non avrebbe fatto differenza». Si voltò verso Fiona e la sua voce si spezzò. «Mi dispiace così tanto. Mi dispiace tanto, Fiona. Mi sono perso da qualche parte in tutto questo. Amo così tanto la storia di questo paese da aver dimenticato che il paese è fatto di persone vive».</w:t>
+        <w:t xml:space="preserve">«Dissi a me stesso che non era un vero furto», disse. «Non nei confronti di Fiona. Dissi a me stesso che la locanda era stata acquistata con denaro rubato fin dall'inizio, quindi riprenderne un po' non era un furto, era, non so, la storia che correggeva se stessa, un conto che finalmente giungeva a scadenza. Sono così bravo a far significare al passato qualunque cosa io abbia bisogno che significhi. È tutta la mia formazione, fare in modo che il passato abbia un senso». Si premette i pugni contro gli occhi come un bambino. «Il tetto sta cedendo. La caldaia sta morendo. Cent'anni di memoria di questo paese, ogni lettera, ogni fotografia e ogni atto, tutto che va in rovina, e ogni porta onesta a cui ho bussato chiusa in faccia, il sindaco, i fondi, le fondazioni, nessuna esclusa. E poi ho trovato quelle lettere, ed eccoli lì, mezzo milione di dollari, semplicemente seduti lì nel passato, e ho pensato: posso salvarla. Posso salvare tutto, ogni singolo frammento, e nessuno si farà davvero male, perché il denaro era sporco in origine». Sollevò lo sguardo, addolorato. «E poi ho visto cosa stava facendo a lei. A Fiona. L'ho vista farsi grigia in volto. E ho detto a me stesso che avrei smesso, e non ho smesso, perché a quel punto ero già dentro fino al collo, e una volta che l'avevo fatto, mi dissi che un'altra volta non avrebbe fatto differenza». Si voltò verso Fiona e la sua voce si spezzò. «Mi dispiace così tanto. Mi dispiace tanto, Fiona. Mi sono perso da qualche parte in tutto questo. Amo così tanto la storia di questo paese da aver dimenticato che il paese è fatto di persone vive».</w:t>
       </w:r>
     </w:p>
     <w:p>
@@ -4135,7 +4135,7 @@
     </w:p>
     <w:p>
       <w:r>
-        <w:t>«Vera», dissi. «Theo ha compiuto il furto. Ma i biglietti sapevano che la locanda era stata comprata con i soldi della spilla, e questo non era mai stato in nessuna lettera dei Blackburn. Questo è un registro catastale. Un atto. E l'atto di questa locanda era fuori dal suo cassetto nel tuo cestino di smistamento ieri mattina, maneggiato, sulla scrivania di una donna che mi aveva detto due volte di non leggere mai i registri alle sue spalle». Mantenni la voce dolce. «Lui ha compiuto il furto. Tu avevi l'atto. E tu avevi le gambe, Vera. Lui non avrebbe potuto attraversare questo paese inosservato per niente al mondo, tutti conoscono Theo, tutti lo fermano. Ma nessuno batte ciglio se la segretaria del sindaco fa un salto alla locanda durante la festa. Ti ho incrociata io stessa sui gradini quella mattina, con i tuoi pass per il parcheggio. Non avrebbe potuto farlo da solo. Aveva bisogno di qualcuno che potesse muoversi per il paese invisibile. Quella eri tu».</w:t>
+        <w:t xml:space="preserve">«Vera», dissi. «Theo aveva le carte del furto. Ma i biglietti sapevano che la locanda era stata comprata con i soldi della spilla, e questo non era mai stato in nessuna lettera dei Blackburn. Questo è un registro catastale. Un atto. E l'atto di questa locanda era fuori dal suo cassetto nel tuo cestino di smistamento ieri mattina, maneggiato, sulla scrivania di una donna che mi aveva detto due volte di non leggere mai i registri alle sue spalle». Mantenni la voce dolce. «Lui aveva le carte del furto. Tu avevi l'atto. E tu avevi le gambe, Vera. Lui non avrebbe potuto attraversare questo paese inosservato per niente al mondo, tutti conoscono Theo, tutti lo fermano. Ma nessuno batte ciglio se la segretaria del sindaco fa un salto alla locanda durante la festa. Ti ho incrociata io stessa sui gradini quella mattina, con i tuoi pass per il parcheggio. Non avrebbe potuto farlo da solo. Aveva bisogno di qualcuno che potesse muoversi per il paese invisibile. Quella eri tu».</w:t>
       </w:r>
     </w:p>
     <w:p>
@@ -4145,7 +4145,7 @@
     </w:p>
     <w:p>
       <w:r>
-        <w:t>«È venuto da me», disse. «Settimane fa. Fuori di sé dalla disperazione, a parlare della Società, di come avesse trovato questa cosa e non potesse farcela da solo. E io avrei dovuto dire di no. So che avrei dovuto dire di no, lo sapevo già allora». Barcollò leggermente, con le braccia strette intorno al corpo. «Ma sono così indietro con i pagamenti, signora Claus. Il sindaco mi paga una miseria e mi sfrutta fino al midollo, e ho debiti che non immaginereste, di quelli che non ti fanno dormire, e Theo ha detto che erano soldi rubati in origine, a una famiglia ricca cento anni fa, e che avrebbero salvato la Società, e che una parte sarebbe venuta a me, e che finalmente mi sarei tolta dai guai. Ha fatto sembrare la cosa quasi nobile. Lui è bravo in questo, a far sembrare una cosa storia invece di un crimine. E volevo liberarmi da quella situazione così disperatamente che ho permesso che la facesse sembrare così, perché volevo crederci». Guardò Fiona, distrutta. «Non ho mai pensato a te come a una persona. Questa è la parte peggiore, è la cosa che mi porterò dentro. Ho pensato solo ai soldi e al non dover più passare notti in bianco. Mi dispiace. Mi dispiace tanto, Fiona».</w:t>
+        <w:t xml:space="preserve">«È venuto da me», disse. «Settimane fa. Fuori di sé dalla disperazione, a parlare della Società, di come avesse trovato questa cosa e non potesse farcela da solo. E io avrei dovuto dire di no. So che avrei dovuto dire di no, lo sapevo già allora». Si dondolò leggermente, con le braccia strette intorno al corpo. «Ma sono così indietro con i pagamenti, signora Claus. Il sindaco mi paga una miseria e mi sfrutta fino al midollo, e ho debiti che non immaginereste, di quelli che non ti fanno dormire, e Theo ha detto che erano soldi rubati in origine, a una famiglia ricca cento anni fa, e che avrebbero salvato la Società, e che una parte sarebbe venuta a me, e che finalmente mi sarei tolta dai guai. Ha fatto sembrare la cosa quasi nobile. Lui è bravo in questo, a far sembrare una cosa storia invece di un crimine. E volevo liberarmi da quella situazione così disperatamente che ho permesso che la facesse sembrare così, perché volevo crederci». Guardò Fiona, distrutta. «Non ho mai pensato a te come a una persona. Questa è la parte peggiore, è la cosa che mi porterò dentro. Ho pensato solo ai soldi e al non dover più passare notti in bianco. Mi dispiace. Mi dispiace tanto, Fiona».</w:t>
       </w:r>
     </w:p>
     <w:p>
@@ -4206,7 +4206,7 @@
     </w:p>
     <w:p>
       <w:r>
-        <w:t>Fese un passo indietro. Non per una stagione, per poi essere reinsediato quattamente sulla sua poltrona una volta che la città si fosse stancata di essere arrabbiata. Si dimise dalla carica di presidente della Società Storica di Frost Falls, e il consiglio direttivo, una volta venuto a conoscenza di tutto, accettò le dimissioni con convinzione. Un uomo non poteva estorcere denaro a un vicino usando la collezione e la carta intestata della Società, per poi tenersi le chiavi del posto.</w:t>
+        <w:t xml:space="preserve">Fece un passo indietro. Non per una stagione, per poi essere reinsediato senza clamore sulla sua poltrona una volta che la città si fosse stancata di essere arrabbiata. Si dimise dalla carica di presidente della Società Storica di Frost Falls, e il consiglio direttivo, una volta venuto a conoscenza di tutto, accettò le dimissioni con convinzione. Un uomo non poteva estorcere denaro a un vicino usando la collezione e la carta intestata della Società, per poi tenersi le chiavi del posto.</w:t>
       </w:r>
     </w:p>
     <w:p>
@@ -4236,12 +4236,12 @@
     </w:p>
     <w:p>
       <w:r>
-        <w:t>«Hai fatto una cosa sbagliata», dissi. «E la stai pagando, giustamente, com'è giusto che sia. Ma hai ammesso tutto nel momento esatto in cui ti è stato chiesto, Vera. Non hai mentito e non ti sei arrampicata sugli specchi. Non è una cosa da poco. Questa è la parte di te che è ancora buona, ed è più grande della parte di te che ha fatto lo sbaglio, e voglio che tu vi ti aggrappi. La strada del ritorno è lunga anche per te. Ma esiste. Non permettere a nessuno di dirti il contrario, e soprattutto non dirlo a te stessa».</w:t>
-      </w:r>
-    </w:p>
-    <w:p>
-      <w:r>
-        <w:t>Pianse. Mi abbracciò, questa donna rigida e abbottonata che non avevo mai visto abbracciare nessuno, e mi disse grazie contro la spalla. Poi ripartì alla volta di casa di sua sorella, e Pip ed io tornammo a casa camminando nell'imbrunire. Non c'era alcun trionfo in tutto ciò. Mi sentivo oppressa e sfinita nel profondo, come se avessi pulito una ferita fino in fondo: faceva molto male più che lasciarla stare, ma ora poteva guarire.</w:t>
+        <w:t xml:space="preserve">«Hai fatto una cosa sbagliata», dissi. «E la stai pagando, giustamente, com'è giusto che sia. Ma hai ammesso tutto nel momento esatto in cui ti è stato chiesto, Vera. Non hai mentito e non ti sei arrampicata sugli specchi. Non è una cosa da poco. Questa è la parte di te che è ancora buona, ed è più grande della parte di te che ha fatto lo sbaglio, e voglio che tu ti ci aggrappi. La strada del ritorno è lunga anche per te. Ma esiste. Non permettere a nessuno di dirti il contrario, e soprattutto non dirlo a te stessa».</w:t>
+      </w:r>
+    </w:p>
+    <w:p>
+      <w:r>
+        <w:t xml:space="preserve">Pianse. Mi abbracciò, questa donna rigida e abbottonata che non avevo mai visto abbracciare nessuno, e mi disse grazie contro la spalla. Poi ripartì alla volta di casa di sua sorella, e Pip ed io tornammo a casa camminando nell'imbrunire. Non c'era alcun trionfo in tutto ciò. Mi sentivo oppressa e sfinita nel profondo, come se avessi pulito una ferita fino in fondo: faceva molto più male che lasciarla stare, ma ora poteva guarire.</w:t>
       </w:r>
     </w:p>
     <w:p>
@@ -4251,12 +4251,12 @@
     </w:p>
     <w:p>
       <w:r>
-        <w:t>Avrebbe dovuto essere la fine della storia. Ma c'era ancora la questione della Società stessa, la cosa stessa che Theo aveva rovinato pur di salvare. Ora lui non c'era più. Il tetto continuava a far entrare la pioggia e la caldaia continuava a guastarsi, e nulla in tutta quella resa dei conti aveva contribuito neppure con un singolo dollaro.</w:t>
-      </w:r>
-    </w:p>
-    <w:p>
-      <w:r>
-        <w:t>La cosa sbagliata che aveva fatto per salvare continuava a fallire. E ora, con lui fuori dai giochi, bisognava salvarla nel modo giusto, grazie alla città, per se stessa. Oppure non si sarebbe salvata affatto.</w:t>
+        <w:t xml:space="preserve">Avrebbe dovuto essere la fine della storia. Ma c'era ancora la questione della Società stessa, la cosa stessa per salvare la quale Theo si era rovinato. Ora lui non c'era più. Il tetto continuava a far entrare la pioggia e la caldaia continuava a guastarsi, e nulla in tutta quella resa dei conti aveva contribuito neppure con un singolo dollaro.</w:t>
+      </w:r>
+    </w:p>
+    <w:p>
+      <w:r>
+        <w:t xml:space="preserve">Ciò che aveva cercato di salvare nel modo sbagliato continuava ad andare in rovina. E ora, con lui fuori dai giochi, bisognava salvarla nel modo giusto, grazie alla città, per se stessa. Oppure non si sarebbe salvata affatto.</w:t>
       </w:r>
     </w:p>
     <w:p>
@@ -4287,7 +4287,7 @@
     </w:p>
     <w:p>
       <w:r>
-        <w:t>Era un'offerta gentile, fatta con il cuore. Del resto avrebbe funzionato, a modo suo. Un solo assegno, e i problemi di soldi della Società sarebbero svaniti, proprio quei guai che avevano fatto quasi impazzire Theo fino a spingerlo a fare quello che aveva fatto. Una parte di me, stante stanca su quel freddo portico, voleva afferrare quell'offerta con tutte e due le mani e considerarla chiusa.</w:t>
+        <w:t xml:space="preserve">Era un'offerta gentile, fatta con il cuore. Del resto avrebbe funzionato, a modo suo. Un solo assegno, e i problemi di soldi della Società sarebbero svaniti, proprio quei guai che avevano fatto quasi impazzire Theo fino a spingerlo a fare quello che aveva fatto. Una parte di me, stanca com'ero su quel freddo portico, voleva afferrare quell'offerta con tutte e due le mani e considerarla chiusa.</w:t>
       </w:r>
     </w:p>
     <w:p>
@@ -4312,7 +4312,7 @@
     </w:p>
     <w:p>
       <w:r>
-        <w:t>Il signor Worthington mi guardò a lungo, e a sua discolpa la sua espressione cambiò, passando dalla perplessità a una sorta di rispetto. «Sta rifiutando un mucchio di soldi, signora Claus.»</w:t>
+        <w:t xml:space="preserve">Il signor Worthington mi guardò a lungo, e a suo merito la sua espressione cambiò, passando dalla perplessità a una sorta di rispetto. «Sta rifiutando un mucchio di soldi, signora Claus.»</w:t>
       </w:r>
     </w:p>
     <w:p>
@@ -4322,12 +4322,12 @@
     </w:p>
     <w:p>
       <w:r>
-        <w:t>La signora Worthington allora sorrise, il primo sorriso davvero caloroso che le avessi visto in tutte quelle settimane, e appoggiò la mano guantata sul braccio del marito. «Mi piace» disse. «Mi piace molto di più, Gerald. Abbiamo comprato la nostra strada in troppe cose nel corso degli anni. Sarebbe una novità, alla nostra età, esservi invitati.»</w:t>
-      </w:r>
-    </w:p>
-    <w:p>
-      <w:r>
-        <w:t>Così la lasciarono andare in quel modo. Nessun assegno. Una promessa invece, tenuta in riserbo in caso di bisogno. E la Società rimase esattamente dov'era stata, sul precipizio, con il tetto che cedeva e la caldaia che moriva, solo che ora non c'era più neppure Theo a lottare per essa, il che la rendeva ancora più precaria di prima, non meno.</w:t>
+        <w:t xml:space="preserve">La signora Worthington allora sorrise, il primo sorriso davvero caloroso che le avessi visto in tutte quelle settimane, e appoggiò la mano guantata sul braccio del marito. «Mi piace» disse. «Mi piace molto di più, Gerald. Ci siamo comprati l'ingresso in fin troppe cose nel corso degli anni. Sarebbe una novità, alla nostra età, essere invitati a farne parte.»</w:t>
+      </w:r>
+    </w:p>
+    <w:p>
+      <w:r>
+        <w:t xml:space="preserve">Così la cosa restò in quei termini. Nessun assegno. Una promessa invece, tenuta in serbo in caso di bisogno. E la Società rimase esattamente dov'era stata, sul precipizio, con il tetto che cedeva e la caldaia che moriva, solo che ora non c'era più neppure Theo a lottare per essa, il che la rendeva ancora più precaria di prima, non meno.</w:t>
       </w:r>
     </w:p>
     <w:p>
@@ -4375,7 +4375,7 @@
     <w:p/>
     <w:p>
       <w:r>
-        <w:t>«Ho riflettuto su quello che mi dicesti» mi rivelò, prima ancora di essersi tolta il cappotto. «Che avevo paura del segreto sbagliato. Che era il fatto di nasconderlo a dargli i denti». Posò la cartellina sul mio tavolo da cucina, ben distesa, decisa. «Ho chiuso con i segreti, Jessica. Per tutti questi anni sono stata la custode di una cosa vergognosa, e si scopre che la cosa non è affatto vergognosa, non quando viene raccontata per intero. È solo triste, umana e vecchia di un secolo. Perciò la racconterò. Come si deve. Ad alta voce. Prima che chiunque possa usarla di nuovo contro di me. Non puoi ricattare una donna con un segreto che lei stessa ha già raccontato a tutto il paese».</w:t>
+        <w:t xml:space="preserve">«Ho riflettuto su quello che mi hai detto» mi rivelò, prima ancora di essersi tolta il cappotto. «Che avevo paura del segreto sbagliato. Che era il fatto di nasconderlo a dargli i denti». Posò la cartellina sul mio tavolo da cucina, ben distesa, decisa. «Ho chiuso con i segreti, Jessica. Per tutti questi anni sono stata la custode di una cosa vergognosa, e si scopre che la cosa non è affatto vergognosa, non quando viene raccontata per intero. È solo triste, umana e vecchia di un secolo. Perciò la racconterò. Come si deve. Ad alta voce. Prima che chiunque possa usarla di nuovo contro di me. Non puoi ricattare una donna con un segreto che lei stessa ha già raccontato a tutto il paese».</w:t>
       </w:r>
     </w:p>
     <w:p/>
@@ -4387,7 +4387,7 @@
     <w:p/>
     <w:p>
       <w:r>
-        <w:t>E Fiona lo fece. Lasciò che Claire la mettesse per iscritto sulla Gazette, la versione vera e completa, con i documenti di Neil allegati. Non la versione da pettegolezzo, con il suo bravo cattivo senza macchia e il suo bravo delitto pulito, ma quella vera. Constance Okafor, una sguattera diciannovenne nell'inverno del 1924, non pagata per mesi, con la madre morente a tre isolati di distanza e senza soldi per un medico, a cui era stato detto di essere grata per un tetto mentre spolverava, ogni singolo giorno, una spilla che valeva più di quanto avrebbe guadagnato in tre vite intere. Una ragazza disperata che aveva preso l'unica cosa che riusciva a raggiungere, da una famiglia che l'aveva derubata per prima, e l'aveva trasformata in cento anni di accoglienza sincera per i viaggiatori che passavano da Frost Falls nel freddo.</w:t>
+        <w:t xml:space="preserve">E Fiona lo fece. Lasciò che Claire la mettesse per iscritto sulla Gazette, la versione vera e completa, con i documenti di Neil allegati. Non la versione da pettegolezzo, con il suo cattivo bello netto e il suo delitto bello netto, ma quella vera. Constance Okafor, una sguattera diciannovenne nell'inverno del 1924, non pagata per mesi, con la madre morente a tre isolati di distanza e senza soldi per un medico, a cui era stato detto di essere grata per un tetto mentre spolverava, ogni singolo giorno, una spilla che valeva più di quanto avrebbe guadagnato in tre vite intere. Una ragazza disperata che aveva preso l'unica cosa che riusciva a raggiungere, da una famiglia che l'aveva derubata per prima, e l'aveva trasformata in cento anni di accoglienza sincera per i viaggiatori che passavano da Frost Falls nel freddo.</w:t>
       </w:r>
     </w:p>
     <w:p/>
@@ -4411,13 +4411,13 @@
     <w:p/>
     <w:p>
       <w:r>
-        <w:t>Quella fu la fine del potere del segreto, proprio lì, in una bottega di lana, con la camomilla in infusione e le moffole finite che si accumulavano nella cesta. Una storia raccontata per intero, in una stanza calda, tra persone che avevano conosciuto inverni rigidi in prima persona.</w:t>
-      </w:r>
-    </w:p>
-    <w:p/>
-    <w:p>
-      <w:r>
-        <w:t>Qualcosa accadde anche a me in quei stessi giorni, in modo più silenzioso, e andò nella direzione opposta rispetto a quella che avevo temuto.</w:t>
+        <w:t xml:space="preserve">Quella fu la fine del potere del segreto, proprio lì, in una bottega di lana, con la camomilla in infusione e le manopole finite che si accumulavano nella cesta. Una storia raccontata per intero, in una stanza calda, tra persone che avevano conosciuto inverni rigidi in prima persona.</w:t>
+      </w:r>
+    </w:p>
+    <w:p/>
+    <w:p>
+      <w:r>
+        <w:t xml:space="preserve">Qualcosa accadde anche a me in quegli stessi giorni, in modo più silenzioso, e andò nella direzione opposta rispetto a quella che avevo temuto.</w:t>
       </w:r>
     </w:p>
     <w:p/>
@@ -4435,7 +4435,7 @@
     <w:p/>
     <w:p>
       <w:r>
-        <w:t>E Martha. Martha mi prese la mano al circolo un pomeriggio grigio, la strinse e disse: «Ti ricordi, tempo fa, quando ti dissi che non dovevi portare le cose da sola? Che un cerchio serve per appoggiarsi?». Dissi che me lo ricordava bene. «Beh» disse, «tu sei andata a dimostrare che sei una di noi, portando quel peso nel modo in cui l'hai fatto. Non ti sei limitata ad appoggiarti al cerchio quando ne avevi bisogno. Sei stata tu il cerchio, per Fiona, quando lei non aveva nessun altro. Una forestiera non fa una cosa simile, Jessica. Una dei nostri sì». E mi diede una sola pacca sulla mano per poi tornare dritta alla sua moffola, come se non mi avesse appena distrutta emotivamente lì dove sedevo.</w:t>
+        <w:t xml:space="preserve">E Martha. Martha mi prese la mano al circolo un pomeriggio grigio, la strinse e disse: «Ti ricordi, tempo fa, quando ti dissi che non dovevi portare le cose da sola? Che un circolo serve per appoggiarsi?». Dissi che me lo ricordavo bene. «Beh» disse, «tu sei andata a dimostrare che sei una di noi, portando quel peso nel modo in cui l'hai fatto. Non ti sei limitata ad appoggiarti al circolo quando ne avevi bisogno. Sei stata tu il circolo, per Fiona, quando lei non aveva nessun altro. Una forestiera non fa una cosa simile, Jessica. Una dei nostri sì». E mi diede una sola pacca sulla mano per poi tornare dritta alla sua manopola, come se non mi avesse appena distrutta emotivamente lì dove sedevo.</w:t>
       </w:r>
     </w:p>
     <w:p/>
@@ -4464,7 +4464,7 @@
     <w:p/>
     <w:p>
       <w:r>
-        <w:t xml:space="preserve">Theo aveva restituito tutte le lettere dei Blackburn, nessuna esclusa, come parte del suo percorso di redenzione, e le stavo riordinando con Olivia e Dot un freddo pomeriggio, noi tre sedute al lungo tavolo da lavoro con la bella lampada tirata vicina, quando mi imbattei in una lettera che non avevo mai visto prima. Non parlava della spilla. Descriveva una giornata d'inverno del 1924 in cui le famiglie del paese si erano riunite sul pratone, avevano chiuso in una scatola i tesori della cittadina e l'avevano seppellita sotto il grande olmo, </w:t>
+        <w:t xml:space="preserve">Theo aveva restituito tutte le lettere dei Blackburn, nessuna esclusa, come parte del suo percorso di redenzione, e le stavo riordinando con Olivia e Dot un freddo pomeriggio, noi tre sedute al lungo tavolo da lavoro con la bella lampada tirata vicina, quando mi imbattei in una lettera che non avevo mai visto prima. Non parlava della spilla. Descriveva una giornata d'inverno del 1924 in cui le famiglie del paese si erano riunite sul prato, avevano chiuso in una scatola i tesori della cittadina e l'avevano seppellita sotto il grande olmo, </w:t>
       </w:r>
       <w:r>
         <w:rPr>
@@ -4488,19 +4488,19 @@
     <w:p/>
     <w:p>
       <w:r>
-        <w:t>«La capsula del tempo», disse Olivia a bassa voce. «Theo ci è diventato matto sopra. Ogni registro in suo possesso diceva soltanto che era sepolta sul pratone, e il pratone misura quattro acri. È sotto l'olmo. È stata lì tutto il tempo».</w:t>
-      </w:r>
-    </w:p>
-    <w:p/>
-    <w:p>
-      <w:r>
-        <w:t>Nel giro di un'ora metà di Frost Falls si radunò sul pratone intorno al grande olmo con pale e lanterne, in un silenzio teso e sospeso che non avevo mai sentito da questa cittadina chiassosa e amichevole.</w:t>
-      </w:r>
-    </w:p>
-    <w:p/>
-    <w:p>
-      <w:r>
-        <w:t>Sam Patel si occupò dello scavo, perché Sam faceva il lavoro duro e onesto e gli piaceva farlo. Ci mettemmo tutti in cerchio intorno a lui alla luce dorata delle lanterne e delle catene di luci, con il nostro fiato che si univa nel freddo. Emma Redfern mi tenne la mano da un lato e Pip si appoggiò calda al mio stivale dall'altro. Palla di Neve indossava il suo cappello da renna. Mark stava dietro a sua figlia con le mani sulle sue spalle. C'era tutto il circolo, e c'era anche Neil Carter, che si era trattenuto più a lungo del previsto e se ne stava in fondo con il suo taccuino per una volta infilato in tasca. Quando la pala di Sam urtò qualcosa che emise un suono sordo, solido e metallico, l'intero pratone emise un unico suono collettivo, un oh morbido e stupito che rimase sospeso nell'aria fredda.</w:t>
+        <w:t xml:space="preserve">«La capsula del tempo», disse Olivia a bassa voce. «Theo ci è diventato matto sopra. Ogni registro in suo possesso diceva soltanto che era sepolta sul prato, e il prato misura quattro acri. È sotto l'olmo. È stata lì tutto il tempo».</w:t>
+      </w:r>
+    </w:p>
+    <w:p/>
+    <w:p>
+      <w:r>
+        <w:t xml:space="preserve">Nel giro di un'ora metà di Frost Falls si radunò sul prato intorno al grande olmo con pale e lanterne, in un silenzio teso e sospeso che non avevo mai sentito da questa cittadina chiassosa e amichevole.</w:t>
+      </w:r>
+    </w:p>
+    <w:p/>
+    <w:p>
+      <w:r>
+        <w:t xml:space="preserve">Sam Patel si occupò dello scavo, perché Sam faceva il lavoro duro e onesto e gli piaceva farlo. Ci mettemmo tutti in cerchio intorno a lui alla luce dorata delle lanterne e delle catene di luci, con il nostro fiato che si univa nel freddo. Emma Redfern mi tenne la mano da un lato e Pip si appoggiò calda al mio stivale dall'altro. Palla di Neve indossava il suo cappello da renna. Mark stava dietro a sua figlia con le mani sulle sue spalle. C'era tutto il circolo, e c'era anche Neil Carter, che si era trattenuto più a lungo del previsto e se ne stava in fondo con il suo taccuino per una volta infilato in tasca. Quando la pala di Sam urtò qualcosa che emise un suono sordo, solido e metallico, l'intero prato emise un unico suono collettivo, un oh morbido e stupito che rimase sospeso nell'aria fredda.</w:t>
       </w:r>
     </w:p>
     <w:p/>
@@ -4512,7 +4512,7 @@
     <w:p/>
     <w:p>
       <w:r>
-        <w:t>«Non apritela», disse Noriko, prima che le mani di chiunque potessero raggiungerla, e lo disse con gentilezza ma con fermezza, la capa in lei e la saggia allo stesso tempo. «Non stasera, non così, al buio con le pale e tutti infreddoliti. È rimasta laggiù per cento anni. Può aspettare fino al nuovo anno ed essere aperta come si deve. Lo faremo per bene. Tutto il paese, alla luce del giorno». Incrociò il mio sguardo attraverso la luce della lanterna e lo mantenne. «Con Theo lì».</w:t>
+        <w:t xml:space="preserve">«Non apritela», disse Noriko, prima che le mani di chiunque potessero raggiungerla, e lo disse con gentilezza ma con fermezza, il capo della polizia e la donna saggia allo stesso tempo. «Non stasera, non così, al buio con le pale e tutti infreddoliti. È rimasta laggiù per cento anni. Può aspettare fino al nuovo anno ed essere aperta come si deve. Lo faremo per bene. Tutto il paese, alla luce del giorno». Incrociò il mio sguardo attraverso la luce della lanterna e lo mantenne. «Con Theo lì».</w:t>
       </w:r>
     </w:p>
     <w:p/>
@@ -4542,7 +4542,7 @@
     <w:p/>
     <w:p>
       <w:r>
-        <w:t>Un momento dopo Bram sopraggiunse di corsa attraverso il pratone torcendosi il berretto, e dietro di lui, ovviamente, arrivò una renna. Questa volta Ballerina, che si era aperta da sola il recinto e aveva seguito le lanterne fino in paese. Se ne stava nel mezzo del pratone con la brina che brillava sulle corna, a guardare la scatola di rame dissepolta con un interesse mite e senza fretta, mentre un centinaio di paesani fissavano la scena e una bambina gridava a squarciagola di pura gioia.</w:t>
+        <w:t xml:space="preserve">Un momento dopo Bram sopraggiunse di corsa attraverso il prato torcendosi il berretto, e dietro di lui, ovviamente, arrivò una renna. Questa volta Ballerina, che si era aperta da sola il recinto e aveva seguito le lanterne fino in paese. Se ne stava nel mezzo del prato con la brina che brillava sulle corna, a guardare la scatola di rame dissepolta con un interesse mite e senza fretta, mentre un centinaio di paesani fissavano la scena e una bambina gridava a squarciagola di pura gioia.</w:t>
       </w:r>
     </w:p>
     <w:p/>
@@ -4560,7 +4560,7 @@
     <w:p/>
     <w:p>
       <w:r>
-        <w:t>Rimasi lì sul pratone a guardare tutto quel panorama: l'olmo e le luci dorate, la scatola di rame verde, la renna, la bambina ridente e l'intero paese raccolto vicino alla luce delle lanterne. Pip era andata a mettersi sotto il muso di Ballerina e stava lanciando alla renna uno sguardo lungo e severo, come per ricordarle di chi fosse quel pinguino. La mano di Nick trovò la mia. Oltre il recinto c'era il focolare che lui aveva costruito per la magia, e mi chiesi quanta altra ne avrebbe sprigionata per quando fossimo tornati a casa.</w:t>
+        <w:t xml:space="preserve">Rimasi lì sul prato a guardare tutto quel panorama: l'olmo e le luci dorate, la scatola di rame verde, la renna, la bambina ridente e l'intero paese raccolto vicino alla luce delle lanterne. Pip era andata a mettersi sotto il muso di Ballerina e stava lanciando alla renna uno sguardo lungo e severo, come per ricordarle di chi fosse quel pinguino. La mano di Nick trovò la mia. Oltre il recinto c'era il focolare che lui aveva costruito per la magia, e mi chiesi quanta altra magia vi avrebbe trovato, a girare in tondo, per quando fossimo tornati a casa.</w:t>
       </w:r>
     </w:p>
     <w:p/>
@@ -4572,7 +4572,7 @@
     <w:p/>
     <w:p>
       <w:r>
-        <w:t>Poi tornammo a casa sotto le luci dorate. Dietro di noi l'olmo ergeva la sua sagoma su una buca vuota, con la brina ancora sui rametti più bassi. Nel nuovo anno il paese avrebbe aperto la scatola, e Theo sarebbe stato lì a vederlo.</w:t>
+        <w:t xml:space="preserve">Poi tornammo a casa sotto le luci dorate. Dietro di noi l'olmo ergeva la sua sagoma su una buca vuota, con la brina ancora sui rametti più bassi. Nel nuovo anno il paese avrebbe aperto la scatola, e Theo sarebbe stato lì a vederla.</w:t>
       </w:r>
     </w:p>
     <w:p>
@@ -4633,7 +4633,7 @@
     </w:p>
     <w:p>
       <w:r>
-        <w:t>«Non si è neppure appassito», sussurrò, dando un'occhiata al padre, che si era fermato a parlare con un vicino oltre la staccionata. «Cambio l'acqua ogni mattina. Babbo pensa che l'abbia preso dalla ghirlanda della locanda».</w:t>
+        <w:t xml:space="preserve">«Non si è neppure appassito», sussurrò, dando un'occhiata al padre, che si era fermato a parlare con un vicino oltre la staccionata. «Cambio l'acqua ogni mattina. Papà pensa che l'abbia preso dalla ghirlanda della locanda».</w:t>
       </w:r>
     </w:p>
     <w:p>
@@ -4668,7 +4668,7 @@
     </w:p>
     <w:p>
       <w:r>
-        <w:t>«È tutto ciò che mi lasciano fare», disse, e subito dopo, in fretta, prima che potessi rispondere: «il che è giusto. Non mi lamento. È molto più di quello che avrei dato a me stesso, al loro posto». Lisciò la vecchia carta con due dita. «Apriranno la capsula a capodanno. Lo hai saputo? Noriko dice che mi sarà permesso di esserci. A guardare». Gli si riempirono gli occhi. Sbatté le palpebre con forza e si chinò di nuovo sulla mappa. «Non merito di esserci. Ma dice che posso guardare. Dopo tutto quello che è successo, mi è permesso stare nella stanza in cui il paese aprirà il suo cuore. Ci penso ogni giorno. È in buona parte ciò che mi fa andare avanti, se devo essere sincera».</w:t>
+        <w:t xml:space="preserve">«È tutto ciò che mi lasciano fare», disse, e subito dopo, in fretta, prima che potessi rispondere: «il che è giusto. Non mi lamento. È molto più di quello che avrei dato a me stesso, al loro posto». Lisciò la vecchia carta con due dita. «Apriranno la capsula a capodanno. Lo hai saputo? Noriko dice che mi sarà permesso di esserci. A guardare». Gli si riempirono gli occhi. Sbatté le palpebre con forza e si chinò di nuovo sulla mappa. «Non merito di esserci. Ma dice che posso guardare. Dopo tutto quello che è successo, mi è permesso stare nella stanza in cui il paese aprirà il suo cuore. Ci penso ogni giorno. È in buona parte ciò che mi fa andare avanti, se devo essere sincero».</w:t>
       </w:r>
     </w:p>
     <w:p>
@@ -4733,7 +4733,7 @@
         <w:rPr>
           <w:i/>
         </w:rPr>
-        <w:t xml:space="preserve">There are more mysteries afoot for Jessica Claus! </w:t>
+        <w:t xml:space="preserve">Altri misteri attendono Jessica Claus! </w:t>
       </w:r>
       <w:r>
         <w:t>&lt;bt&gt;</w:t>
@@ -4751,12 +4751,12 @@
         <w:rPr>
           <w:i/>
         </w:rPr>
-        <w:t xml:space="preserve"> is coming soon.</w:t>
-      </w:r>
-    </w:p>
-    <w:p>
-      <w:r>
-        <w:t>What's Next?</w:t>
+        <w:t xml:space="preserve"> arriverà presto.</w:t>
+      </w:r>
+    </w:p>
+    <w:p>
+      <w:r>
+        <w:t xml:space="preserve">Cosa c'è dopo?</w:t>
       </w:r>
     </w:p>
     <w:p>
@@ -4771,7 +4771,7 @@
     </w:p>
     <w:p>
       <w:r>
-        <w:t>Poi un mattone sfondava la finestra, e una parola compariva in rosso sul compensato della facciata dove ogni bambino di Evergreen Avenue l'avrebbe letta passandoci davanti.</w:t>
+        <w:t xml:space="preserve">Poi un mattone sfondava la finestra, e una parola compariva in rosso sul rivestimento di assi della facciata dove ogni bambino di Evergreen Avenue l'avrebbe letta passandoci davanti.</w:t>
       </w:r>
     </w:p>
     <w:p>
@@ -4796,7 +4796,7 @@
         <w:rPr>
           <w:i/>
         </w:rPr>
-        <w:t xml:space="preserve">There are more mysteries afoot for Jessica Claus! </w:t>
+        <w:t xml:space="preserve">Altri misteri attendono Jessica Claus! </w:t>
       </w:r>
       <w:r>
         <w:t>&lt;bt&gt;</w:t>
@@ -4814,12 +4814,12 @@
         <w:rPr>
           <w:i/>
         </w:rPr>
-        <w:t xml:space="preserve"> is coming soon.</w:t>
-      </w:r>
-    </w:p>
-    <w:p>
-      <w:r>
-        <w:t xml:space="preserve">Excerpt from </w:t>
+        <w:t xml:space="preserve"> arriverà presto.</w:t>
+      </w:r>
+    </w:p>
+    <w:p>
+      <w:r>
+        <w:t xml:space="preserve">Estratto da </w:t>
       </w:r>
       <w:r>
         <w:t>&lt;bt&gt;</w:t>
@@ -4833,7 +4833,7 @@
     </w:p>
     <w:p>
       <w:r>
-        <w:t>Ogni donna nel circolo aveva portato il proprio abete balsamico, e io avevo portato il metodo del Polo Nord per legarlo, che Olivia aveva giurato di rubarmi prima di Natale. Fissai lentamente il fil di ferro alla struttura, in modo che tutte potessero seguire i passaggi. Solo allora presi la prima manciata di abete. Il profumo salì freddo e verde, abbastanza pungente da liberare la mente. Riempì la stanza anteriore di Yarn Tales come la lana del negozio non riusciva mai a fare del tempo. Me ne stetti lì con la resina sulle dita e una struttura nuda in grembo, una delle sette donne chinate sullo stesso lavoro. Ci sono modi peggiori per trascorrere la prima mattina libera di novembre.</w:t>
+        <w:t xml:space="preserve">Ogni donna nel circolo aveva portato il proprio abete balsamico, e io avevo portato il metodo del Polo Nord per legarlo, che Olivia aveva giurato di rubarmi prima di Natale. Fissai lentamente il fil di ferro alla struttura, in modo che tutte potessero seguire i passaggi. Solo allora presi la prima manciata di abete. Il profumo salì freddo e verde, abbastanza pungente da liberare la mente. Riempì la stanza anteriore di Yarn Tales come la lana del negozio non riusciva mai a fare. Me ne stetti lì con la resina sulle dita e una struttura nuda in grembo, una delle sette donne chinate sullo stesso lavoro. Ci sono modi peggiori per trascorrere la prima mattina libera di novembre.</w:t>
       </w:r>
     </w:p>
     <w:p>
@@ -4873,7 +4873,7 @@
     </w:p>
     <w:p>
       <w:r>
-        <w:t>Dot rise della sua risata breve e secca dall'altra parte del cerchio, senza distogliere lo sguardo dalla propria ghirlanda, che era già grossa il doppio di quella di chiunque altra e doppiamente densa. «È a caccia del tuo trucco dal giorno in cui sei entrata. Dava la caccia al mio nel millenovecentoottantaqualcosa». Dot era robusta, dai capelli grigi, e diceva moltissimo con pochissime parole. Lavorava a ghirlande in quel negozio da decenni. Si vedeva dalle sue mani. Non si fermavano mai e non sbagliavano mai un colpo.</w:t>
+        <w:t xml:space="preserve">Dot rise della sua risata breve e secca dall'altra parte del cerchio, senza distogliere lo sguardo dalla propria ghirlanda, che era già grande una volta e mezza quella di chiunque altra e due volte più fitta. «È a caccia del tuo trucco dal giorno in cui sei entrata. Dava la caccia al mio nel millenovecentoottantaqualcosa». Dot era robusta, dai capelli grigi, e diceva moltissimo con pochissime parole. Lavorava a ghirlande in quel negozio da decenni. Si vedeva dalle sue mani. Non si fermavano mai e non sbagliavano mai un colpo.</w:t>
       </w:r>
     </w:p>
     <w:p>
@@ -4943,7 +4943,7 @@
     </w:p>
     <w:p>
       <w:r>
-        <w:t>Ne pressò uno su di me prima che potessi chiederlo, e uno su Claire, che protestò ma lo prese. Si piantò davanti a Martha finché questa non le promise di mangiare il proprio. E solo quando ne ebbero tutti uno se ne prese uno per sé. Lo mangiò in piedi, guardandoci mentre ce lo gustavamo.</w:t>
+        <w:t xml:space="preserve">Me ne mise in mano uno prima che potessi chiederlo, e uno su Claire, che protestò ma lo prese. Si piantò davanti a Martha finché questa non le promise di mangiare il proprio. E solo quando ne ebbero tutti uno se ne prese uno per sé. Lo mangiò in piedi, guardandoci mentre ce lo gustavamo.</w:t>
       </w:r>
     </w:p>
     <w:p>
@@ -5008,12 +5008,12 @@
     </w:p>
     <w:p>
       <w:r>
-        <w:t>«Ma guarda che strano», disse, in quel suo modo mite, e qualcosa nella mitezza ci spinse tutte ad alzare lo sguardo. «Wren... Non erano rivolti verso la strada, i pupazzi di neve dei bambini, ieri?»</w:t>
-      </w:r>
-    </w:p>
-    <w:p>
-      <w:r>
-        <w:t>Il prato si trovava di fronte a Yarn Tales, un'ampia spianata erbosa con il chiosco della musica a un'estremità e il monumento ai caduti all'altra. Gli scolari ne avevano costruito una fila durante la prima vera nevicata. Tre pupazzi, fatiscenti e sbilenchi e incoronati con qualsiasi cosa i ragazzi potessero rimediare. Ieri, come aveva detto Ellie, erano rivolti verso la strada, con occhi di carbone e aria socievole, a guardare il traffico scorrere come fanno i pupazzi di neve. C'ero passata davanti anch'io la sera prima. Davano sul viale.</w:t>
+        <w:t xml:space="preserve">«Ma guarda che strano», disse, in quel suo modo mite, e qualcosa nella mitezza ci spinse tutte ad alzare lo sguardo. «Non erano rivolti verso la strada, i pupazzi di neve dei bambini, ieri?»</w:t>
+      </w:r>
+    </w:p>
+    <w:p>
+      <w:r>
+        <w:t xml:space="preserve">Il prato si trovava di fronte a Yarn Tales, un'ampia spianata erbosa con il chiosco della musica a un'estremità e il monumento ai caduti all'altra. Gli scolari avevano costruito una fila di pupazzi di neve durante la prima vera nevicata. Tre pupazzi, grassocci e sbilenchi e incoronati con qualsiasi cosa i ragazzi potessero rimediare. Ieri, come aveva detto Ellie, erano rivolti verso la strada, con occhi di carbone e aria socievole, a guardare il traffico scorrere come fanno i pupazzi di neve. C'ero passata davanti anch'io la sera prima. Davano sul viale.</w:t>
       </w:r>
     </w:p>
     <w:p>
@@ -5028,7 +5028,7 @@
     </w:p>
     <w:p>
       <w:r>
-        <w:t>Ci accalcate tutte alla finestra, dimentiche dei muffin, a guardare.</w:t>
+        <w:t xml:space="preserve">Ci accalcammo tutte alla finestra, dimentiche dei muffin, a guardare.</w:t>
       </w:r>
     </w:p>
     <w:p>
@@ -5058,7 +5058,7 @@
     </w:p>
     <w:p>
       <w:r>
-        <w:t>Perché io conosco la differenza. Vivo ormai da molto tempo accanto alla magia del Natale. Abbastanza a lungo da riconoscerla nelle ossa, chiara come un'orma sul mio stesso gradino. Quello non era un bambino con le dita fredde. La magia era libera a Frost Falls. Era libera dal momento in cui eravamo arrivati, in cerca di una casa. Mio marito ne stava costruendo una. Lenta e paziente nel suo laboratorio, un focolare in cui potersi insediare, e si avvicinava un po' di più al fuoco ogni giorno. Ma non si era ancora stabilita. Era ancora fuori in paese la notte, calda, goffa e del tutto priva di malizia, intenta a compiere quelle piccole cose impossibili che la magia fa quando ha più sentimento che senno. Trasformando le luci della festa da arancioni a dorate. E ora, a quanto pareva, facendo fare due passaggi al pupazzo di neve di un bambino nel buio per affrontare qualunque cosa avesse catturato la sua errabonda attenzione.</w:t>
+        <w:t xml:space="preserve">Perché io conosco la differenza. Vivo ormai da molto tempo accanto alla magia del Natale. Abbastanza a lungo da riconoscerla nelle ossa, chiara come un'orma sul mio stesso gradino. Quello non era un bambino con le dita fredde. La magia era libera a Frost Falls. Era libera dal momento in cui eravamo arrivati, in cerca di una casa. Mio marito ne stava costruendo una. Lenta e paziente nel suo laboratorio, un focolare in cui potersi insediare, e si avvicinava un po' di più al fuoco ogni giorno. Ma non si era ancora stabilita. Era ancora fuori in paese la notte, calda, goffa e del tutto priva di malizia, intenta a compiere quelle piccole cose impossibili che la magia fa quando ha più sentimento che senno. Trasformando le luci della festa da arancioni a dorate. E ora, a quanto pareva, facendo girare nel buio il pupazzo di neve di un bambino per guardare qualunque cosa avesse catturato la sua errabonda attenzione.</w:t>
       </w:r>
     </w:p>
     <w:p>
@@ -5095,7 +5095,7 @@
         <w:rPr>
           <w:i/>
         </w:rPr>
-        <w:t xml:space="preserve"> is coming soon!</w:t>
+        <w:t xml:space="preserve"> arriverà presto!</w:t>
       </w:r>
     </w:p>
     <w:sectPr>

</xml_diff>